<commit_message>
Clean project outputs and refresh measurements
</commit_message>
<xml_diff>
--- a/Metro_Ethernet_MPLS_Project/report/Bao_cao_Metro_Ethernet_MPLS_Mininet.docx
+++ b/Metro_Ethernet_MPLS_Project/report/Bao_cao_Metro_Ethernet_MPLS_Mininet.docx
@@ -568,7 +568,7 @@
     </w:p>
     <w:p>
       <w:r>
-        <w:t>Thoi gian kiem thu tu results.csv: 2026-05-03T19:51:08 den 2026-05-03T19:51:44.</w:t>
+        <w:t>Thoi gian kiem thu tu results.csv: 2026-05-05T14:55:42 den 2026-05-05T14:57:13.</w:t>
       </w:r>
     </w:p>
     <w:tbl>
@@ -578,21 +578,22 @@
         <w:tblLook w:firstColumn="1" w:firstRow="1" w:lastColumn="0" w:lastRow="0" w:noHBand="0" w:noVBand="1" w:val="04A0"/>
       </w:tblPr>
       <w:tblGrid>
-        <w:gridCol w:w="864"/>
-        <w:gridCol w:w="864"/>
-        <w:gridCol w:w="864"/>
-        <w:gridCol w:w="864"/>
-        <w:gridCol w:w="864"/>
-        <w:gridCol w:w="864"/>
-        <w:gridCol w:w="864"/>
-        <w:gridCol w:w="864"/>
-        <w:gridCol w:w="864"/>
-        <w:gridCol w:w="864"/>
+        <w:gridCol w:w="785"/>
+        <w:gridCol w:w="785"/>
+        <w:gridCol w:w="785"/>
+        <w:gridCol w:w="785"/>
+        <w:gridCol w:w="785"/>
+        <w:gridCol w:w="785"/>
+        <w:gridCol w:w="785"/>
+        <w:gridCol w:w="785"/>
+        <w:gridCol w:w="785"/>
+        <w:gridCol w:w="785"/>
+        <w:gridCol w:w="785"/>
       </w:tblGrid>
       <w:tr>
         <w:tc>
           <w:tcPr>
-            <w:tcW w:type="dxa" w:w="864"/>
+            <w:tcW w:type="dxa" w:w="785"/>
           </w:tcPr>
           <w:p>
             <w:r>
@@ -602,7 +603,7 @@
         </w:tc>
         <w:tc>
           <w:tcPr>
-            <w:tcW w:type="dxa" w:w="864"/>
+            <w:tcW w:type="dxa" w:w="785"/>
           </w:tcPr>
           <w:p>
             <w:r>
@@ -612,7 +613,7 @@
         </w:tc>
         <w:tc>
           <w:tcPr>
-            <w:tcW w:type="dxa" w:w="864"/>
+            <w:tcW w:type="dxa" w:w="785"/>
           </w:tcPr>
           <w:p>
             <w:r>
@@ -622,7 +623,7 @@
         </w:tc>
         <w:tc>
           <w:tcPr>
-            <w:tcW w:type="dxa" w:w="864"/>
+            <w:tcW w:type="dxa" w:w="785"/>
           </w:tcPr>
           <w:p>
             <w:r>
@@ -632,7 +633,7 @@
         </w:tc>
         <w:tc>
           <w:tcPr>
-            <w:tcW w:type="dxa" w:w="864"/>
+            <w:tcW w:type="dxa" w:w="785"/>
           </w:tcPr>
           <w:p>
             <w:r>
@@ -642,7 +643,7 @@
         </w:tc>
         <w:tc>
           <w:tcPr>
-            <w:tcW w:type="dxa" w:w="864"/>
+            <w:tcW w:type="dxa" w:w="785"/>
           </w:tcPr>
           <w:p>
             <w:r>
@@ -652,7 +653,7 @@
         </w:tc>
         <w:tc>
           <w:tcPr>
-            <w:tcW w:type="dxa" w:w="864"/>
+            <w:tcW w:type="dxa" w:w="785"/>
           </w:tcPr>
           <w:p>
             <w:r>
@@ -662,7 +663,7 @@
         </w:tc>
         <w:tc>
           <w:tcPr>
-            <w:tcW w:type="dxa" w:w="864"/>
+            <w:tcW w:type="dxa" w:w="785"/>
           </w:tcPr>
           <w:p>
             <w:r>
@@ -672,7 +673,7 @@
         </w:tc>
         <w:tc>
           <w:tcPr>
-            <w:tcW w:type="dxa" w:w="864"/>
+            <w:tcW w:type="dxa" w:w="785"/>
           </w:tcPr>
           <w:p>
             <w:r>
@@ -682,7 +683,17 @@
         </w:tc>
         <w:tc>
           <w:tcPr>
-            <w:tcW w:type="dxa" w:w="864"/>
+            <w:tcW w:type="dxa" w:w="785"/>
+          </w:tcPr>
+          <w:p>
+            <w:r>
+              <w:t>udp_packet_loss_percent</w:t>
+            </w:r>
+          </w:p>
+        </w:tc>
+        <w:tc>
+          <w:tcPr>
+            <w:tcW w:type="dxa" w:w="785"/>
           </w:tcPr>
           <w:p>
             <w:r>
@@ -694,17 +705,17 @@
       <w:tr>
         <w:tc>
           <w:tcPr>
-            <w:tcW w:type="dxa" w:w="864"/>
+            <w:tcW w:type="dxa" w:w="785"/>
           </w:tcPr>
           <w:p>
             <w:r>
-              <w:t>2026-05-03T19:51:08</w:t>
+              <w:t>2026-05-05T14:55:42</w:t>
             </w:r>
           </w:p>
         </w:tc>
         <w:tc>
           <w:tcPr>
-            <w:tcW w:type="dxa" w:w="864"/>
+            <w:tcW w:type="dxa" w:w="785"/>
           </w:tcPr>
           <w:p>
             <w:r>
@@ -714,7 +725,7 @@
         </w:tc>
         <w:tc>
           <w:tcPr>
-            <w:tcW w:type="dxa" w:w="864"/>
+            <w:tcW w:type="dxa" w:w="785"/>
           </w:tcPr>
           <w:p>
             <w:r>
@@ -724,7 +735,7 @@
         </w:tc>
         <w:tc>
           <w:tcPr>
-            <w:tcW w:type="dxa" w:w="864"/>
+            <w:tcW w:type="dxa" w:w="785"/>
           </w:tcPr>
           <w:p>
             <w:r>
@@ -734,7 +745,7 @@
         </w:tc>
         <w:tc>
           <w:tcPr>
-            <w:tcW w:type="dxa" w:w="864"/>
+            <w:tcW w:type="dxa" w:w="785"/>
           </w:tcPr>
           <w:p>
             <w:r>
@@ -744,27 +755,27 @@
         </w:tc>
         <w:tc>
           <w:tcPr>
-            <w:tcW w:type="dxa" w:w="864"/>
+            <w:tcW w:type="dxa" w:w="785"/>
           </w:tcPr>
           <w:p>
             <w:r>
-              <w:t>55.459</w:t>
+              <w:t>55.201</w:t>
             </w:r>
           </w:p>
         </w:tc>
         <w:tc>
           <w:tcPr>
-            <w:tcW w:type="dxa" w:w="864"/>
+            <w:tcW w:type="dxa" w:w="785"/>
           </w:tcPr>
           <w:p>
             <w:r>
-              <w:t>33.367</w:t>
+              <w:t>34.14</w:t>
             </w:r>
           </w:p>
         </w:tc>
         <w:tc>
           <w:tcPr>
-            <w:tcW w:type="dxa" w:w="864"/>
+            <w:tcW w:type="dxa" w:w="785"/>
           </w:tcPr>
           <w:p>
             <w:r>
@@ -774,17 +785,27 @@
         </w:tc>
         <w:tc>
           <w:tcPr>
-            <w:tcW w:type="dxa" w:w="864"/>
+            <w:tcW w:type="dxa" w:w="785"/>
           </w:tcPr>
           <w:p>
             <w:r>
-              <w:t>0.11</w:t>
+              <w:t>0.093</w:t>
             </w:r>
           </w:p>
         </w:tc>
         <w:tc>
           <w:tcPr>
-            <w:tcW w:type="dxa" w:w="864"/>
+            <w:tcW w:type="dxa" w:w="785"/>
+          </w:tcPr>
+          <w:p>
+            <w:r>
+              <w:t>0.0</w:t>
+            </w:r>
+          </w:p>
+        </w:tc>
+        <w:tc>
+          <w:tcPr>
+            <w:tcW w:type="dxa" w:w="785"/>
           </w:tcPr>
           <w:p>
             <w:r>
@@ -796,17 +817,17 @@
       <w:tr>
         <w:tc>
           <w:tcPr>
-            <w:tcW w:type="dxa" w:w="864"/>
+            <w:tcW w:type="dxa" w:w="785"/>
           </w:tcPr>
           <w:p>
             <w:r>
-              <w:t>2026-05-03T19:51:26</w:t>
+              <w:t>2026-05-05T14:56:01</w:t>
             </w:r>
           </w:p>
         </w:tc>
         <w:tc>
           <w:tcPr>
-            <w:tcW w:type="dxa" w:w="864"/>
+            <w:tcW w:type="dxa" w:w="785"/>
           </w:tcPr>
           <w:p>
             <w:r>
@@ -816,7 +837,7 @@
         </w:tc>
         <w:tc>
           <w:tcPr>
-            <w:tcW w:type="dxa" w:w="864"/>
+            <w:tcW w:type="dxa" w:w="785"/>
           </w:tcPr>
           <w:p>
             <w:r>
@@ -826,7 +847,7 @@
         </w:tc>
         <w:tc>
           <w:tcPr>
-            <w:tcW w:type="dxa" w:w="864"/>
+            <w:tcW w:type="dxa" w:w="785"/>
           </w:tcPr>
           <w:p>
             <w:r>
@@ -836,7 +857,7 @@
         </w:tc>
         <w:tc>
           <w:tcPr>
-            <w:tcW w:type="dxa" w:w="864"/>
+            <w:tcW w:type="dxa" w:w="785"/>
           </w:tcPr>
           <w:p>
             <w:r>
@@ -846,27 +867,27 @@
         </w:tc>
         <w:tc>
           <w:tcPr>
-            <w:tcW w:type="dxa" w:w="864"/>
+            <w:tcW w:type="dxa" w:w="785"/>
           </w:tcPr>
           <w:p>
             <w:r>
-              <w:t>45.882</w:t>
+              <w:t>45.553</w:t>
             </w:r>
           </w:p>
         </w:tc>
         <w:tc>
           <w:tcPr>
-            <w:tcW w:type="dxa" w:w="864"/>
+            <w:tcW w:type="dxa" w:w="785"/>
           </w:tcPr>
           <w:p>
             <w:r>
-              <w:t>39.749</w:t>
+              <w:t>44.234</w:t>
             </w:r>
           </w:p>
         </w:tc>
         <w:tc>
           <w:tcPr>
-            <w:tcW w:type="dxa" w:w="864"/>
+            <w:tcW w:type="dxa" w:w="785"/>
           </w:tcPr>
           <w:p>
             <w:r>
@@ -876,17 +897,27 @@
         </w:tc>
         <w:tc>
           <w:tcPr>
-            <w:tcW w:type="dxa" w:w="864"/>
+            <w:tcW w:type="dxa" w:w="785"/>
           </w:tcPr>
           <w:p>
             <w:r>
-              <w:t>0.15</w:t>
+              <w:t>0.166</w:t>
             </w:r>
           </w:p>
         </w:tc>
         <w:tc>
           <w:tcPr>
-            <w:tcW w:type="dxa" w:w="864"/>
+            <w:tcW w:type="dxa" w:w="785"/>
+          </w:tcPr>
+          <w:p>
+            <w:r>
+              <w:t>0.0</w:t>
+            </w:r>
+          </w:p>
+        </w:tc>
+        <w:tc>
+          <w:tcPr>
+            <w:tcW w:type="dxa" w:w="785"/>
           </w:tcPr>
           <w:p>
             <w:r>
@@ -898,17 +929,17 @@
       <w:tr>
         <w:tc>
           <w:tcPr>
-            <w:tcW w:type="dxa" w:w="864"/>
+            <w:tcW w:type="dxa" w:w="785"/>
           </w:tcPr>
           <w:p>
             <w:r>
-              <w:t>2026-05-03T19:51:44</w:t>
+              <w:t>2026-05-05T14:56:19</w:t>
             </w:r>
           </w:p>
         </w:tc>
         <w:tc>
           <w:tcPr>
-            <w:tcW w:type="dxa" w:w="864"/>
+            <w:tcW w:type="dxa" w:w="785"/>
           </w:tcPr>
           <w:p>
             <w:r>
@@ -918,7 +949,7 @@
         </w:tc>
         <w:tc>
           <w:tcPr>
-            <w:tcW w:type="dxa" w:w="864"/>
+            <w:tcW w:type="dxa" w:w="785"/>
           </w:tcPr>
           <w:p>
             <w:r>
@@ -928,7 +959,7 @@
         </w:tc>
         <w:tc>
           <w:tcPr>
-            <w:tcW w:type="dxa" w:w="864"/>
+            <w:tcW w:type="dxa" w:w="785"/>
           </w:tcPr>
           <w:p>
             <w:r>
@@ -938,7 +969,7 @@
         </w:tc>
         <w:tc>
           <w:tcPr>
-            <w:tcW w:type="dxa" w:w="864"/>
+            <w:tcW w:type="dxa" w:w="785"/>
           </w:tcPr>
           <w:p>
             <w:r>
@@ -948,27 +979,27 @@
         </w:tc>
         <w:tc>
           <w:tcPr>
-            <w:tcW w:type="dxa" w:w="864"/>
+            <w:tcW w:type="dxa" w:w="785"/>
           </w:tcPr>
           <w:p>
             <w:r>
-              <w:t>55.139</w:t>
+              <w:t>55.335</w:t>
             </w:r>
           </w:p>
         </w:tc>
         <w:tc>
           <w:tcPr>
-            <w:tcW w:type="dxa" w:w="864"/>
+            <w:tcW w:type="dxa" w:w="785"/>
           </w:tcPr>
           <w:p>
             <w:r>
-              <w:t>36.376</w:t>
+              <w:t>36.077</w:t>
             </w:r>
           </w:p>
         </w:tc>
         <w:tc>
           <w:tcPr>
-            <w:tcW w:type="dxa" w:w="864"/>
+            <w:tcW w:type="dxa" w:w="785"/>
           </w:tcPr>
           <w:p>
             <w:r>
@@ -978,17 +1009,363 @@
         </w:tc>
         <w:tc>
           <w:tcPr>
-            <w:tcW w:type="dxa" w:w="864"/>
+            <w:tcW w:type="dxa" w:w="785"/>
           </w:tcPr>
           <w:p>
             <w:r>
-              <w:t>0.56</w:t>
+              <w:t>0.161</w:t>
             </w:r>
           </w:p>
         </w:tc>
         <w:tc>
           <w:tcPr>
-            <w:tcW w:type="dxa" w:w="864"/>
+            <w:tcW w:type="dxa" w:w="785"/>
+          </w:tcPr>
+          <w:p>
+            <w:r>
+              <w:t>0.0</w:t>
+            </w:r>
+          </w:p>
+        </w:tc>
+        <w:tc>
+          <w:tcPr>
+            <w:tcW w:type="dxa" w:w="785"/>
+          </w:tcPr>
+          <w:p>
+            <w:r>
+              <w:t>success</w:t>
+            </w:r>
+          </w:p>
+        </w:tc>
+      </w:tr>
+      <w:tr>
+        <w:tc>
+          <w:tcPr>
+            <w:tcW w:type="dxa" w:w="785"/>
+          </w:tcPr>
+          <w:p>
+            <w:r>
+              <w:t>2026-05-05T14:56:38</w:t>
+            </w:r>
+          </w:p>
+        </w:tc>
+        <w:tc>
+          <w:tcPr>
+            <w:tcW w:type="dxa" w:w="785"/>
+          </w:tcPr>
+          <w:p>
+            <w:r>
+              <w:t>Branch1</w:t>
+            </w:r>
+          </w:p>
+        </w:tc>
+        <w:tc>
+          <w:tcPr>
+            <w:tcW w:type="dxa" w:w="785"/>
+          </w:tcPr>
+          <w:p>
+            <w:r>
+              <w:t>Branch1</w:t>
+            </w:r>
+          </w:p>
+        </w:tc>
+        <w:tc>
+          <w:tcPr>
+            <w:tcW w:type="dxa" w:w="785"/>
+          </w:tcPr>
+          <w:p>
+            <w:r>
+              <w:t>host1</w:t>
+            </w:r>
+          </w:p>
+        </w:tc>
+        <w:tc>
+          <w:tcPr>
+            <w:tcW w:type="dxa" w:w="785"/>
+          </w:tcPr>
+          <w:p>
+            <w:r>
+              <w:t>host4</w:t>
+            </w:r>
+          </w:p>
+        </w:tc>
+        <w:tc>
+          <w:tcPr>
+            <w:tcW w:type="dxa" w:w="785"/>
+          </w:tcPr>
+          <w:p>
+            <w:r>
+              <w:t>94.882</w:t>
+            </w:r>
+          </w:p>
+        </w:tc>
+        <w:tc>
+          <w:tcPr>
+            <w:tcW w:type="dxa" w:w="785"/>
+          </w:tcPr>
+          <w:p>
+            <w:r>
+              <w:t>7.026</w:t>
+            </w:r>
+          </w:p>
+        </w:tc>
+        <w:tc>
+          <w:tcPr>
+            <w:tcW w:type="dxa" w:w="785"/>
+          </w:tcPr>
+          <w:p>
+            <w:r>
+              <w:t>0.0</w:t>
+            </w:r>
+          </w:p>
+        </w:tc>
+        <w:tc>
+          <w:tcPr>
+            <w:tcW w:type="dxa" w:w="785"/>
+          </w:tcPr>
+          <w:p>
+            <w:r>
+              <w:t>0.08</w:t>
+            </w:r>
+          </w:p>
+        </w:tc>
+        <w:tc>
+          <w:tcPr>
+            <w:tcW w:type="dxa" w:w="785"/>
+          </w:tcPr>
+          <w:p>
+            <w:r>
+              <w:t>0.0</w:t>
+            </w:r>
+          </w:p>
+        </w:tc>
+        <w:tc>
+          <w:tcPr>
+            <w:tcW w:type="dxa" w:w="785"/>
+          </w:tcPr>
+          <w:p>
+            <w:r>
+              <w:t>success</w:t>
+            </w:r>
+          </w:p>
+        </w:tc>
+      </w:tr>
+      <w:tr>
+        <w:tc>
+          <w:tcPr>
+            <w:tcW w:type="dxa" w:w="785"/>
+          </w:tcPr>
+          <w:p>
+            <w:r>
+              <w:t>2026-05-05T14:56:55</w:t>
+            </w:r>
+          </w:p>
+        </w:tc>
+        <w:tc>
+          <w:tcPr>
+            <w:tcW w:type="dxa" w:w="785"/>
+          </w:tcPr>
+          <w:p>
+            <w:r>
+              <w:t>Branch2</w:t>
+            </w:r>
+          </w:p>
+        </w:tc>
+        <w:tc>
+          <w:tcPr>
+            <w:tcW w:type="dxa" w:w="785"/>
+          </w:tcPr>
+          <w:p>
+            <w:r>
+              <w:t>Branch2</w:t>
+            </w:r>
+          </w:p>
+        </w:tc>
+        <w:tc>
+          <w:tcPr>
+            <w:tcW w:type="dxa" w:w="785"/>
+          </w:tcPr>
+          <w:p>
+            <w:r>
+              <w:t>admin1</w:t>
+            </w:r>
+          </w:p>
+        </w:tc>
+        <w:tc>
+          <w:tcPr>
+            <w:tcW w:type="dxa" w:w="785"/>
+          </w:tcPr>
+          <w:p>
+            <w:r>
+              <w:t>guest1</w:t>
+            </w:r>
+          </w:p>
+        </w:tc>
+        <w:tc>
+          <w:tcPr>
+            <w:tcW w:type="dxa" w:w="785"/>
+          </w:tcPr>
+          <w:p>
+            <w:r>
+              <w:t>94.78</w:t>
+            </w:r>
+          </w:p>
+        </w:tc>
+        <w:tc>
+          <w:tcPr>
+            <w:tcW w:type="dxa" w:w="785"/>
+          </w:tcPr>
+          <w:p>
+            <w:r>
+              <w:t>8.827</w:t>
+            </w:r>
+          </w:p>
+        </w:tc>
+        <w:tc>
+          <w:tcPr>
+            <w:tcW w:type="dxa" w:w="785"/>
+          </w:tcPr>
+          <w:p>
+            <w:r>
+              <w:t>0.0</w:t>
+            </w:r>
+          </w:p>
+        </w:tc>
+        <w:tc>
+          <w:tcPr>
+            <w:tcW w:type="dxa" w:w="785"/>
+          </w:tcPr>
+          <w:p>
+            <w:r>
+              <w:t>0.105</w:t>
+            </w:r>
+          </w:p>
+        </w:tc>
+        <w:tc>
+          <w:tcPr>
+            <w:tcW w:type="dxa" w:w="785"/>
+          </w:tcPr>
+          <w:p>
+            <w:r>
+              <w:t>0.0</w:t>
+            </w:r>
+          </w:p>
+        </w:tc>
+        <w:tc>
+          <w:tcPr>
+            <w:tcW w:type="dxa" w:w="785"/>
+          </w:tcPr>
+          <w:p>
+            <w:r>
+              <w:t>success</w:t>
+            </w:r>
+          </w:p>
+        </w:tc>
+      </w:tr>
+      <w:tr>
+        <w:tc>
+          <w:tcPr>
+            <w:tcW w:type="dxa" w:w="785"/>
+          </w:tcPr>
+          <w:p>
+            <w:r>
+              <w:t>2026-05-05T14:57:13</w:t>
+            </w:r>
+          </w:p>
+        </w:tc>
+        <w:tc>
+          <w:tcPr>
+            <w:tcW w:type="dxa" w:w="785"/>
+          </w:tcPr>
+          <w:p>
+            <w:r>
+              <w:t>Branch3</w:t>
+            </w:r>
+          </w:p>
+        </w:tc>
+        <w:tc>
+          <w:tcPr>
+            <w:tcW w:type="dxa" w:w="785"/>
+          </w:tcPr>
+          <w:p>
+            <w:r>
+              <w:t>Branch3</w:t>
+            </w:r>
+          </w:p>
+        </w:tc>
+        <w:tc>
+          <w:tcPr>
+            <w:tcW w:type="dxa" w:w="785"/>
+          </w:tcPr>
+          <w:p>
+            <w:r>
+              <w:t>svr1</w:t>
+            </w:r>
+          </w:p>
+        </w:tc>
+        <w:tc>
+          <w:tcPr>
+            <w:tcW w:type="dxa" w:w="785"/>
+          </w:tcPr>
+          <w:p>
+            <w:r>
+              <w:t>os1</w:t>
+            </w:r>
+          </w:p>
+        </w:tc>
+        <w:tc>
+          <w:tcPr>
+            <w:tcW w:type="dxa" w:w="785"/>
+          </w:tcPr>
+          <w:p>
+            <w:r>
+              <w:t>94.893</w:t>
+            </w:r>
+          </w:p>
+        </w:tc>
+        <w:tc>
+          <w:tcPr>
+            <w:tcW w:type="dxa" w:w="785"/>
+          </w:tcPr>
+          <w:p>
+            <w:r>
+              <w:t>8.83</w:t>
+            </w:r>
+          </w:p>
+        </w:tc>
+        <w:tc>
+          <w:tcPr>
+            <w:tcW w:type="dxa" w:w="785"/>
+          </w:tcPr>
+          <w:p>
+            <w:r>
+              <w:t>0.0</w:t>
+            </w:r>
+          </w:p>
+        </w:tc>
+        <w:tc>
+          <w:tcPr>
+            <w:tcW w:type="dxa" w:w="785"/>
+          </w:tcPr>
+          <w:p>
+            <w:r>
+              <w:t>0.119</w:t>
+            </w:r>
+          </w:p>
+        </w:tc>
+        <w:tc>
+          <w:tcPr>
+            <w:tcW w:type="dxa" w:w="785"/>
+          </w:tcPr>
+          <w:p>
+            <w:r>
+              <w:t>0.0</w:t>
+            </w:r>
+          </w:p>
+        </w:tc>
+        <w:tc>
+          <w:tcPr>
+            <w:tcW w:type="dxa" w:w="785"/>
           </w:tcPr>
           <w:p>
             <w:r>

</xml_diff>

<commit_message>
Implement native kernel MPLS validation
</commit_message>
<xml_diff>
--- a/Metro_Ethernet_MPLS_Project/report/Bao_cao_Metro_Ethernet_MPLS_Mininet.docx
+++ b/Metro_Ethernet_MPLS_Project/report/Bao_cao_Metro_Ethernet_MPLS_Mininet.docx
@@ -179,7 +179,7 @@
     </w:p>
     <w:p>
       <w:r>
-        <w:t>Muc tieu la thiet ke mo hinh CE-PE-P, cau hinh forwarding lien chi nhanh, kiem thu connectivity va do throughput, delay, packet loss, jitter.</w:t>
+        <w:t>Muc tieu la thiet ke mo hinh CE-PE-P, cau hinh Linux kernel MPLS lien chi nhanh, kiem thu connectivity va do throughput, delay, packet loss, jitter.</w:t>
       </w:r>
     </w:p>
     <w:p>
@@ -529,7 +529,197 @@
     </w:p>
     <w:p>
       <w:r>
-        <w:t>Moi truong nay su dung static route that de mo phong forwarding tuong duong MPLS ve logic. Neu kernel/OVS khong ho tro MPLS native, bao cao khong tu nhan la MPLS native. Du lieu do van la du lieu that vi goi tin di qua topology CE-PE-P-PE-CE trong Mininet.</w:t>
+        <w:t>Mode MPLS su dung Linux kernel MPLS that: PE dau vao push label, P router swap label, egress PE pop label roi chuyen tiep IP ve CE. Bang chung cau hinh nam trong results/mpls_routes.txt va goi MPLS bat bang tcpdump nam trong results/tcpdump_mpls.txt.</w:t>
+      </w:r>
+    </w:p>
+    <w:p>
+      <w:pPr>
+        <w:pStyle w:val="Heading2"/>
+      </w:pPr>
+      <w:r>
+        <w:t>12.1 Minh chung bang route MPLS kernel</w:t>
+      </w:r>
+    </w:p>
+    <w:p>
+      <w:r>
+        <w:t>Trich xuat bang route MPLS that tren PE/P. Cac dong `encap mpls` the hien push label tren PE; cac dong `as to` the hien swap label tren P.</w:t>
+      </w:r>
+    </w:p>
+    <w:p>
+      <w:r>
+        <w:rPr>
+          <w:rFonts w:ascii="Courier New" w:hAnsi="Courier New"/>
+          <w:sz w:val="16"/>
+        </w:rPr>
+        <w:t>===== pe1: ip route show =====</w:t>
+        <w:br/>
+        <w:t xml:space="preserve">10.1.0.0/24 via 172.16.1.2 dev pe1-eth0 </w:t>
+        <w:br/>
+        <w:t xml:space="preserve">10.2.0.0/24  encap mpls  120 via 172.20.13.2 dev pe1-eth2 </w:t>
+        <w:br/>
+        <w:t xml:space="preserve">10.3.0.0/24  encap mpls  130 via 172.20.11.2 dev pe1-eth1 </w:t>
+        <w:br/>
+        <w:t xml:space="preserve">172.16.1.0/30 dev pe1-eth0 proto kernel scope link src 172.16.1.1 </w:t>
+        <w:br/>
+        <w:t xml:space="preserve">172.20.11.0/30 dev pe1-eth1 proto kernel scope link src 172.20.11.1 </w:t>
+        <w:br/>
+        <w:t xml:space="preserve">172.20.13.0/30 dev pe1-eth2 proto kernel scope link src 172.20.13.1 </w:t>
+        <w:br/>
+        <w:br/>
+        <w:t>===== pe1: ip -f mpls route show =====</w:t>
+        <w:br/>
+        <w:t xml:space="preserve">211 via inet 172.16.1.2 dev pe1-eth0 </w:t>
+        <w:br/>
+        <w:t xml:space="preserve">312 via inet 172.16.1.2 dev pe1-eth0 </w:t>
+        <w:br/>
+        <w:br/>
+        <w:t>===== pe1: sysctl net.mpls.platform_labels =====</w:t>
+        <w:br/>
+        <w:t>net.mpls.platform_labels = 100000</w:t>
+        <w:br/>
+        <w:br/>
+        <w:t>===== pe2: ip route show =====</w:t>
+        <w:br/>
+        <w:t xml:space="preserve">10.1.0.0/24  encap mpls  210 via 172.20.23.2 dev pe2-eth1 </w:t>
+        <w:br/>
+        <w:t xml:space="preserve">10.2.0.0/24 via 172.16.2.2 dev pe2-eth0 </w:t>
+        <w:br/>
+        <w:t xml:space="preserve">10.3.0.0/24  encap mpls  230 via 172.20.24.2 dev pe2-eth2 </w:t>
+        <w:br/>
+        <w:t xml:space="preserve">172.16.2.0/30 dev pe2-eth0 proto kernel scope link src 172.16.2.1 </w:t>
+        <w:br/>
+        <w:t xml:space="preserve">172.20.23.0/30 dev pe2-eth1 proto kernel scope link src 172.20.23.1 </w:t>
+        <w:br/>
+        <w:t xml:space="preserve">172.20.24.0/30 dev pe2-eth2 proto kernel scope link src 172.20.24.1 </w:t>
+        <w:br/>
+        <w:br/>
+        <w:t>===== pe2: ip -f mpls route show =====</w:t>
+        <w:br/>
+        <w:t xml:space="preserve">121 via inet 172.16.2.2 dev pe2-eth0 </w:t>
+        <w:br/>
+        <w:t xml:space="preserve">321 via inet 172.16.2.2 dev pe2-eth0 </w:t>
+        <w:br/>
+        <w:br/>
+        <w:t>===== pe2: sysctl net.mpls.platform_labels =====</w:t>
+        <w:br/>
+        <w:t>net.mpls.platform_labels = 100000</w:t>
+        <w:br/>
+        <w:br/>
+        <w:t>===== pe3: ip route show =====</w:t>
+        <w:br/>
+        <w:t xml:space="preserve">10.1.0.0/24  encap mpls  310 via 172.20.32.2 dev pe3-eth1 </w:t>
+        <w:br/>
+        <w:t xml:space="preserve">10.2.0.0/24  encap mpls  320 via 172.20.34.2 dev pe3-eth2 </w:t>
+        <w:br/>
+        <w:t xml:space="preserve">10.3.0.0/24 via 172.16.3.2 dev pe3-eth0 </w:t>
+      </w:r>
+    </w:p>
+    <w:p>
+      <w:pPr>
+        <w:pStyle w:val="Heading2"/>
+      </w:pPr>
+      <w:r>
+        <w:t>12.2 Minh chung bang tcpdump va hex dump</w:t>
+      </w:r>
+    </w:p>
+    <w:p>
+      <w:r>
+        <w:t>Tcpdump tren core link p3-eth0 bat duoc ethertype 0x8847 va MPLS shim header 4 byte; day la bang chung goi tin di bang label thay vi chi IP routing.</w:t>
+      </w:r>
+    </w:p>
+    <w:p>
+      <w:r>
+        <w:rPr>
+          <w:rFonts w:ascii="Courier New" w:hAnsi="Courier New"/>
+          <w:sz w:val="16"/>
+        </w:rPr>
+        <w:t>tcpdump: listening on p3-eth0, link-type EN10MB (Ethernet), snapshot length 262144 bytes</w:t>
+        <w:br/>
+        <w:t>16:06:01.354230 ca:ec:7c:b9:a5:b1 &gt; 00:00:00:00:00:10, ethertype MPLS unicast (0x8847), length 102: MPLS (label 120, tc 0, [S], ttl 62)</w:t>
+        <w:br/>
+        <w:tab/>
+        <w:t>(tos 0x0, ttl 62, id 10706, offset 0, flags [DF], proto ICMP (1), length 84)</w:t>
+        <w:br/>
+        <w:t xml:space="preserve">    10.1.0.11 &gt; 10.2.0.21: ICMP echo request, id 14231, seq 1, length 64</w:t>
+        <w:br/>
+        <w:tab/>
+        <w:t>0x0000:  0000 0000 0010 caec 7cb9 a5b1 8847 0007  ........|....G..</w:t>
+        <w:br/>
+        <w:tab/>
+        <w:t>0x0010:  813e 4500 0054 29d2 4000 3e01 feb4 0a01  .&gt;E..T).@.&gt;.....</w:t>
+        <w:br/>
+        <w:tab/>
+        <w:t>0x0020:  000b 0a02 0015 0800 b62c 3797 0001 f9b2  .........,7.....</w:t>
+        <w:br/>
+        <w:tab/>
+        <w:t>0x0030:  f969 0000 0000 534b 0500 0000 0000 1011  .i....SK........</w:t>
+        <w:br/>
+        <w:tab/>
+        <w:t>0x0040:  1213 1415 1617 1819 1a1b 1c1d 1e1f 2021  ...............!</w:t>
+        <w:br/>
+        <w:tab/>
+        <w:t>0x0050:  2223 2425 2627 2829 2a2b 2c2d 2e2f 3031  "#$%&amp;'()*+,-./01</w:t>
+        <w:br/>
+        <w:tab/>
+        <w:t>0x0060:  3233 3435 3637                           234567</w:t>
+        <w:br/>
+        <w:t>16:06:01.376249 00:00:00:00:00:10 &gt; ca:ec:7c:b9:a5:b1, ethertype MPLS unicast (0x8847), length 102: MPLS (label 211, tc 0, [S], ttl 61)</w:t>
+        <w:br/>
+        <w:tab/>
+        <w:t>(tos 0x0, ttl 62, id 8898, offset 0, flags [none], proto ICMP (1), length 84)</w:t>
+        <w:br/>
+        <w:t xml:space="preserve">    10.2.0.21 &gt; 10.1.0.11: ICMP echo reply, id 14231, seq 1, length 64</w:t>
+        <w:br/>
+        <w:tab/>
+        <w:t>0x0000:  caec 7cb9 a5b1 0000 0000 0010 8847 000d  ..|..........G..</w:t>
+        <w:br/>
+        <w:tab/>
+        <w:t>0x0010:  313d 4500 0054 22c2 0000 3e01 45c5 0a02  1=E..T"...&gt;.E...</w:t>
+        <w:br/>
+        <w:tab/>
+        <w:t>0x0020:  0015 0a01 000b 0000 be2c 3797 0001 f9b2  .........,7.....</w:t>
+        <w:br/>
+        <w:tab/>
+        <w:t>0x0030:  f969 0000 0000 534b 0500 0000 0000 1011  .i....SK........</w:t>
+        <w:br/>
+        <w:tab/>
+        <w:t>0x0040:  1213 1415 1617 1819 1a1b 1c1d 1e1f 2021  ...............!</w:t>
+        <w:br/>
+        <w:tab/>
+        <w:t>0x0050:  2223 2425 2627 2829 2a2b 2c2d 2e2f 3031  "#$%&amp;'()*+,-./01</w:t>
+        <w:br/>
+        <w:tab/>
+        <w:t>0x0060:  3233 3435 3637                           234567</w:t>
+        <w:br/>
+        <w:t>16:06:01.555329 ca:ec:7c:b9:a5:b1 &gt; 00:00:00:00:00:10, ethertype MPLS unicast (0x8847), length 102: MPLS (label 120, tc 0, [S], ttl 62)</w:t>
+        <w:br/>
+        <w:tab/>
+        <w:t>(tos 0x0, ttl 62, id 10784, offset 0, flags [DF], proto ICMP (1), length 84)</w:t>
+        <w:br/>
+        <w:t xml:space="preserve">    10.1.0.11 &gt; 10.2.0.21: ICMP echo request, id 14231, seq 2, length 64</w:t>
+        <w:br/>
+        <w:tab/>
+        <w:t>0x0000:  0000 0000 0010 caec 7cb9 a5b1 8847 0007  ........|....G..</w:t>
+        <w:br/>
+        <w:tab/>
+        <w:t>0x0010:  813e 4500 0054 2a20 4000 3e01 fe66 0a01  .&gt;E..T*.@.&gt;..f..</w:t>
+        <w:br/>
+        <w:tab/>
+        <w:t>0x0020:  000b 0a02 0015 0800 d21a 3797 0002 f9b2  ..........7.....</w:t>
+        <w:br/>
+        <w:tab/>
+        <w:t>0x0030:  f969 0000 0000 345c 0800 0000 0000 1011  .i....4\........</w:t>
+        <w:br/>
+        <w:tab/>
+        <w:t>0x0040:  1213 1415 1617 1819 1a1b 1c1d 1e1f 2021  ...............!</w:t>
+        <w:br/>
+        <w:tab/>
+        <w:t>0x0050:  2223 2425 2627 2829 2a2b 2c2d 2e2f 3031  "#$%&amp;'()*+,-./01</w:t>
+        <w:br/>
+        <w:tab/>
+        <w:t>0x0060:  3233 3435 3637                           234567</w:t>
+        <w:br/>
+        <w:t>16:06:01.577290 00:00:00:00:00:10 &gt; ca:ec:7c:b9:a5:b1, ethertype MPLS unicast (0x8847), length 102: MPLS (label 211, tc 0, [S], ttl 61)</w:t>
       </w:r>
     </w:p>
     <w:p>
@@ -568,7 +758,7 @@
     </w:p>
     <w:p>
       <w:r>
-        <w:t>Thoi gian kiem thu tu results.csv: 2026-05-05T14:55:42 den 2026-05-05T14:57:13.</w:t>
+        <w:t>Thoi gian kiem thu tu results.csv: 2026-05-05T16:06:06 den 2026-05-05T16:07:42.</w:t>
       </w:r>
     </w:p>
     <w:tbl>
@@ -578,22 +768,23 @@
         <w:tblLook w:firstColumn="1" w:firstRow="1" w:lastColumn="0" w:lastRow="0" w:noHBand="0" w:noVBand="1" w:val="04A0"/>
       </w:tblPr>
       <w:tblGrid>
-        <w:gridCol w:w="785"/>
-        <w:gridCol w:w="785"/>
-        <w:gridCol w:w="785"/>
-        <w:gridCol w:w="785"/>
-        <w:gridCol w:w="785"/>
-        <w:gridCol w:w="785"/>
-        <w:gridCol w:w="785"/>
-        <w:gridCol w:w="785"/>
-        <w:gridCol w:w="785"/>
-        <w:gridCol w:w="785"/>
-        <w:gridCol w:w="785"/>
+        <w:gridCol w:w="720"/>
+        <w:gridCol w:w="720"/>
+        <w:gridCol w:w="720"/>
+        <w:gridCol w:w="720"/>
+        <w:gridCol w:w="720"/>
+        <w:gridCol w:w="720"/>
+        <w:gridCol w:w="720"/>
+        <w:gridCol w:w="720"/>
+        <w:gridCol w:w="720"/>
+        <w:gridCol w:w="720"/>
+        <w:gridCol w:w="720"/>
+        <w:gridCol w:w="720"/>
       </w:tblGrid>
       <w:tr>
         <w:tc>
           <w:tcPr>
-            <w:tcW w:type="dxa" w:w="785"/>
+            <w:tcW w:type="dxa" w:w="720"/>
           </w:tcPr>
           <w:p>
             <w:r>
@@ -603,7 +794,17 @@
         </w:tc>
         <w:tc>
           <w:tcPr>
-            <w:tcW w:type="dxa" w:w="785"/>
+            <w:tcW w:type="dxa" w:w="720"/>
+          </w:tcPr>
+          <w:p>
+            <w:r>
+              <w:t>mode</w:t>
+            </w:r>
+          </w:p>
+        </w:tc>
+        <w:tc>
+          <w:tcPr>
+            <w:tcW w:type="dxa" w:w="720"/>
           </w:tcPr>
           <w:p>
             <w:r>
@@ -613,7 +814,7 @@
         </w:tc>
         <w:tc>
           <w:tcPr>
-            <w:tcW w:type="dxa" w:w="785"/>
+            <w:tcW w:type="dxa" w:w="720"/>
           </w:tcPr>
           <w:p>
             <w:r>
@@ -623,7 +824,7 @@
         </w:tc>
         <w:tc>
           <w:tcPr>
-            <w:tcW w:type="dxa" w:w="785"/>
+            <w:tcW w:type="dxa" w:w="720"/>
           </w:tcPr>
           <w:p>
             <w:r>
@@ -633,7 +834,7 @@
         </w:tc>
         <w:tc>
           <w:tcPr>
-            <w:tcW w:type="dxa" w:w="785"/>
+            <w:tcW w:type="dxa" w:w="720"/>
           </w:tcPr>
           <w:p>
             <w:r>
@@ -643,7 +844,7 @@
         </w:tc>
         <w:tc>
           <w:tcPr>
-            <w:tcW w:type="dxa" w:w="785"/>
+            <w:tcW w:type="dxa" w:w="720"/>
           </w:tcPr>
           <w:p>
             <w:r>
@@ -653,7 +854,7 @@
         </w:tc>
         <w:tc>
           <w:tcPr>
-            <w:tcW w:type="dxa" w:w="785"/>
+            <w:tcW w:type="dxa" w:w="720"/>
           </w:tcPr>
           <w:p>
             <w:r>
@@ -663,7 +864,7 @@
         </w:tc>
         <w:tc>
           <w:tcPr>
-            <w:tcW w:type="dxa" w:w="785"/>
+            <w:tcW w:type="dxa" w:w="720"/>
           </w:tcPr>
           <w:p>
             <w:r>
@@ -673,7 +874,7 @@
         </w:tc>
         <w:tc>
           <w:tcPr>
-            <w:tcW w:type="dxa" w:w="785"/>
+            <w:tcW w:type="dxa" w:w="720"/>
           </w:tcPr>
           <w:p>
             <w:r>
@@ -683,7 +884,7 @@
         </w:tc>
         <w:tc>
           <w:tcPr>
-            <w:tcW w:type="dxa" w:w="785"/>
+            <w:tcW w:type="dxa" w:w="720"/>
           </w:tcPr>
           <w:p>
             <w:r>
@@ -693,7 +894,7 @@
         </w:tc>
         <w:tc>
           <w:tcPr>
-            <w:tcW w:type="dxa" w:w="785"/>
+            <w:tcW w:type="dxa" w:w="720"/>
           </w:tcPr>
           <w:p>
             <w:r>
@@ -705,17 +906,27 @@
       <w:tr>
         <w:tc>
           <w:tcPr>
-            <w:tcW w:type="dxa" w:w="785"/>
+            <w:tcW w:type="dxa" w:w="720"/>
           </w:tcPr>
           <w:p>
             <w:r>
-              <w:t>2026-05-05T14:55:42</w:t>
+              <w:t>2026-05-05T16:06:06</w:t>
             </w:r>
           </w:p>
         </w:tc>
         <w:tc>
           <w:tcPr>
-            <w:tcW w:type="dxa" w:w="785"/>
+            <w:tcW w:type="dxa" w:w="720"/>
+          </w:tcPr>
+          <w:p>
+            <w:r>
+              <w:t>mpls</w:t>
+            </w:r>
+          </w:p>
+        </w:tc>
+        <w:tc>
+          <w:tcPr>
+            <w:tcW w:type="dxa" w:w="720"/>
           </w:tcPr>
           <w:p>
             <w:r>
@@ -725,7 +936,7 @@
         </w:tc>
         <w:tc>
           <w:tcPr>
-            <w:tcW w:type="dxa" w:w="785"/>
+            <w:tcW w:type="dxa" w:w="720"/>
           </w:tcPr>
           <w:p>
             <w:r>
@@ -735,7 +946,7 @@
         </w:tc>
         <w:tc>
           <w:tcPr>
-            <w:tcW w:type="dxa" w:w="785"/>
+            <w:tcW w:type="dxa" w:w="720"/>
           </w:tcPr>
           <w:p>
             <w:r>
@@ -745,7 +956,7 @@
         </w:tc>
         <w:tc>
           <w:tcPr>
-            <w:tcW w:type="dxa" w:w="785"/>
+            <w:tcW w:type="dxa" w:w="720"/>
           </w:tcPr>
           <w:p>
             <w:r>
@@ -755,27 +966,27 @@
         </w:tc>
         <w:tc>
           <w:tcPr>
-            <w:tcW w:type="dxa" w:w="785"/>
+            <w:tcW w:type="dxa" w:w="720"/>
           </w:tcPr>
           <w:p>
             <w:r>
-              <w:t>55.201</w:t>
+              <w:t>55.089</w:t>
             </w:r>
           </w:p>
         </w:tc>
         <w:tc>
           <w:tcPr>
-            <w:tcW w:type="dxa" w:w="785"/>
+            <w:tcW w:type="dxa" w:w="720"/>
           </w:tcPr>
           <w:p>
             <w:r>
-              <w:t>34.14</w:t>
+              <w:t>33.485</w:t>
             </w:r>
           </w:p>
         </w:tc>
         <w:tc>
           <w:tcPr>
-            <w:tcW w:type="dxa" w:w="785"/>
+            <w:tcW w:type="dxa" w:w="720"/>
           </w:tcPr>
           <w:p>
             <w:r>
@@ -785,17 +996,17 @@
         </w:tc>
         <w:tc>
           <w:tcPr>
-            <w:tcW w:type="dxa" w:w="785"/>
+            <w:tcW w:type="dxa" w:w="720"/>
           </w:tcPr>
           <w:p>
             <w:r>
-              <w:t>0.093</w:t>
+              <w:t>0.135</w:t>
             </w:r>
           </w:p>
         </w:tc>
         <w:tc>
           <w:tcPr>
-            <w:tcW w:type="dxa" w:w="785"/>
+            <w:tcW w:type="dxa" w:w="720"/>
           </w:tcPr>
           <w:p>
             <w:r>
@@ -805,7 +1016,7 @@
         </w:tc>
         <w:tc>
           <w:tcPr>
-            <w:tcW w:type="dxa" w:w="785"/>
+            <w:tcW w:type="dxa" w:w="720"/>
           </w:tcPr>
           <w:p>
             <w:r>
@@ -817,17 +1028,27 @@
       <w:tr>
         <w:tc>
           <w:tcPr>
-            <w:tcW w:type="dxa" w:w="785"/>
+            <w:tcW w:type="dxa" w:w="720"/>
           </w:tcPr>
           <w:p>
             <w:r>
-              <w:t>2026-05-05T14:56:01</w:t>
+              <w:t>2026-05-05T16:06:26</w:t>
             </w:r>
           </w:p>
         </w:tc>
         <w:tc>
           <w:tcPr>
-            <w:tcW w:type="dxa" w:w="785"/>
+            <w:tcW w:type="dxa" w:w="720"/>
+          </w:tcPr>
+          <w:p>
+            <w:r>
+              <w:t>mpls</w:t>
+            </w:r>
+          </w:p>
+        </w:tc>
+        <w:tc>
+          <w:tcPr>
+            <w:tcW w:type="dxa" w:w="720"/>
           </w:tcPr>
           <w:p>
             <w:r>
@@ -837,7 +1058,7 @@
         </w:tc>
         <w:tc>
           <w:tcPr>
-            <w:tcW w:type="dxa" w:w="785"/>
+            <w:tcW w:type="dxa" w:w="720"/>
           </w:tcPr>
           <w:p>
             <w:r>
@@ -847,7 +1068,7 @@
         </w:tc>
         <w:tc>
           <w:tcPr>
-            <w:tcW w:type="dxa" w:w="785"/>
+            <w:tcW w:type="dxa" w:w="720"/>
           </w:tcPr>
           <w:p>
             <w:r>
@@ -857,7 +1078,7 @@
         </w:tc>
         <w:tc>
           <w:tcPr>
-            <w:tcW w:type="dxa" w:w="785"/>
+            <w:tcW w:type="dxa" w:w="720"/>
           </w:tcPr>
           <w:p>
             <w:r>
@@ -867,27 +1088,27 @@
         </w:tc>
         <w:tc>
           <w:tcPr>
-            <w:tcW w:type="dxa" w:w="785"/>
+            <w:tcW w:type="dxa" w:w="720"/>
           </w:tcPr>
           <w:p>
             <w:r>
-              <w:t>45.553</w:t>
+              <w:t>45.723</w:t>
             </w:r>
           </w:p>
         </w:tc>
         <w:tc>
           <w:tcPr>
-            <w:tcW w:type="dxa" w:w="785"/>
+            <w:tcW w:type="dxa" w:w="720"/>
           </w:tcPr>
           <w:p>
             <w:r>
-              <w:t>44.234</w:t>
+              <w:t>39.758</w:t>
             </w:r>
           </w:p>
         </w:tc>
         <w:tc>
           <w:tcPr>
-            <w:tcW w:type="dxa" w:w="785"/>
+            <w:tcW w:type="dxa" w:w="720"/>
           </w:tcPr>
           <w:p>
             <w:r>
@@ -897,17 +1118,17 @@
         </w:tc>
         <w:tc>
           <w:tcPr>
-            <w:tcW w:type="dxa" w:w="785"/>
+            <w:tcW w:type="dxa" w:w="720"/>
           </w:tcPr>
           <w:p>
             <w:r>
-              <w:t>0.166</w:t>
+              <w:t>0.118</w:t>
             </w:r>
           </w:p>
         </w:tc>
         <w:tc>
           <w:tcPr>
-            <w:tcW w:type="dxa" w:w="785"/>
+            <w:tcW w:type="dxa" w:w="720"/>
           </w:tcPr>
           <w:p>
             <w:r>
@@ -917,7 +1138,7 @@
         </w:tc>
         <w:tc>
           <w:tcPr>
-            <w:tcW w:type="dxa" w:w="785"/>
+            <w:tcW w:type="dxa" w:w="720"/>
           </w:tcPr>
           <w:p>
             <w:r>
@@ -929,17 +1150,27 @@
       <w:tr>
         <w:tc>
           <w:tcPr>
-            <w:tcW w:type="dxa" w:w="785"/>
+            <w:tcW w:type="dxa" w:w="720"/>
           </w:tcPr>
           <w:p>
             <w:r>
-              <w:t>2026-05-05T14:56:19</w:t>
+              <w:t>2026-05-05T16:06:47</w:t>
             </w:r>
           </w:p>
         </w:tc>
         <w:tc>
           <w:tcPr>
-            <w:tcW w:type="dxa" w:w="785"/>
+            <w:tcW w:type="dxa" w:w="720"/>
+          </w:tcPr>
+          <w:p>
+            <w:r>
+              <w:t>mpls</w:t>
+            </w:r>
+          </w:p>
+        </w:tc>
+        <w:tc>
+          <w:tcPr>
+            <w:tcW w:type="dxa" w:w="720"/>
           </w:tcPr>
           <w:p>
             <w:r>
@@ -949,7 +1180,7 @@
         </w:tc>
         <w:tc>
           <w:tcPr>
-            <w:tcW w:type="dxa" w:w="785"/>
+            <w:tcW w:type="dxa" w:w="720"/>
           </w:tcPr>
           <w:p>
             <w:r>
@@ -959,7 +1190,7 @@
         </w:tc>
         <w:tc>
           <w:tcPr>
-            <w:tcW w:type="dxa" w:w="785"/>
+            <w:tcW w:type="dxa" w:w="720"/>
           </w:tcPr>
           <w:p>
             <w:r>
@@ -969,7 +1200,7 @@
         </w:tc>
         <w:tc>
           <w:tcPr>
-            <w:tcW w:type="dxa" w:w="785"/>
+            <w:tcW w:type="dxa" w:w="720"/>
           </w:tcPr>
           <w:p>
             <w:r>
@@ -979,27 +1210,27 @@
         </w:tc>
         <w:tc>
           <w:tcPr>
-            <w:tcW w:type="dxa" w:w="785"/>
+            <w:tcW w:type="dxa" w:w="720"/>
           </w:tcPr>
           <w:p>
             <w:r>
-              <w:t>55.335</w:t>
+              <w:t>54.891</w:t>
             </w:r>
           </w:p>
         </w:tc>
         <w:tc>
           <w:tcPr>
-            <w:tcW w:type="dxa" w:w="785"/>
+            <w:tcW w:type="dxa" w:w="720"/>
           </w:tcPr>
           <w:p>
             <w:r>
-              <w:t>36.077</w:t>
+              <w:t>36.083</w:t>
             </w:r>
           </w:p>
         </w:tc>
         <w:tc>
           <w:tcPr>
-            <w:tcW w:type="dxa" w:w="785"/>
+            <w:tcW w:type="dxa" w:w="720"/>
           </w:tcPr>
           <w:p>
             <w:r>
@@ -1009,17 +1240,17 @@
         </w:tc>
         <w:tc>
           <w:tcPr>
-            <w:tcW w:type="dxa" w:w="785"/>
+            <w:tcW w:type="dxa" w:w="720"/>
           </w:tcPr>
           <w:p>
             <w:r>
-              <w:t>0.161</w:t>
+              <w:t>0.117</w:t>
             </w:r>
           </w:p>
         </w:tc>
         <w:tc>
           <w:tcPr>
-            <w:tcW w:type="dxa" w:w="785"/>
+            <w:tcW w:type="dxa" w:w="720"/>
           </w:tcPr>
           <w:p>
             <w:r>
@@ -1029,7 +1260,7 @@
         </w:tc>
         <w:tc>
           <w:tcPr>
-            <w:tcW w:type="dxa" w:w="785"/>
+            <w:tcW w:type="dxa" w:w="720"/>
           </w:tcPr>
           <w:p>
             <w:r>
@@ -1041,17 +1272,27 @@
       <w:tr>
         <w:tc>
           <w:tcPr>
-            <w:tcW w:type="dxa" w:w="785"/>
+            <w:tcW w:type="dxa" w:w="720"/>
           </w:tcPr>
           <w:p>
             <w:r>
-              <w:t>2026-05-05T14:56:38</w:t>
+              <w:t>2026-05-05T16:07:07</w:t>
             </w:r>
           </w:p>
         </w:tc>
         <w:tc>
           <w:tcPr>
-            <w:tcW w:type="dxa" w:w="785"/>
+            <w:tcW w:type="dxa" w:w="720"/>
+          </w:tcPr>
+          <w:p>
+            <w:r>
+              <w:t>mpls</w:t>
+            </w:r>
+          </w:p>
+        </w:tc>
+        <w:tc>
+          <w:tcPr>
+            <w:tcW w:type="dxa" w:w="720"/>
           </w:tcPr>
           <w:p>
             <w:r>
@@ -1061,7 +1302,7 @@
         </w:tc>
         <w:tc>
           <w:tcPr>
-            <w:tcW w:type="dxa" w:w="785"/>
+            <w:tcW w:type="dxa" w:w="720"/>
           </w:tcPr>
           <w:p>
             <w:r>
@@ -1071,7 +1312,7 @@
         </w:tc>
         <w:tc>
           <w:tcPr>
-            <w:tcW w:type="dxa" w:w="785"/>
+            <w:tcW w:type="dxa" w:w="720"/>
           </w:tcPr>
           <w:p>
             <w:r>
@@ -1081,7 +1322,7 @@
         </w:tc>
         <w:tc>
           <w:tcPr>
-            <w:tcW w:type="dxa" w:w="785"/>
+            <w:tcW w:type="dxa" w:w="720"/>
           </w:tcPr>
           <w:p>
             <w:r>
@@ -1091,27 +1332,27 @@
         </w:tc>
         <w:tc>
           <w:tcPr>
-            <w:tcW w:type="dxa" w:w="785"/>
+            <w:tcW w:type="dxa" w:w="720"/>
           </w:tcPr>
           <w:p>
             <w:r>
-              <w:t>94.882</w:t>
+              <w:t>94.895</w:t>
             </w:r>
           </w:p>
         </w:tc>
         <w:tc>
           <w:tcPr>
-            <w:tcW w:type="dxa" w:w="785"/>
+            <w:tcW w:type="dxa" w:w="720"/>
           </w:tcPr>
           <w:p>
             <w:r>
-              <w:t>7.026</w:t>
+              <w:t>6.552</w:t>
             </w:r>
           </w:p>
         </w:tc>
         <w:tc>
           <w:tcPr>
-            <w:tcW w:type="dxa" w:w="785"/>
+            <w:tcW w:type="dxa" w:w="720"/>
           </w:tcPr>
           <w:p>
             <w:r>
@@ -1121,17 +1362,17 @@
         </w:tc>
         <w:tc>
           <w:tcPr>
-            <w:tcW w:type="dxa" w:w="785"/>
+            <w:tcW w:type="dxa" w:w="720"/>
           </w:tcPr>
           <w:p>
             <w:r>
-              <w:t>0.08</w:t>
+              <w:t>0.057</w:t>
             </w:r>
           </w:p>
         </w:tc>
         <w:tc>
           <w:tcPr>
-            <w:tcW w:type="dxa" w:w="785"/>
+            <w:tcW w:type="dxa" w:w="720"/>
           </w:tcPr>
           <w:p>
             <w:r>
@@ -1141,7 +1382,7 @@
         </w:tc>
         <w:tc>
           <w:tcPr>
-            <w:tcW w:type="dxa" w:w="785"/>
+            <w:tcW w:type="dxa" w:w="720"/>
           </w:tcPr>
           <w:p>
             <w:r>
@@ -1153,17 +1394,27 @@
       <w:tr>
         <w:tc>
           <w:tcPr>
-            <w:tcW w:type="dxa" w:w="785"/>
+            <w:tcW w:type="dxa" w:w="720"/>
           </w:tcPr>
           <w:p>
             <w:r>
-              <w:t>2026-05-05T14:56:55</w:t>
+              <w:t>2026-05-05T16:07:24</w:t>
             </w:r>
           </w:p>
         </w:tc>
         <w:tc>
           <w:tcPr>
-            <w:tcW w:type="dxa" w:w="785"/>
+            <w:tcW w:type="dxa" w:w="720"/>
+          </w:tcPr>
+          <w:p>
+            <w:r>
+              <w:t>mpls</w:t>
+            </w:r>
+          </w:p>
+        </w:tc>
+        <w:tc>
+          <w:tcPr>
+            <w:tcW w:type="dxa" w:w="720"/>
           </w:tcPr>
           <w:p>
             <w:r>
@@ -1173,7 +1424,7 @@
         </w:tc>
         <w:tc>
           <w:tcPr>
-            <w:tcW w:type="dxa" w:w="785"/>
+            <w:tcW w:type="dxa" w:w="720"/>
           </w:tcPr>
           <w:p>
             <w:r>
@@ -1183,7 +1434,7 @@
         </w:tc>
         <w:tc>
           <w:tcPr>
-            <w:tcW w:type="dxa" w:w="785"/>
+            <w:tcW w:type="dxa" w:w="720"/>
           </w:tcPr>
           <w:p>
             <w:r>
@@ -1193,7 +1444,7 @@
         </w:tc>
         <w:tc>
           <w:tcPr>
-            <w:tcW w:type="dxa" w:w="785"/>
+            <w:tcW w:type="dxa" w:w="720"/>
           </w:tcPr>
           <w:p>
             <w:r>
@@ -1203,27 +1454,27 @@
         </w:tc>
         <w:tc>
           <w:tcPr>
-            <w:tcW w:type="dxa" w:w="785"/>
+            <w:tcW w:type="dxa" w:w="720"/>
           </w:tcPr>
           <w:p>
             <w:r>
-              <w:t>94.78</w:t>
+              <w:t>94.324</w:t>
             </w:r>
           </w:p>
         </w:tc>
         <w:tc>
           <w:tcPr>
-            <w:tcW w:type="dxa" w:w="785"/>
+            <w:tcW w:type="dxa" w:w="720"/>
           </w:tcPr>
           <w:p>
             <w:r>
-              <w:t>8.827</w:t>
+              <w:t>13.005</w:t>
             </w:r>
           </w:p>
         </w:tc>
         <w:tc>
           <w:tcPr>
-            <w:tcW w:type="dxa" w:w="785"/>
+            <w:tcW w:type="dxa" w:w="720"/>
           </w:tcPr>
           <w:p>
             <w:r>
@@ -1233,17 +1484,17 @@
         </w:tc>
         <w:tc>
           <w:tcPr>
-            <w:tcW w:type="dxa" w:w="785"/>
+            <w:tcW w:type="dxa" w:w="720"/>
           </w:tcPr>
           <w:p>
             <w:r>
-              <w:t>0.105</w:t>
+              <w:t>0.098</w:t>
             </w:r>
           </w:p>
         </w:tc>
         <w:tc>
           <w:tcPr>
-            <w:tcW w:type="dxa" w:w="785"/>
+            <w:tcW w:type="dxa" w:w="720"/>
           </w:tcPr>
           <w:p>
             <w:r>
@@ -1253,7 +1504,7 @@
         </w:tc>
         <w:tc>
           <w:tcPr>
-            <w:tcW w:type="dxa" w:w="785"/>
+            <w:tcW w:type="dxa" w:w="720"/>
           </w:tcPr>
           <w:p>
             <w:r>
@@ -1265,17 +1516,27 @@
       <w:tr>
         <w:tc>
           <w:tcPr>
-            <w:tcW w:type="dxa" w:w="785"/>
+            <w:tcW w:type="dxa" w:w="720"/>
           </w:tcPr>
           <w:p>
             <w:r>
-              <w:t>2026-05-05T14:57:13</w:t>
+              <w:t>2026-05-05T16:07:42</w:t>
             </w:r>
           </w:p>
         </w:tc>
         <w:tc>
           <w:tcPr>
-            <w:tcW w:type="dxa" w:w="785"/>
+            <w:tcW w:type="dxa" w:w="720"/>
+          </w:tcPr>
+          <w:p>
+            <w:r>
+              <w:t>mpls</w:t>
+            </w:r>
+          </w:p>
+        </w:tc>
+        <w:tc>
+          <w:tcPr>
+            <w:tcW w:type="dxa" w:w="720"/>
           </w:tcPr>
           <w:p>
             <w:r>
@@ -1285,7 +1546,7 @@
         </w:tc>
         <w:tc>
           <w:tcPr>
-            <w:tcW w:type="dxa" w:w="785"/>
+            <w:tcW w:type="dxa" w:w="720"/>
           </w:tcPr>
           <w:p>
             <w:r>
@@ -1295,7 +1556,7 @@
         </w:tc>
         <w:tc>
           <w:tcPr>
-            <w:tcW w:type="dxa" w:w="785"/>
+            <w:tcW w:type="dxa" w:w="720"/>
           </w:tcPr>
           <w:p>
             <w:r>
@@ -1305,7 +1566,7 @@
         </w:tc>
         <w:tc>
           <w:tcPr>
-            <w:tcW w:type="dxa" w:w="785"/>
+            <w:tcW w:type="dxa" w:w="720"/>
           </w:tcPr>
           <w:p>
             <w:r>
@@ -1315,27 +1576,27 @@
         </w:tc>
         <w:tc>
           <w:tcPr>
-            <w:tcW w:type="dxa" w:w="785"/>
+            <w:tcW w:type="dxa" w:w="720"/>
           </w:tcPr>
           <w:p>
             <w:r>
-              <w:t>94.893</w:t>
+              <w:t>94.574</w:t>
             </w:r>
           </w:p>
         </w:tc>
         <w:tc>
           <w:tcPr>
-            <w:tcW w:type="dxa" w:w="785"/>
+            <w:tcW w:type="dxa" w:w="720"/>
           </w:tcPr>
           <w:p>
             <w:r>
-              <w:t>8.83</w:t>
+              <w:t>11.316</w:t>
             </w:r>
           </w:p>
         </w:tc>
         <w:tc>
           <w:tcPr>
-            <w:tcW w:type="dxa" w:w="785"/>
+            <w:tcW w:type="dxa" w:w="720"/>
           </w:tcPr>
           <w:p>
             <w:r>
@@ -1345,17 +1606,17 @@
         </w:tc>
         <w:tc>
           <w:tcPr>
-            <w:tcW w:type="dxa" w:w="785"/>
+            <w:tcW w:type="dxa" w:w="720"/>
           </w:tcPr>
           <w:p>
             <w:r>
-              <w:t>0.119</w:t>
+              <w:t>0.081</w:t>
             </w:r>
           </w:p>
         </w:tc>
         <w:tc>
           <w:tcPr>
-            <w:tcW w:type="dxa" w:w="785"/>
+            <w:tcW w:type="dxa" w:w="720"/>
           </w:tcPr>
           <w:p>
             <w:r>
@@ -1365,7 +1626,7 @@
         </w:tc>
         <w:tc>
           <w:tcPr>
-            <w:tcW w:type="dxa" w:w="785"/>
+            <w:tcW w:type="dxa" w:w="720"/>
           </w:tcPr>
           <w:p>
             <w:r>
@@ -1582,7 +1843,7 @@
     </w:p>
     <w:p>
       <w:r>
-        <w:t>Do Mininet/OVS thong dung khong luon ho tro label switching native, project dung forwarding tuong duong bang static route. Traceroute va ping chung minh goi tin di qua CE/PE/P that.</w:t>
+        <w:t>Project da cau hinh Linux kernel MPLS native trong cac namespace PE/P. Ingress PE dung ip route encap mpls de push label, P router dung ip -f mpls route de swap label, egress PE pop label ve CE. Trong lab nay label duoc gan tinh bang Python de de kiem soat va demo; day la LSP tinh, khong phai LDP dong.</w:t>
       </w:r>
     </w:p>
     <w:p>
@@ -1608,7 +1869,7 @@
     </w:p>
     <w:p>
       <w:r>
-        <w:t>Lab chay tren mot may ao nen ket qua phu thuoc CPU, kernel, OVS va tai he thong. Mo hinh MPLS la MPLS-like forwarding neu moi truong khong ho tro MPLS native.</w:t>
+        <w:t>Lab chay tren mot may ao nen ket qua phu thuoc CPU, kernel, OVS va tai he thong. MPLS native yeu cau kernel co module mpls_router va mpls_iptunnel.</w:t>
       </w:r>
     </w:p>
     <w:p>

</xml_diff>

<commit_message>
Update project structure, add chapter 5 and prepare for final submission
</commit_message>
<xml_diff>
--- a/Metro_Ethernet_MPLS_Project/report/Bao_cao_Metro_Ethernet_MPLS_Mininet.docx
+++ b/Metro_Ethernet_MPLS_Project/report/Bao_cao_Metro_Ethernet_MPLS_Mininet.docx
@@ -389,7 +389,7 @@
     </w:p>
     <w:p>
       <w:r>
-        <w:t>Branch 3 co 4 leaf, 2 spine va CE. Cac leaf ket noi day du den 2 spine; OVS STP duoc bat de topology du phong L2 chay on dinh.</w:t>
+        <w:t>Branch 3 co 4 leaf, 2 spine va CE. Trong lab nay topology duoc giu loop-free de OVS khoi dong on dinh, tap trung vao kiem thu forwarding/MPLS thay vi hoi tu STP.</w:t>
       </w:r>
     </w:p>
     <w:p>
@@ -529,7 +529,7 @@
     </w:p>
     <w:p>
       <w:r>
-        <w:t>Mode MPLS su dung Linux kernel MPLS that: PE dau vao push label, P router swap label, egress PE pop label roi chuyen tiep IP ve CE. Bang chung cau hinh nam trong results/mpls_routes.txt va goi MPLS bat bang tcpdump nam trong results/tcpdump_mpls.txt.</w:t>
+        <w:t>Mode MPLS su dung Linux kernel MPLS that: FRRouting OSPF/LDP tao route loopback PE/P va label dong; traffic CE lien chi nhanh di qua service VPLS/L2VPN. Data-plane L2VPN trong Mininet dung full-mesh Linux GRETAP pseudowire co split-horizon/port-isolation tren underlay MPLS de co the kiem chung bang ping va tcpdump. Bang chung cau hinh nam trong results/mpls_routes.txt va goi MPLS bat bang tcpdump nam trong results/tcpdump_mpls.txt.</w:t>
       </w:r>
     </w:p>
     <w:p>
@@ -542,7 +542,7 @@
     </w:p>
     <w:p>
       <w:r>
-        <w:t>Trich xuat bang route MPLS that tren PE/P. Cac dong `encap mpls` the hien push label tren PE; cac dong `as to` the hien swap label tren P.</w:t>
+        <w:t>Trich xuat bang route MPLS that tren PE/P. Cac dong `encap mpls`, `proto ldp` va `as to` the hien label switching dong trong backbone.</w:t>
       </w:r>
     </w:p>
     <w:p>
@@ -553,24 +553,56 @@
         </w:rPr>
         <w:t>===== pe1: ip route show =====</w:t>
         <w:br/>
-        <w:t xml:space="preserve">10.1.0.0/24 via 172.16.1.2 dev pe1-eth0 </w:t>
+        <w:t xml:space="preserve">2.2.2.2 nhid 56  encap mpls  20 via 172.20.11.2 dev pe1-eth1 proto ospf metric 20 </w:t>
         <w:br/>
-        <w:t xml:space="preserve">10.2.0.0/24  encap mpls  120 via 172.20.13.2 dev pe1-eth2 </w:t>
+        <w:t xml:space="preserve">3.3.3.3 nhid 38  encap mpls  24 via 172.20.11.2 dev pe1-eth1 proto ospf metric 20 </w:t>
         <w:br/>
-        <w:t xml:space="preserve">10.3.0.0/24  encap mpls  130 via 172.20.11.2 dev pe1-eth1 </w:t>
+        <w:t xml:space="preserve">11.11.11.11 nhid 25 via 172.20.11.2 dev pe1-eth1 proto ospf metric 20 </w:t>
         <w:br/>
-        <w:t xml:space="preserve">172.16.1.0/30 dev pe1-eth0 proto kernel scope link src 172.16.1.1 </w:t>
+        <w:t xml:space="preserve">22.22.22.22 nhid 39  encap mpls  25 via 172.20.11.2 dev pe1-eth1 proto ospf metric 20 </w:t>
+        <w:br/>
+        <w:t xml:space="preserve">33.33.33.33 nhid 29 via 172.20.13.2 dev pe1-eth2 proto ospf metric 20 </w:t>
+        <w:br/>
+        <w:t xml:space="preserve">44.44.44.44 nhid 57  encap mpls  21 via 172.20.11.2 dev pe1-eth1 proto ospf metric 20 </w:t>
         <w:br/>
         <w:t xml:space="preserve">172.20.11.0/30 dev pe1-eth1 proto kernel scope link src 172.20.11.1 </w:t>
         <w:br/>
+        <w:t xml:space="preserve">172.20.12.0/30 nhid 25 via 172.20.11.2 dev pe1-eth1 proto ospf metric 20 </w:t>
+        <w:br/>
         <w:t xml:space="preserve">172.20.13.0/30 dev pe1-eth2 proto kernel scope link src 172.20.13.1 </w:t>
+        <w:br/>
+        <w:t xml:space="preserve">172.20.23.0/30 nhid 29 via 172.20.13.2 dev pe1-eth2 proto ospf metric 20 </w:t>
+        <w:br/>
+        <w:t xml:space="preserve">172.20.24.0/30 nhid 58  encap mpls  22 via 172.20.11.2 dev pe1-eth1 proto ospf metric 20 </w:t>
+        <w:br/>
+        <w:t xml:space="preserve">172.20.32.0/30 nhid 40  encap mpls  26 via 172.20.11.2 dev pe1-eth1 proto ospf metric 20 </w:t>
+        <w:br/>
+        <w:t xml:space="preserve">172.20.34.0/30 nhid 42  encap mpls  23 via 172.20.11.2 dev pe1-eth1 proto ospf metric 20 </w:t>
         <w:br/>
         <w:br/>
         <w:t>===== pe1: ip -f mpls route show =====</w:t>
         <w:br/>
-        <w:t xml:space="preserve">211 via inet 172.16.1.2 dev pe1-eth0 </w:t>
+        <w:t xml:space="preserve">18 via inet 172.20.11.2 dev pe1-eth1 proto ldp </w:t>
         <w:br/>
-        <w:t xml:space="preserve">312 via inet 172.16.1.2 dev pe1-eth0 </w:t>
+        <w:t xml:space="preserve">19 via inet 172.20.13.2 dev pe1-eth2 proto ldp </w:t>
+        <w:br/>
+        <w:t xml:space="preserve">20 via inet 172.20.11.2 dev pe1-eth1 proto ldp </w:t>
+        <w:br/>
+        <w:t xml:space="preserve">21 via inet 172.20.13.2 dev pe1-eth2 proto ldp </w:t>
+        <w:br/>
+        <w:t xml:space="preserve">22 as to 20 via inet 172.20.11.2 dev pe1-eth1 proto ldp </w:t>
+        <w:br/>
+        <w:t xml:space="preserve">23 as to 21 via inet 172.20.11.2 dev pe1-eth1 proto ldp </w:t>
+        <w:br/>
+        <w:t xml:space="preserve">24 as to 22 via inet 172.20.11.2 dev pe1-eth1 proto ldp </w:t>
+        <w:br/>
+        <w:t xml:space="preserve">25 as to 23 via inet 172.20.11.2 dev pe1-eth1 proto ldp </w:t>
+        <w:br/>
+        <w:t xml:space="preserve">26 as to 24 via inet 172.20.11.2 dev pe1-eth1 proto ldp </w:t>
+        <w:br/>
+        <w:t xml:space="preserve">27 as to 25 via inet 172.20.11.2 dev pe1-eth1 proto ldp </w:t>
+        <w:br/>
+        <w:t xml:space="preserve">28 as to 26 via inet 172.20.11.2 dev pe1-eth1 proto ldp </w:t>
         <w:br/>
         <w:br/>
         <w:t>===== pe1: sysctl net.mpls.platform_labels =====</w:t>
@@ -580,38 +612,9 @@
         <w:br/>
         <w:t>===== pe2: ip route show =====</w:t>
         <w:br/>
-        <w:t xml:space="preserve">10.1.0.0/24  encap mpls  210 via 172.20.23.2 dev pe2-eth1 </w:t>
+        <w:t xml:space="preserve">1.1.1.1 nhid 33  encap mpls  16 via 172.20.23.2 dev pe2-eth1 proto ospf metric 20 </w:t>
         <w:br/>
-        <w:t xml:space="preserve">10.2.0.0/24 via 172.16.2.2 dev pe2-eth0 </w:t>
-        <w:br/>
-        <w:t xml:space="preserve">10.3.0.0/24  encap mpls  230 via 172.20.24.2 dev pe2-eth2 </w:t>
-        <w:br/>
-        <w:t xml:space="preserve">172.16.2.0/30 dev pe2-eth0 proto kernel scope link src 172.16.2.1 </w:t>
-        <w:br/>
-        <w:t xml:space="preserve">172.20.23.0/30 dev pe2-eth1 proto kernel scope link src 172.20.23.1 </w:t>
-        <w:br/>
-        <w:t xml:space="preserve">172.20.24.0/30 dev pe2-eth2 proto kernel scope link src 172.20.24.1 </w:t>
-        <w:br/>
-        <w:br/>
-        <w:t>===== pe2: ip -f mpls route show =====</w:t>
-        <w:br/>
-        <w:t xml:space="preserve">121 via inet 172.16.2.2 dev pe2-eth0 </w:t>
-        <w:br/>
-        <w:t xml:space="preserve">321 via inet 172.16.2.2 dev pe2-eth0 </w:t>
-        <w:br/>
-        <w:br/>
-        <w:t>===== pe2: sysctl net.mpls.platform_labels =====</w:t>
-        <w:br/>
-        <w:t>net.mpls.platform_labels = 100000</w:t>
-        <w:br/>
-        <w:br/>
-        <w:t>===== pe3: ip route show =====</w:t>
-        <w:br/>
-        <w:t xml:space="preserve">10.1.0.0/24  encap mpls  310 via 172.20.32.2 dev pe3-eth1 </w:t>
-        <w:br/>
-        <w:t xml:space="preserve">10.2.0.0/24  encap mpls  320 via 172.20.34.2 dev pe3-eth2 </w:t>
-        <w:br/>
-        <w:t xml:space="preserve">10.3.0.0/24 via 172.16.3.2 dev pe3-eth0 </w:t>
+        <w:t xml:space="preserve">3.3.3.3 nhid 51  encap mpls  24 via 172.20.23.2 dev pe2-eth1 proto ospf metric 20 </w:t>
       </w:r>
     </w:p>
     <w:p>
@@ -635,91 +638,92 @@
         </w:rPr>
         <w:t>tcpdump: listening on p3-eth0, link-type EN10MB (Ethernet), snapshot length 262144 bytes</w:t>
         <w:br/>
-        <w:t>16:06:01.354230 ca:ec:7c:b9:a5:b1 &gt; 00:00:00:00:00:10, ethertype MPLS unicast (0x8847), length 102: MPLS (label 120, tc 0, [S], ttl 62)</w:t>
+        <w:t>20:29:19.119120 00:00:00:00:00:10 &gt; ba:6d:0d:55:ca:63, ethertype MPLS unicast (0x8847), length 116: MPLS (label 26, tc 0, [S], ttl 63)</w:t>
         <w:br/>
         <w:tab/>
-        <w:t>(tos 0x0, ttl 62, id 10706, offset 0, flags [DF], proto ICMP (1), length 84)</w:t>
+        <w:t>(tos 0x0, ttl 64, id 3000, offset 0, flags [DF], proto GRE (47), length 98)</w:t>
         <w:br/>
-        <w:t xml:space="preserve">    10.1.0.11 &gt; 10.2.0.21: ICMP echo request, id 14231, seq 1, length 64</w:t>
+        <w:t xml:space="preserve">    2.2.2.2 &gt; 3.3.3.3: GREv0, Flags [key present], key=0x64, proto TEB (0x6558), length 78</w:t>
         <w:br/>
         <w:tab/>
-        <w:t>0x0000:  0000 0000 0010 caec 7cb9 a5b1 8847 0007  ........|....G..</w:t>
+        <w:t>56:00:c8:a7:ed:0a &gt; 33:33:00:00:00:02, ethertype IPv6 (0x86dd), length 70: (hlim 255, next-header ICMPv6 (58) payload length: 16) fe80::5400:c8ff:fea7:ed0a &gt; ff02::2: [icmp6 sum ok] ICMP6, router solicitation, length 16</w:t>
         <w:br/>
         <w:tab/>
-        <w:t>0x0010:  813e 4500 0054 29d2 4000 3e01 feb4 0a01  .&gt;E..T).@.&gt;.....</w:t>
+        <w:t xml:space="preserve">  source link-address option (1), length 8 (1): 56:00:c8:a7:ed:0a</w:t>
         <w:br/>
         <w:tab/>
-        <w:t>0x0020:  000b 0a02 0015 0800 b62c 3797 0001 f9b2  .........,7.....</w:t>
+        <w:t xml:space="preserve">    0x0000:  5600 c8a7 ed0a</w:t>
         <w:br/>
         <w:tab/>
-        <w:t>0x0030:  f969 0000 0000 534b 0500 0000 0000 1011  .i....SK........</w:t>
+        <w:t>0x0000:  ba6d 0d55 ca63 0000 0000 0010 8847 0001  .m.U.c.......G..</w:t>
         <w:br/>
         <w:tab/>
-        <w:t>0x0040:  1213 1415 1617 1819 1a1b 1c1d 1e1f 2021  ...............!</w:t>
+        <w:t>0x0010:  a13f 4500 0062 0bb8 4000 402f 24ac 0202  .?E..b..@.@/$...</w:t>
         <w:br/>
         <w:tab/>
-        <w:t>0x0050:  2223 2425 2627 2829 2a2b 2c2d 2e2f 3031  "#$%&amp;'()*+,-./01</w:t>
+        <w:t>0x0020:  0202 0303 0303 2000 6558 0000 0064 3333  ........eX...d33</w:t>
         <w:br/>
         <w:tab/>
-        <w:t>0x0060:  3233 3435 3637                           234567</w:t>
-        <w:br/>
-        <w:t>16:06:01.376249 00:00:00:00:00:10 &gt; ca:ec:7c:b9:a5:b1, ethertype MPLS unicast (0x8847), length 102: MPLS (label 211, tc 0, [S], ttl 61)</w:t>
+        <w:t>0x0030:  0000 0002 5600 c8a7 ed0a 86dd 6000 0000  ....V.......`...</w:t>
         <w:br/>
         <w:tab/>
-        <w:t>(tos 0x0, ttl 62, id 8898, offset 0, flags [none], proto ICMP (1), length 84)</w:t>
-        <w:br/>
-        <w:t xml:space="preserve">    10.2.0.21 &gt; 10.1.0.11: ICMP echo reply, id 14231, seq 1, length 64</w:t>
+        <w:t>0x0040:  0010 3aff fe80 0000 0000 0000 5400 c8ff  ..:.........T...</w:t>
         <w:br/>
         <w:tab/>
-        <w:t>0x0000:  caec 7cb9 a5b1 0000 0000 0010 8847 000d  ..|..........G..</w:t>
+        <w:t>0x0050:  fea7 ed0a ff02 0000 0000 0000 0000 0000  ................</w:t>
         <w:br/>
         <w:tab/>
-        <w:t>0x0010:  313d 4500 0054 22c2 0000 3e01 45c5 0a02  1=E..T"...&gt;.E...</w:t>
+        <w:t>0x0060:  0000 0002 8500 67c8 0000 0000 0101 5600  ......g.......V.</w:t>
         <w:br/>
         <w:tab/>
-        <w:t>0x0020:  0015 0a01 000b 0000 be2c 3797 0001 f9b2  .........,7.....</w:t>
+        <w:t>0x0070:  c8a7 ed0a                                ....</w:t>
+        <w:br/>
+        <w:t>20:29:19.120084 00:00:00:00:00:10 &gt; ba:6d:0d:55:ca:63, ethertype MPLS unicast (0x8847), length 116: MPLS (label 26, tc 0, [S], ttl 63)</w:t>
         <w:br/>
         <w:tab/>
-        <w:t>0x0030:  f969 0000 0000 534b 0500 0000 0000 1011  .i....SK........</w:t>
+        <w:t>(tos 0x0, ttl 64, id 3001, offset 0, flags [DF], proto GRE (47), length 98)</w:t>
+        <w:br/>
+        <w:t xml:space="preserve">    2.2.2.2 &gt; 3.3.3.3: GREv0, Flags [key present], key=0x64, proto TEB (0x6558), length 78</w:t>
         <w:br/>
         <w:tab/>
-        <w:t>0x0040:  1213 1415 1617 1819 1a1b 1c1d 1e1f 2021  ...............!</w:t>
+        <w:t>00:00:00:00:00:13 &gt; 33:33:00:00:00:02, ethertype IPv6 (0x86dd), length 70: (hlim 255, next-header ICMPv6 (58) payload length: 16) fe80::200:ff:fe00:13 &gt; ff02::2: [icmp6 sum ok] ICMP6, router solicitation, length 16</w:t>
         <w:br/>
         <w:tab/>
-        <w:t>0x0050:  2223 2425 2627 2829 2a2b 2c2d 2e2f 3031  "#$%&amp;'()*+,-./01</w:t>
+        <w:t xml:space="preserve">  source link-address option (1), length 8 (1): 00:00:00:00:00:13</w:t>
         <w:br/>
         <w:tab/>
-        <w:t>0x0060:  3233 3435 3637                           234567</w:t>
-        <w:br/>
-        <w:t>16:06:01.555329 ca:ec:7c:b9:a5:b1 &gt; 00:00:00:00:00:10, ethertype MPLS unicast (0x8847), length 102: MPLS (label 120, tc 0, [S], ttl 62)</w:t>
+        <w:t xml:space="preserve">    0x0000:  0000 0000 0013</w:t>
         <w:br/>
         <w:tab/>
-        <w:t>(tos 0x0, ttl 62, id 10784, offset 0, flags [DF], proto ICMP (1), length 84)</w:t>
-        <w:br/>
-        <w:t xml:space="preserve">    10.1.0.11 &gt; 10.2.0.21: ICMP echo request, id 14231, seq 2, length 64</w:t>
+        <w:t>0x0000:  ba6d 0d55 ca63 0000 0000 0010 8847 0001  .m.U.c.......G..</w:t>
         <w:br/>
         <w:tab/>
-        <w:t>0x0000:  0000 0000 0010 caec 7cb9 a5b1 8847 0007  ........|....G..</w:t>
+        <w:t>0x0010:  a13f 4500 0062 0bb9 4000 402f 24ab 0202  .?E..b..@.@/$...</w:t>
         <w:br/>
         <w:tab/>
-        <w:t>0x0010:  813e 4500 0054 2a20 4000 3e01 fe66 0a01  .&gt;E..T*.@.&gt;..f..</w:t>
+        <w:t>0x0020:  0202 0303 0303 2000 6558 0000 0064 3333  ........eX...d33</w:t>
         <w:br/>
         <w:tab/>
-        <w:t>0x0020:  000b 0a02 0015 0800 d21a 3797 0002 f9b2  ..........7.....</w:t>
+        <w:t>0x0030:  0000 0002 0000 0000 0013 86dd 6000 0000  ............`...</w:t>
         <w:br/>
         <w:tab/>
-        <w:t>0x0030:  f969 0000 0000 345c 0800 0000 0000 1011  .i....4\........</w:t>
+        <w:t>0x0040:  0010 3aff fe80 0000 0000 0000 0200 00ff  ..:.............</w:t>
         <w:br/>
         <w:tab/>
-        <w:t>0x0040:  1213 1415 1617 1819 1a1b 1c1d 1e1f 2021  ...............!</w:t>
+        <w:t>0x0050:  fe00 0013 ff02 0000 0000 0000 0000 0000  ................</w:t>
         <w:br/>
         <w:tab/>
-        <w:t>0x0050:  2223 2425 2627 2829 2a2b 2c2d 2e2f 3031  "#$%&amp;'()*+,-./01</w:t>
+        <w:t>0x0060:  0000 0002 8500 7b08 0000 0000 0101 0000  ......{.........</w:t>
         <w:br/>
         <w:tab/>
-        <w:t>0x0060:  3233 3435 3637                           234567</w:t>
+        <w:t>0x0070:  0000 0013                                ....</w:t>
         <w:br/>
-        <w:t>16:06:01.577290 00:00:00:00:00:10 &gt; ca:ec:7c:b9:a5:b1, ethertype MPLS unicast (0x8847), length 102: MPLS (label 211, tc 0, [S], ttl 61)</w:t>
+        <w:t>20:29:19.638420 00:00:00:00:00:10 &gt; ba:6d:0d:55:ca:63, ethertype MPLS unicast (0x8847), length 88: MPLS (label 26, tc 0, [S], ttl 63)</w:t>
+        <w:br/>
+        <w:tab/>
+        <w:t>(tos 0xc0, ttl 64, id 27627, offset 0, flags [DF], proto UDP (17), length 70)</w:t>
+        <w:br/>
+        <w:t xml:space="preserve">    2.2.2.2.646 &gt; 3.3.3.3.646: [bad udp cksum 0x0a4d -&gt; 0x1987!] </w:t>
       </w:r>
     </w:p>
     <w:p>
@@ -745,7 +749,7 @@
     </w:p>
     <w:p>
       <w:r>
-        <w:t>Throughput do bang iperf3 TCP, jitter do bang iperf3 UDP, delay va packet loss do bang ping, duong di goi tin do bang traceroute.</w:t>
+        <w:t>Throughput do bang iperf3 TCP, jitter co ban do bang iperf3 UDP 10M, delay do bang ping, duong di goi tin do bang traceroute. Packet loss khi tai mang tang duoc do bang iperf3 UDP voi cac muc tai 5M, 20M, 50M, 80M va 120M.</w:t>
       </w:r>
     </w:p>
     <w:p>
@@ -758,7 +762,12 @@
     </w:p>
     <w:p>
       <w:r>
-        <w:t>Thoi gian kiem thu tu results.csv: 2026-05-05T16:06:06 den 2026-05-05T16:07:42.</w:t>
+        <w:t>Thoi gian kiem thu tu results.csv: 2026-05-05T20:29:23 den 2026-05-05T20:32:31.</w:t>
+      </w:r>
+    </w:p>
+    <w:p>
+      <w:r>
+        <w:t>Bang 1 gom cac phep do baseline giua tung cap host dai dien.</w:t>
       </w:r>
     </w:p>
     <w:tbl>
@@ -768,23 +777,25 @@
         <w:tblLook w:firstColumn="1" w:firstRow="1" w:lastColumn="0" w:lastRow="0" w:noHBand="0" w:noVBand="1" w:val="04A0"/>
       </w:tblPr>
       <w:tblGrid>
-        <w:gridCol w:w="720"/>
-        <w:gridCol w:w="720"/>
-        <w:gridCol w:w="720"/>
-        <w:gridCol w:w="720"/>
-        <w:gridCol w:w="720"/>
-        <w:gridCol w:w="720"/>
-        <w:gridCol w:w="720"/>
-        <w:gridCol w:w="720"/>
-        <w:gridCol w:w="720"/>
-        <w:gridCol w:w="720"/>
-        <w:gridCol w:w="720"/>
-        <w:gridCol w:w="720"/>
+        <w:gridCol w:w="617"/>
+        <w:gridCol w:w="617"/>
+        <w:gridCol w:w="617"/>
+        <w:gridCol w:w="617"/>
+        <w:gridCol w:w="617"/>
+        <w:gridCol w:w="617"/>
+        <w:gridCol w:w="617"/>
+        <w:gridCol w:w="617"/>
+        <w:gridCol w:w="617"/>
+        <w:gridCol w:w="617"/>
+        <w:gridCol w:w="617"/>
+        <w:gridCol w:w="617"/>
+        <w:gridCol w:w="617"/>
+        <w:gridCol w:w="617"/>
       </w:tblGrid>
       <w:tr>
         <w:tc>
           <w:tcPr>
-            <w:tcW w:type="dxa" w:w="720"/>
+            <w:tcW w:type="dxa" w:w="617"/>
           </w:tcPr>
           <w:p>
             <w:r>
@@ -794,7 +805,7 @@
         </w:tc>
         <w:tc>
           <w:tcPr>
-            <w:tcW w:type="dxa" w:w="720"/>
+            <w:tcW w:type="dxa" w:w="617"/>
           </w:tcPr>
           <w:p>
             <w:r>
@@ -804,7 +815,27 @@
         </w:tc>
         <w:tc>
           <w:tcPr>
-            <w:tcW w:type="dxa" w:w="720"/>
+            <w:tcW w:type="dxa" w:w="617"/>
+          </w:tcPr>
+          <w:p>
+            <w:r>
+              <w:t>test_type</w:t>
+            </w:r>
+          </w:p>
+        </w:tc>
+        <w:tc>
+          <w:tcPr>
+            <w:tcW w:type="dxa" w:w="617"/>
+          </w:tcPr>
+          <w:p>
+            <w:r>
+              <w:t>load_mbps</w:t>
+            </w:r>
+          </w:p>
+        </w:tc>
+        <w:tc>
+          <w:tcPr>
+            <w:tcW w:type="dxa" w:w="617"/>
           </w:tcPr>
           <w:p>
             <w:r>
@@ -814,7 +845,7 @@
         </w:tc>
         <w:tc>
           <w:tcPr>
-            <w:tcW w:type="dxa" w:w="720"/>
+            <w:tcW w:type="dxa" w:w="617"/>
           </w:tcPr>
           <w:p>
             <w:r>
@@ -824,7 +855,7 @@
         </w:tc>
         <w:tc>
           <w:tcPr>
-            <w:tcW w:type="dxa" w:w="720"/>
+            <w:tcW w:type="dxa" w:w="617"/>
           </w:tcPr>
           <w:p>
             <w:r>
@@ -834,7 +865,7 @@
         </w:tc>
         <w:tc>
           <w:tcPr>
-            <w:tcW w:type="dxa" w:w="720"/>
+            <w:tcW w:type="dxa" w:w="617"/>
           </w:tcPr>
           <w:p>
             <w:r>
@@ -844,7 +875,7 @@
         </w:tc>
         <w:tc>
           <w:tcPr>
-            <w:tcW w:type="dxa" w:w="720"/>
+            <w:tcW w:type="dxa" w:w="617"/>
           </w:tcPr>
           <w:p>
             <w:r>
@@ -854,7 +885,7 @@
         </w:tc>
         <w:tc>
           <w:tcPr>
-            <w:tcW w:type="dxa" w:w="720"/>
+            <w:tcW w:type="dxa" w:w="617"/>
           </w:tcPr>
           <w:p>
             <w:r>
@@ -864,7 +895,7 @@
         </w:tc>
         <w:tc>
           <w:tcPr>
-            <w:tcW w:type="dxa" w:w="720"/>
+            <w:tcW w:type="dxa" w:w="617"/>
           </w:tcPr>
           <w:p>
             <w:r>
@@ -874,7 +905,7 @@
         </w:tc>
         <w:tc>
           <w:tcPr>
-            <w:tcW w:type="dxa" w:w="720"/>
+            <w:tcW w:type="dxa" w:w="617"/>
           </w:tcPr>
           <w:p>
             <w:r>
@@ -884,7 +915,7 @@
         </w:tc>
         <w:tc>
           <w:tcPr>
-            <w:tcW w:type="dxa" w:w="720"/>
+            <w:tcW w:type="dxa" w:w="617"/>
           </w:tcPr>
           <w:p>
             <w:r>
@@ -894,7 +925,7 @@
         </w:tc>
         <w:tc>
           <w:tcPr>
-            <w:tcW w:type="dxa" w:w="720"/>
+            <w:tcW w:type="dxa" w:w="617"/>
           </w:tcPr>
           <w:p>
             <w:r>
@@ -906,17 +937,17 @@
       <w:tr>
         <w:tc>
           <w:tcPr>
-            <w:tcW w:type="dxa" w:w="720"/>
+            <w:tcW w:type="dxa" w:w="617"/>
           </w:tcPr>
           <w:p>
             <w:r>
-              <w:t>2026-05-05T16:06:06</w:t>
+              <w:t>2026-05-05T20:29:23</w:t>
             </w:r>
           </w:p>
         </w:tc>
         <w:tc>
           <w:tcPr>
-            <w:tcW w:type="dxa" w:w="720"/>
+            <w:tcW w:type="dxa" w:w="617"/>
           </w:tcPr>
           <w:p>
             <w:r>
@@ -926,7 +957,25 @@
         </w:tc>
         <w:tc>
           <w:tcPr>
-            <w:tcW w:type="dxa" w:w="720"/>
+            <w:tcW w:type="dxa" w:w="617"/>
+          </w:tcPr>
+          <w:p>
+            <w:r>
+              <w:t>baseline</w:t>
+            </w:r>
+          </w:p>
+        </w:tc>
+        <w:tc>
+          <w:tcPr>
+            <w:tcW w:type="dxa" w:w="617"/>
+          </w:tcPr>
+          <w:p>
+            <w:r/>
+          </w:p>
+        </w:tc>
+        <w:tc>
+          <w:tcPr>
+            <w:tcW w:type="dxa" w:w="617"/>
           </w:tcPr>
           <w:p>
             <w:r>
@@ -936,7 +985,7 @@
         </w:tc>
         <w:tc>
           <w:tcPr>
-            <w:tcW w:type="dxa" w:w="720"/>
+            <w:tcW w:type="dxa" w:w="617"/>
           </w:tcPr>
           <w:p>
             <w:r>
@@ -946,7 +995,7 @@
         </w:tc>
         <w:tc>
           <w:tcPr>
-            <w:tcW w:type="dxa" w:w="720"/>
+            <w:tcW w:type="dxa" w:w="617"/>
           </w:tcPr>
           <w:p>
             <w:r>
@@ -956,7 +1005,7 @@
         </w:tc>
         <w:tc>
           <w:tcPr>
-            <w:tcW w:type="dxa" w:w="720"/>
+            <w:tcW w:type="dxa" w:w="617"/>
           </w:tcPr>
           <w:p>
             <w:r>
@@ -966,27 +1015,27 @@
         </w:tc>
         <w:tc>
           <w:tcPr>
-            <w:tcW w:type="dxa" w:w="720"/>
+            <w:tcW w:type="dxa" w:w="617"/>
           </w:tcPr>
           <w:p>
             <w:r>
-              <w:t>55.089</w:t>
+              <w:t>0.208</w:t>
             </w:r>
           </w:p>
         </w:tc>
         <w:tc>
           <w:tcPr>
-            <w:tcW w:type="dxa" w:w="720"/>
+            <w:tcW w:type="dxa" w:w="617"/>
           </w:tcPr>
           <w:p>
             <w:r>
-              <w:t>33.485</w:t>
+              <w:t>33.325</w:t>
             </w:r>
           </w:p>
         </w:tc>
         <w:tc>
           <w:tcPr>
-            <w:tcW w:type="dxa" w:w="720"/>
+            <w:tcW w:type="dxa" w:w="617"/>
           </w:tcPr>
           <w:p>
             <w:r>
@@ -996,17 +1045,17 @@
         </w:tc>
         <w:tc>
           <w:tcPr>
-            <w:tcW w:type="dxa" w:w="720"/>
+            <w:tcW w:type="dxa" w:w="617"/>
           </w:tcPr>
           <w:p>
             <w:r>
-              <w:t>0.135</w:t>
+              <w:t>0.127</w:t>
             </w:r>
           </w:p>
         </w:tc>
         <w:tc>
           <w:tcPr>
-            <w:tcW w:type="dxa" w:w="720"/>
+            <w:tcW w:type="dxa" w:w="617"/>
           </w:tcPr>
           <w:p>
             <w:r>
@@ -1016,7 +1065,7 @@
         </w:tc>
         <w:tc>
           <w:tcPr>
-            <w:tcW w:type="dxa" w:w="720"/>
+            <w:tcW w:type="dxa" w:w="617"/>
           </w:tcPr>
           <w:p>
             <w:r>
@@ -1028,17 +1077,17 @@
       <w:tr>
         <w:tc>
           <w:tcPr>
-            <w:tcW w:type="dxa" w:w="720"/>
+            <w:tcW w:type="dxa" w:w="617"/>
           </w:tcPr>
           <w:p>
             <w:r>
-              <w:t>2026-05-05T16:06:26</w:t>
+              <w:t>2026-05-05T20:29:41</w:t>
             </w:r>
           </w:p>
         </w:tc>
         <w:tc>
           <w:tcPr>
-            <w:tcW w:type="dxa" w:w="720"/>
+            <w:tcW w:type="dxa" w:w="617"/>
           </w:tcPr>
           <w:p>
             <w:r>
@@ -1048,7 +1097,25 @@
         </w:tc>
         <w:tc>
           <w:tcPr>
-            <w:tcW w:type="dxa" w:w="720"/>
+            <w:tcW w:type="dxa" w:w="617"/>
+          </w:tcPr>
+          <w:p>
+            <w:r>
+              <w:t>baseline</w:t>
+            </w:r>
+          </w:p>
+        </w:tc>
+        <w:tc>
+          <w:tcPr>
+            <w:tcW w:type="dxa" w:w="617"/>
+          </w:tcPr>
+          <w:p>
+            <w:r/>
+          </w:p>
+        </w:tc>
+        <w:tc>
+          <w:tcPr>
+            <w:tcW w:type="dxa" w:w="617"/>
           </w:tcPr>
           <w:p>
             <w:r>
@@ -1058,7 +1125,7 @@
         </w:tc>
         <w:tc>
           <w:tcPr>
-            <w:tcW w:type="dxa" w:w="720"/>
+            <w:tcW w:type="dxa" w:w="617"/>
           </w:tcPr>
           <w:p>
             <w:r>
@@ -1068,7 +1135,7 @@
         </w:tc>
         <w:tc>
           <w:tcPr>
-            <w:tcW w:type="dxa" w:w="720"/>
+            <w:tcW w:type="dxa" w:w="617"/>
           </w:tcPr>
           <w:p>
             <w:r>
@@ -1078,7 +1145,7 @@
         </w:tc>
         <w:tc>
           <w:tcPr>
-            <w:tcW w:type="dxa" w:w="720"/>
+            <w:tcW w:type="dxa" w:w="617"/>
           </w:tcPr>
           <w:p>
             <w:r>
@@ -1088,27 +1155,27 @@
         </w:tc>
         <w:tc>
           <w:tcPr>
-            <w:tcW w:type="dxa" w:w="720"/>
+            <w:tcW w:type="dxa" w:w="617"/>
           </w:tcPr>
           <w:p>
             <w:r>
-              <w:t>45.723</w:t>
+              <w:t>0.208</w:t>
             </w:r>
           </w:p>
         </w:tc>
         <w:tc>
           <w:tcPr>
-            <w:tcW w:type="dxa" w:w="720"/>
+            <w:tcW w:type="dxa" w:w="617"/>
           </w:tcPr>
           <w:p>
             <w:r>
-              <w:t>39.758</w:t>
+              <w:t>39.618</w:t>
             </w:r>
           </w:p>
         </w:tc>
         <w:tc>
           <w:tcPr>
-            <w:tcW w:type="dxa" w:w="720"/>
+            <w:tcW w:type="dxa" w:w="617"/>
           </w:tcPr>
           <w:p>
             <w:r>
@@ -1118,17 +1185,17 @@
         </w:tc>
         <w:tc>
           <w:tcPr>
-            <w:tcW w:type="dxa" w:w="720"/>
+            <w:tcW w:type="dxa" w:w="617"/>
           </w:tcPr>
           <w:p>
             <w:r>
-              <w:t>0.118</w:t>
+              <w:t>0.138</w:t>
             </w:r>
           </w:p>
         </w:tc>
         <w:tc>
           <w:tcPr>
-            <w:tcW w:type="dxa" w:w="720"/>
+            <w:tcW w:type="dxa" w:w="617"/>
           </w:tcPr>
           <w:p>
             <w:r>
@@ -1138,7 +1205,7 @@
         </w:tc>
         <w:tc>
           <w:tcPr>
-            <w:tcW w:type="dxa" w:w="720"/>
+            <w:tcW w:type="dxa" w:w="617"/>
           </w:tcPr>
           <w:p>
             <w:r>
@@ -1150,17 +1217,17 @@
       <w:tr>
         <w:tc>
           <w:tcPr>
-            <w:tcW w:type="dxa" w:w="720"/>
+            <w:tcW w:type="dxa" w:w="617"/>
           </w:tcPr>
           <w:p>
             <w:r>
-              <w:t>2026-05-05T16:06:47</w:t>
+              <w:t>2026-05-05T20:29:59</w:t>
             </w:r>
           </w:p>
         </w:tc>
         <w:tc>
           <w:tcPr>
-            <w:tcW w:type="dxa" w:w="720"/>
+            <w:tcW w:type="dxa" w:w="617"/>
           </w:tcPr>
           <w:p>
             <w:r>
@@ -1170,7 +1237,25 @@
         </w:tc>
         <w:tc>
           <w:tcPr>
-            <w:tcW w:type="dxa" w:w="720"/>
+            <w:tcW w:type="dxa" w:w="617"/>
+          </w:tcPr>
+          <w:p>
+            <w:r>
+              <w:t>baseline</w:t>
+            </w:r>
+          </w:p>
+        </w:tc>
+        <w:tc>
+          <w:tcPr>
+            <w:tcW w:type="dxa" w:w="617"/>
+          </w:tcPr>
+          <w:p>
+            <w:r/>
+          </w:p>
+        </w:tc>
+        <w:tc>
+          <w:tcPr>
+            <w:tcW w:type="dxa" w:w="617"/>
           </w:tcPr>
           <w:p>
             <w:r>
@@ -1180,7 +1265,7 @@
         </w:tc>
         <w:tc>
           <w:tcPr>
-            <w:tcW w:type="dxa" w:w="720"/>
+            <w:tcW w:type="dxa" w:w="617"/>
           </w:tcPr>
           <w:p>
             <w:r>
@@ -1190,7 +1275,7 @@
         </w:tc>
         <w:tc>
           <w:tcPr>
-            <w:tcW w:type="dxa" w:w="720"/>
+            <w:tcW w:type="dxa" w:w="617"/>
           </w:tcPr>
           <w:p>
             <w:r>
@@ -1200,7 +1285,7 @@
         </w:tc>
         <w:tc>
           <w:tcPr>
-            <w:tcW w:type="dxa" w:w="720"/>
+            <w:tcW w:type="dxa" w:w="617"/>
           </w:tcPr>
           <w:p>
             <w:r>
@@ -1210,27 +1295,27 @@
         </w:tc>
         <w:tc>
           <w:tcPr>
-            <w:tcW w:type="dxa" w:w="720"/>
+            <w:tcW w:type="dxa" w:w="617"/>
           </w:tcPr>
           <w:p>
             <w:r>
-              <w:t>54.891</w:t>
+              <w:t>0.208</w:t>
             </w:r>
           </w:p>
         </w:tc>
         <w:tc>
           <w:tcPr>
-            <w:tcW w:type="dxa" w:w="720"/>
+            <w:tcW w:type="dxa" w:w="617"/>
           </w:tcPr>
           <w:p>
             <w:r>
-              <w:t>36.083</w:t>
+              <w:t>35.591</w:t>
             </w:r>
           </w:p>
         </w:tc>
         <w:tc>
           <w:tcPr>
-            <w:tcW w:type="dxa" w:w="720"/>
+            <w:tcW w:type="dxa" w:w="617"/>
           </w:tcPr>
           <w:p>
             <w:r>
@@ -1240,17 +1325,17 @@
         </w:tc>
         <w:tc>
           <w:tcPr>
-            <w:tcW w:type="dxa" w:w="720"/>
+            <w:tcW w:type="dxa" w:w="617"/>
           </w:tcPr>
           <w:p>
             <w:r>
-              <w:t>0.117</w:t>
+              <w:t>0.231</w:t>
             </w:r>
           </w:p>
         </w:tc>
         <w:tc>
           <w:tcPr>
-            <w:tcW w:type="dxa" w:w="720"/>
+            <w:tcW w:type="dxa" w:w="617"/>
           </w:tcPr>
           <w:p>
             <w:r>
@@ -1260,7 +1345,7 @@
         </w:tc>
         <w:tc>
           <w:tcPr>
-            <w:tcW w:type="dxa" w:w="720"/>
+            <w:tcW w:type="dxa" w:w="617"/>
           </w:tcPr>
           <w:p>
             <w:r>
@@ -1272,17 +1357,17 @@
       <w:tr>
         <w:tc>
           <w:tcPr>
-            <w:tcW w:type="dxa" w:w="720"/>
+            <w:tcW w:type="dxa" w:w="617"/>
           </w:tcPr>
           <w:p>
             <w:r>
-              <w:t>2026-05-05T16:07:07</w:t>
+              <w:t>2026-05-05T20:30:16</w:t>
             </w:r>
           </w:p>
         </w:tc>
         <w:tc>
           <w:tcPr>
-            <w:tcW w:type="dxa" w:w="720"/>
+            <w:tcW w:type="dxa" w:w="617"/>
           </w:tcPr>
           <w:p>
             <w:r>
@@ -1292,7 +1377,25 @@
         </w:tc>
         <w:tc>
           <w:tcPr>
-            <w:tcW w:type="dxa" w:w="720"/>
+            <w:tcW w:type="dxa" w:w="617"/>
+          </w:tcPr>
+          <w:p>
+            <w:r>
+              <w:t>baseline</w:t>
+            </w:r>
+          </w:p>
+        </w:tc>
+        <w:tc>
+          <w:tcPr>
+            <w:tcW w:type="dxa" w:w="617"/>
+          </w:tcPr>
+          <w:p>
+            <w:r/>
+          </w:p>
+        </w:tc>
+        <w:tc>
+          <w:tcPr>
+            <w:tcW w:type="dxa" w:w="617"/>
           </w:tcPr>
           <w:p>
             <w:r>
@@ -1302,7 +1405,7 @@
         </w:tc>
         <w:tc>
           <w:tcPr>
-            <w:tcW w:type="dxa" w:w="720"/>
+            <w:tcW w:type="dxa" w:w="617"/>
           </w:tcPr>
           <w:p>
             <w:r>
@@ -1312,7 +1415,7 @@
         </w:tc>
         <w:tc>
           <w:tcPr>
-            <w:tcW w:type="dxa" w:w="720"/>
+            <w:tcW w:type="dxa" w:w="617"/>
           </w:tcPr>
           <w:p>
             <w:r>
@@ -1322,7 +1425,7 @@
         </w:tc>
         <w:tc>
           <w:tcPr>
-            <w:tcW w:type="dxa" w:w="720"/>
+            <w:tcW w:type="dxa" w:w="617"/>
           </w:tcPr>
           <w:p>
             <w:r>
@@ -1332,27 +1435,27 @@
         </w:tc>
         <w:tc>
           <w:tcPr>
-            <w:tcW w:type="dxa" w:w="720"/>
+            <w:tcW w:type="dxa" w:w="617"/>
           </w:tcPr>
           <w:p>
             <w:r>
-              <w:t>94.895</w:t>
+              <w:t>94.465</w:t>
             </w:r>
           </w:p>
         </w:tc>
         <w:tc>
           <w:tcPr>
-            <w:tcW w:type="dxa" w:w="720"/>
+            <w:tcW w:type="dxa" w:w="617"/>
           </w:tcPr>
           <w:p>
             <w:r>
-              <w:t>6.552</w:t>
+              <w:t>6.754</w:t>
             </w:r>
           </w:p>
         </w:tc>
         <w:tc>
           <w:tcPr>
-            <w:tcW w:type="dxa" w:w="720"/>
+            <w:tcW w:type="dxa" w:w="617"/>
           </w:tcPr>
           <w:p>
             <w:r>
@@ -1362,17 +1465,17 @@
         </w:tc>
         <w:tc>
           <w:tcPr>
-            <w:tcW w:type="dxa" w:w="720"/>
+            <w:tcW w:type="dxa" w:w="617"/>
           </w:tcPr>
           <w:p>
             <w:r>
-              <w:t>0.057</w:t>
+              <w:t>0.069</w:t>
             </w:r>
           </w:p>
         </w:tc>
         <w:tc>
           <w:tcPr>
-            <w:tcW w:type="dxa" w:w="720"/>
+            <w:tcW w:type="dxa" w:w="617"/>
           </w:tcPr>
           <w:p>
             <w:r>
@@ -1382,7 +1485,7 @@
         </w:tc>
         <w:tc>
           <w:tcPr>
-            <w:tcW w:type="dxa" w:w="720"/>
+            <w:tcW w:type="dxa" w:w="617"/>
           </w:tcPr>
           <w:p>
             <w:r>
@@ -1394,17 +1497,17 @@
       <w:tr>
         <w:tc>
           <w:tcPr>
-            <w:tcW w:type="dxa" w:w="720"/>
+            <w:tcW w:type="dxa" w:w="617"/>
           </w:tcPr>
           <w:p>
             <w:r>
-              <w:t>2026-05-05T16:07:24</w:t>
+              <w:t>2026-05-05T20:30:34</w:t>
             </w:r>
           </w:p>
         </w:tc>
         <w:tc>
           <w:tcPr>
-            <w:tcW w:type="dxa" w:w="720"/>
+            <w:tcW w:type="dxa" w:w="617"/>
           </w:tcPr>
           <w:p>
             <w:r>
@@ -1414,7 +1517,25 @@
         </w:tc>
         <w:tc>
           <w:tcPr>
-            <w:tcW w:type="dxa" w:w="720"/>
+            <w:tcW w:type="dxa" w:w="617"/>
+          </w:tcPr>
+          <w:p>
+            <w:r>
+              <w:t>baseline</w:t>
+            </w:r>
+          </w:p>
+        </w:tc>
+        <w:tc>
+          <w:tcPr>
+            <w:tcW w:type="dxa" w:w="617"/>
+          </w:tcPr>
+          <w:p>
+            <w:r/>
+          </w:p>
+        </w:tc>
+        <w:tc>
+          <w:tcPr>
+            <w:tcW w:type="dxa" w:w="617"/>
           </w:tcPr>
           <w:p>
             <w:r>
@@ -1424,7 +1545,7 @@
         </w:tc>
         <w:tc>
           <w:tcPr>
-            <w:tcW w:type="dxa" w:w="720"/>
+            <w:tcW w:type="dxa" w:w="617"/>
           </w:tcPr>
           <w:p>
             <w:r>
@@ -1434,7 +1555,7 @@
         </w:tc>
         <w:tc>
           <w:tcPr>
-            <w:tcW w:type="dxa" w:w="720"/>
+            <w:tcW w:type="dxa" w:w="617"/>
           </w:tcPr>
           <w:p>
             <w:r>
@@ -1444,7 +1565,7 @@
         </w:tc>
         <w:tc>
           <w:tcPr>
-            <w:tcW w:type="dxa" w:w="720"/>
+            <w:tcW w:type="dxa" w:w="617"/>
           </w:tcPr>
           <w:p>
             <w:r>
@@ -1454,27 +1575,27 @@
         </w:tc>
         <w:tc>
           <w:tcPr>
-            <w:tcW w:type="dxa" w:w="720"/>
+            <w:tcW w:type="dxa" w:w="617"/>
           </w:tcPr>
           <w:p>
             <w:r>
-              <w:t>94.324</w:t>
+              <w:t>93.875</w:t>
             </w:r>
           </w:p>
         </w:tc>
         <w:tc>
           <w:tcPr>
-            <w:tcW w:type="dxa" w:w="720"/>
+            <w:tcW w:type="dxa" w:w="617"/>
           </w:tcPr>
           <w:p>
             <w:r>
-              <w:t>13.005</w:t>
+              <w:t>13.074</w:t>
             </w:r>
           </w:p>
         </w:tc>
         <w:tc>
           <w:tcPr>
-            <w:tcW w:type="dxa" w:w="720"/>
+            <w:tcW w:type="dxa" w:w="617"/>
           </w:tcPr>
           <w:p>
             <w:r>
@@ -1484,17 +1605,17 @@
         </w:tc>
         <w:tc>
           <w:tcPr>
-            <w:tcW w:type="dxa" w:w="720"/>
+            <w:tcW w:type="dxa" w:w="617"/>
           </w:tcPr>
           <w:p>
             <w:r>
-              <w:t>0.098</w:t>
+              <w:t>0.245</w:t>
             </w:r>
           </w:p>
         </w:tc>
         <w:tc>
           <w:tcPr>
-            <w:tcW w:type="dxa" w:w="720"/>
+            <w:tcW w:type="dxa" w:w="617"/>
           </w:tcPr>
           <w:p>
             <w:r>
@@ -1504,7 +1625,7 @@
         </w:tc>
         <w:tc>
           <w:tcPr>
-            <w:tcW w:type="dxa" w:w="720"/>
+            <w:tcW w:type="dxa" w:w="617"/>
           </w:tcPr>
           <w:p>
             <w:r>
@@ -1516,17 +1637,17 @@
       <w:tr>
         <w:tc>
           <w:tcPr>
-            <w:tcW w:type="dxa" w:w="720"/>
+            <w:tcW w:type="dxa" w:w="617"/>
           </w:tcPr>
           <w:p>
             <w:r>
-              <w:t>2026-05-05T16:07:42</w:t>
+              <w:t>2026-05-05T20:30:51</w:t>
             </w:r>
           </w:p>
         </w:tc>
         <w:tc>
           <w:tcPr>
-            <w:tcW w:type="dxa" w:w="720"/>
+            <w:tcW w:type="dxa" w:w="617"/>
           </w:tcPr>
           <w:p>
             <w:r>
@@ -1536,7 +1657,25 @@
         </w:tc>
         <w:tc>
           <w:tcPr>
-            <w:tcW w:type="dxa" w:w="720"/>
+            <w:tcW w:type="dxa" w:w="617"/>
+          </w:tcPr>
+          <w:p>
+            <w:r>
+              <w:t>baseline</w:t>
+            </w:r>
+          </w:p>
+        </w:tc>
+        <w:tc>
+          <w:tcPr>
+            <w:tcW w:type="dxa" w:w="617"/>
+          </w:tcPr>
+          <w:p>
+            <w:r/>
+          </w:p>
+        </w:tc>
+        <w:tc>
+          <w:tcPr>
+            <w:tcW w:type="dxa" w:w="617"/>
           </w:tcPr>
           <w:p>
             <w:r>
@@ -1546,7 +1685,7 @@
         </w:tc>
         <w:tc>
           <w:tcPr>
-            <w:tcW w:type="dxa" w:w="720"/>
+            <w:tcW w:type="dxa" w:w="617"/>
           </w:tcPr>
           <w:p>
             <w:r>
@@ -1556,7 +1695,7 @@
         </w:tc>
         <w:tc>
           <w:tcPr>
-            <w:tcW w:type="dxa" w:w="720"/>
+            <w:tcW w:type="dxa" w:w="617"/>
           </w:tcPr>
           <w:p>
             <w:r>
@@ -1566,7 +1705,7 @@
         </w:tc>
         <w:tc>
           <w:tcPr>
-            <w:tcW w:type="dxa" w:w="720"/>
+            <w:tcW w:type="dxa" w:w="617"/>
           </w:tcPr>
           <w:p>
             <w:r>
@@ -1576,27 +1715,27 @@
         </w:tc>
         <w:tc>
           <w:tcPr>
-            <w:tcW w:type="dxa" w:w="720"/>
+            <w:tcW w:type="dxa" w:w="617"/>
           </w:tcPr>
           <w:p>
             <w:r>
-              <w:t>94.574</w:t>
+              <w:t>94.068</w:t>
             </w:r>
           </w:p>
         </w:tc>
         <w:tc>
           <w:tcPr>
-            <w:tcW w:type="dxa" w:w="720"/>
+            <w:tcW w:type="dxa" w:w="617"/>
           </w:tcPr>
           <w:p>
             <w:r>
-              <w:t>11.316</w:t>
+              <w:t>10.784</w:t>
             </w:r>
           </w:p>
         </w:tc>
         <w:tc>
           <w:tcPr>
-            <w:tcW w:type="dxa" w:w="720"/>
+            <w:tcW w:type="dxa" w:w="617"/>
           </w:tcPr>
           <w:p>
             <w:r>
@@ -1606,17 +1745,17 @@
         </w:tc>
         <w:tc>
           <w:tcPr>
-            <w:tcW w:type="dxa" w:w="720"/>
+            <w:tcW w:type="dxa" w:w="617"/>
           </w:tcPr>
           <w:p>
             <w:r>
-              <w:t>0.081</w:t>
+              <w:t>0.12</w:t>
             </w:r>
           </w:p>
         </w:tc>
         <w:tc>
           <w:tcPr>
-            <w:tcW w:type="dxa" w:w="720"/>
+            <w:tcW w:type="dxa" w:w="617"/>
           </w:tcPr>
           <w:p>
             <w:r>
@@ -1626,7 +1765,2225 @@
         </w:tc>
         <w:tc>
           <w:tcPr>
-            <w:tcW w:type="dxa" w:w="720"/>
+            <w:tcW w:type="dxa" w:w="617"/>
+          </w:tcPr>
+          <w:p>
+            <w:r>
+              <w:t>success</w:t>
+            </w:r>
+          </w:p>
+        </w:tc>
+      </w:tr>
+    </w:tbl>
+    <w:p>
+      <w:pPr>
+        <w:pStyle w:val="Heading2"/>
+      </w:pPr>
+      <w:r>
+        <w:t>15.1 Bang packet loss theo muc tai</w:t>
+      </w:r>
+    </w:p>
+    <w:p>
+      <w:r>
+        <w:t>Bang 2 ghi ket qua UDP packet loss sweep khi tang offered load tren cac cap lien chi nhanh.</w:t>
+      </w:r>
+    </w:p>
+    <w:tbl>
+      <w:tblPr>
+        <w:tblStyle w:val="TableGrid"/>
+        <w:tblW w:type="auto" w:w="0"/>
+        <w:tblLook w:firstColumn="1" w:firstRow="1" w:lastColumn="0" w:lastRow="0" w:noHBand="0" w:noVBand="1" w:val="04A0"/>
+      </w:tblPr>
+      <w:tblGrid>
+        <w:gridCol w:w="617"/>
+        <w:gridCol w:w="617"/>
+        <w:gridCol w:w="617"/>
+        <w:gridCol w:w="617"/>
+        <w:gridCol w:w="617"/>
+        <w:gridCol w:w="617"/>
+        <w:gridCol w:w="617"/>
+        <w:gridCol w:w="617"/>
+        <w:gridCol w:w="617"/>
+        <w:gridCol w:w="617"/>
+        <w:gridCol w:w="617"/>
+        <w:gridCol w:w="617"/>
+        <w:gridCol w:w="617"/>
+        <w:gridCol w:w="617"/>
+      </w:tblGrid>
+      <w:tr>
+        <w:tc>
+          <w:tcPr>
+            <w:tcW w:type="dxa" w:w="617"/>
+          </w:tcPr>
+          <w:p>
+            <w:r>
+              <w:t>timestamp</w:t>
+            </w:r>
+          </w:p>
+        </w:tc>
+        <w:tc>
+          <w:tcPr>
+            <w:tcW w:type="dxa" w:w="617"/>
+          </w:tcPr>
+          <w:p>
+            <w:r>
+              <w:t>mode</w:t>
+            </w:r>
+          </w:p>
+        </w:tc>
+        <w:tc>
+          <w:tcPr>
+            <w:tcW w:type="dxa" w:w="617"/>
+          </w:tcPr>
+          <w:p>
+            <w:r>
+              <w:t>test_type</w:t>
+            </w:r>
+          </w:p>
+        </w:tc>
+        <w:tc>
+          <w:tcPr>
+            <w:tcW w:type="dxa" w:w="617"/>
+          </w:tcPr>
+          <w:p>
+            <w:r>
+              <w:t>load_mbps</w:t>
+            </w:r>
+          </w:p>
+        </w:tc>
+        <w:tc>
+          <w:tcPr>
+            <w:tcW w:type="dxa" w:w="617"/>
+          </w:tcPr>
+          <w:p>
+            <w:r>
+              <w:t>source_branch</w:t>
+            </w:r>
+          </w:p>
+        </w:tc>
+        <w:tc>
+          <w:tcPr>
+            <w:tcW w:type="dxa" w:w="617"/>
+          </w:tcPr>
+          <w:p>
+            <w:r>
+              <w:t>destination_branch</w:t>
+            </w:r>
+          </w:p>
+        </w:tc>
+        <w:tc>
+          <w:tcPr>
+            <w:tcW w:type="dxa" w:w="617"/>
+          </w:tcPr>
+          <w:p>
+            <w:r>
+              <w:t>source_host</w:t>
+            </w:r>
+          </w:p>
+        </w:tc>
+        <w:tc>
+          <w:tcPr>
+            <w:tcW w:type="dxa" w:w="617"/>
+          </w:tcPr>
+          <w:p>
+            <w:r>
+              <w:t>destination_host</w:t>
+            </w:r>
+          </w:p>
+        </w:tc>
+        <w:tc>
+          <w:tcPr>
+            <w:tcW w:type="dxa" w:w="617"/>
+          </w:tcPr>
+          <w:p>
+            <w:r>
+              <w:t>throughput_mbps</w:t>
+            </w:r>
+          </w:p>
+        </w:tc>
+        <w:tc>
+          <w:tcPr>
+            <w:tcW w:type="dxa" w:w="617"/>
+          </w:tcPr>
+          <w:p>
+            <w:r>
+              <w:t>avg_delay_ms</w:t>
+            </w:r>
+          </w:p>
+        </w:tc>
+        <w:tc>
+          <w:tcPr>
+            <w:tcW w:type="dxa" w:w="617"/>
+          </w:tcPr>
+          <w:p>
+            <w:r>
+              <w:t>packet_loss_percent</w:t>
+            </w:r>
+          </w:p>
+        </w:tc>
+        <w:tc>
+          <w:tcPr>
+            <w:tcW w:type="dxa" w:w="617"/>
+          </w:tcPr>
+          <w:p>
+            <w:r>
+              <w:t>jitter_ms</w:t>
+            </w:r>
+          </w:p>
+        </w:tc>
+        <w:tc>
+          <w:tcPr>
+            <w:tcW w:type="dxa" w:w="617"/>
+          </w:tcPr>
+          <w:p>
+            <w:r>
+              <w:t>udp_packet_loss_percent</w:t>
+            </w:r>
+          </w:p>
+        </w:tc>
+        <w:tc>
+          <w:tcPr>
+            <w:tcW w:type="dxa" w:w="617"/>
+          </w:tcPr>
+          <w:p>
+            <w:r>
+              <w:t>note</w:t>
+            </w:r>
+          </w:p>
+        </w:tc>
+      </w:tr>
+      <w:tr>
+        <w:tc>
+          <w:tcPr>
+            <w:tcW w:type="dxa" w:w="617"/>
+          </w:tcPr>
+          <w:p>
+            <w:r>
+              <w:t>2026-05-05T20:31:15</w:t>
+            </w:r>
+          </w:p>
+        </w:tc>
+        <w:tc>
+          <w:tcPr>
+            <w:tcW w:type="dxa" w:w="617"/>
+          </w:tcPr>
+          <w:p>
+            <w:r>
+              <w:t>mpls</w:t>
+            </w:r>
+          </w:p>
+        </w:tc>
+        <w:tc>
+          <w:tcPr>
+            <w:tcW w:type="dxa" w:w="617"/>
+          </w:tcPr>
+          <w:p>
+            <w:r>
+              <w:t>udp_load_sweep</w:t>
+            </w:r>
+          </w:p>
+        </w:tc>
+        <w:tc>
+          <w:tcPr>
+            <w:tcW w:type="dxa" w:w="617"/>
+          </w:tcPr>
+          <w:p>
+            <w:r>
+              <w:t>5.0</w:t>
+            </w:r>
+          </w:p>
+        </w:tc>
+        <w:tc>
+          <w:tcPr>
+            <w:tcW w:type="dxa" w:w="617"/>
+          </w:tcPr>
+          <w:p>
+            <w:r>
+              <w:t>Branch1</w:t>
+            </w:r>
+          </w:p>
+        </w:tc>
+        <w:tc>
+          <w:tcPr>
+            <w:tcW w:type="dxa" w:w="617"/>
+          </w:tcPr>
+          <w:p>
+            <w:r>
+              <w:t>Branch2</w:t>
+            </w:r>
+          </w:p>
+        </w:tc>
+        <w:tc>
+          <w:tcPr>
+            <w:tcW w:type="dxa" w:w="617"/>
+          </w:tcPr>
+          <w:p>
+            <w:r>
+              <w:t>host1</w:t>
+            </w:r>
+          </w:p>
+        </w:tc>
+        <w:tc>
+          <w:tcPr>
+            <w:tcW w:type="dxa" w:w="617"/>
+          </w:tcPr>
+          <w:p>
+            <w:r>
+              <w:t>user1</w:t>
+            </w:r>
+          </w:p>
+        </w:tc>
+        <w:tc>
+          <w:tcPr>
+            <w:tcW w:type="dxa" w:w="617"/>
+          </w:tcPr>
+          <w:p>
+            <w:r/>
+          </w:p>
+        </w:tc>
+        <w:tc>
+          <w:tcPr>
+            <w:tcW w:type="dxa" w:w="617"/>
+          </w:tcPr>
+          <w:p>
+            <w:r/>
+          </w:p>
+        </w:tc>
+        <w:tc>
+          <w:tcPr>
+            <w:tcW w:type="dxa" w:w="617"/>
+          </w:tcPr>
+          <w:p>
+            <w:r/>
+          </w:p>
+        </w:tc>
+        <w:tc>
+          <w:tcPr>
+            <w:tcW w:type="dxa" w:w="617"/>
+          </w:tcPr>
+          <w:p>
+            <w:r>
+              <w:t>0.122</w:t>
+            </w:r>
+          </w:p>
+        </w:tc>
+        <w:tc>
+          <w:tcPr>
+            <w:tcW w:type="dxa" w:w="617"/>
+          </w:tcPr>
+          <w:p>
+            <w:r>
+              <w:t>0.0</w:t>
+            </w:r>
+          </w:p>
+        </w:tc>
+        <w:tc>
+          <w:tcPr>
+            <w:tcW w:type="dxa" w:w="617"/>
+          </w:tcPr>
+          <w:p>
+            <w:r>
+              <w:t>success</w:t>
+            </w:r>
+          </w:p>
+        </w:tc>
+      </w:tr>
+      <w:tr>
+        <w:tc>
+          <w:tcPr>
+            <w:tcW w:type="dxa" w:w="617"/>
+          </w:tcPr>
+          <w:p>
+            <w:r>
+              <w:t>2026-05-05T20:31:20</w:t>
+            </w:r>
+          </w:p>
+        </w:tc>
+        <w:tc>
+          <w:tcPr>
+            <w:tcW w:type="dxa" w:w="617"/>
+          </w:tcPr>
+          <w:p>
+            <w:r>
+              <w:t>mpls</w:t>
+            </w:r>
+          </w:p>
+        </w:tc>
+        <w:tc>
+          <w:tcPr>
+            <w:tcW w:type="dxa" w:w="617"/>
+          </w:tcPr>
+          <w:p>
+            <w:r>
+              <w:t>udp_load_sweep</w:t>
+            </w:r>
+          </w:p>
+        </w:tc>
+        <w:tc>
+          <w:tcPr>
+            <w:tcW w:type="dxa" w:w="617"/>
+          </w:tcPr>
+          <w:p>
+            <w:r>
+              <w:t>20.0</w:t>
+            </w:r>
+          </w:p>
+        </w:tc>
+        <w:tc>
+          <w:tcPr>
+            <w:tcW w:type="dxa" w:w="617"/>
+          </w:tcPr>
+          <w:p>
+            <w:r>
+              <w:t>Branch1</w:t>
+            </w:r>
+          </w:p>
+        </w:tc>
+        <w:tc>
+          <w:tcPr>
+            <w:tcW w:type="dxa" w:w="617"/>
+          </w:tcPr>
+          <w:p>
+            <w:r>
+              <w:t>Branch2</w:t>
+            </w:r>
+          </w:p>
+        </w:tc>
+        <w:tc>
+          <w:tcPr>
+            <w:tcW w:type="dxa" w:w="617"/>
+          </w:tcPr>
+          <w:p>
+            <w:r>
+              <w:t>host1</w:t>
+            </w:r>
+          </w:p>
+        </w:tc>
+        <w:tc>
+          <w:tcPr>
+            <w:tcW w:type="dxa" w:w="617"/>
+          </w:tcPr>
+          <w:p>
+            <w:r>
+              <w:t>user1</w:t>
+            </w:r>
+          </w:p>
+        </w:tc>
+        <w:tc>
+          <w:tcPr>
+            <w:tcW w:type="dxa" w:w="617"/>
+          </w:tcPr>
+          <w:p>
+            <w:r/>
+          </w:p>
+        </w:tc>
+        <w:tc>
+          <w:tcPr>
+            <w:tcW w:type="dxa" w:w="617"/>
+          </w:tcPr>
+          <w:p>
+            <w:r/>
+          </w:p>
+        </w:tc>
+        <w:tc>
+          <w:tcPr>
+            <w:tcW w:type="dxa" w:w="617"/>
+          </w:tcPr>
+          <w:p>
+            <w:r/>
+          </w:p>
+        </w:tc>
+        <w:tc>
+          <w:tcPr>
+            <w:tcW w:type="dxa" w:w="617"/>
+          </w:tcPr>
+          <w:p>
+            <w:r>
+              <w:t>0.062</w:t>
+            </w:r>
+          </w:p>
+        </w:tc>
+        <w:tc>
+          <w:tcPr>
+            <w:tcW w:type="dxa" w:w="617"/>
+          </w:tcPr>
+          <w:p>
+            <w:r>
+              <w:t>0.0</w:t>
+            </w:r>
+          </w:p>
+        </w:tc>
+        <w:tc>
+          <w:tcPr>
+            <w:tcW w:type="dxa" w:w="617"/>
+          </w:tcPr>
+          <w:p>
+            <w:r>
+              <w:t>success</w:t>
+            </w:r>
+          </w:p>
+        </w:tc>
+      </w:tr>
+      <w:tr>
+        <w:tc>
+          <w:tcPr>
+            <w:tcW w:type="dxa" w:w="617"/>
+          </w:tcPr>
+          <w:p>
+            <w:r>
+              <w:t>2026-05-05T20:31:25</w:t>
+            </w:r>
+          </w:p>
+        </w:tc>
+        <w:tc>
+          <w:tcPr>
+            <w:tcW w:type="dxa" w:w="617"/>
+          </w:tcPr>
+          <w:p>
+            <w:r>
+              <w:t>mpls</w:t>
+            </w:r>
+          </w:p>
+        </w:tc>
+        <w:tc>
+          <w:tcPr>
+            <w:tcW w:type="dxa" w:w="617"/>
+          </w:tcPr>
+          <w:p>
+            <w:r>
+              <w:t>udp_load_sweep</w:t>
+            </w:r>
+          </w:p>
+        </w:tc>
+        <w:tc>
+          <w:tcPr>
+            <w:tcW w:type="dxa" w:w="617"/>
+          </w:tcPr>
+          <w:p>
+            <w:r>
+              <w:t>50.0</w:t>
+            </w:r>
+          </w:p>
+        </w:tc>
+        <w:tc>
+          <w:tcPr>
+            <w:tcW w:type="dxa" w:w="617"/>
+          </w:tcPr>
+          <w:p>
+            <w:r>
+              <w:t>Branch1</w:t>
+            </w:r>
+          </w:p>
+        </w:tc>
+        <w:tc>
+          <w:tcPr>
+            <w:tcW w:type="dxa" w:w="617"/>
+          </w:tcPr>
+          <w:p>
+            <w:r>
+              <w:t>Branch2</w:t>
+            </w:r>
+          </w:p>
+        </w:tc>
+        <w:tc>
+          <w:tcPr>
+            <w:tcW w:type="dxa" w:w="617"/>
+          </w:tcPr>
+          <w:p>
+            <w:r>
+              <w:t>host1</w:t>
+            </w:r>
+          </w:p>
+        </w:tc>
+        <w:tc>
+          <w:tcPr>
+            <w:tcW w:type="dxa" w:w="617"/>
+          </w:tcPr>
+          <w:p>
+            <w:r>
+              <w:t>user1</w:t>
+            </w:r>
+          </w:p>
+        </w:tc>
+        <w:tc>
+          <w:tcPr>
+            <w:tcW w:type="dxa" w:w="617"/>
+          </w:tcPr>
+          <w:p>
+            <w:r/>
+          </w:p>
+        </w:tc>
+        <w:tc>
+          <w:tcPr>
+            <w:tcW w:type="dxa" w:w="617"/>
+          </w:tcPr>
+          <w:p>
+            <w:r/>
+          </w:p>
+        </w:tc>
+        <w:tc>
+          <w:tcPr>
+            <w:tcW w:type="dxa" w:w="617"/>
+          </w:tcPr>
+          <w:p>
+            <w:r/>
+          </w:p>
+        </w:tc>
+        <w:tc>
+          <w:tcPr>
+            <w:tcW w:type="dxa" w:w="617"/>
+          </w:tcPr>
+          <w:p>
+            <w:r>
+              <w:t>0.258</w:t>
+            </w:r>
+          </w:p>
+        </w:tc>
+        <w:tc>
+          <w:tcPr>
+            <w:tcW w:type="dxa" w:w="617"/>
+          </w:tcPr>
+          <w:p>
+            <w:r>
+              <w:t>0.0</w:t>
+            </w:r>
+          </w:p>
+        </w:tc>
+        <w:tc>
+          <w:tcPr>
+            <w:tcW w:type="dxa" w:w="617"/>
+          </w:tcPr>
+          <w:p>
+            <w:r>
+              <w:t>success</w:t>
+            </w:r>
+          </w:p>
+        </w:tc>
+      </w:tr>
+      <w:tr>
+        <w:tc>
+          <w:tcPr>
+            <w:tcW w:type="dxa" w:w="617"/>
+          </w:tcPr>
+          <w:p>
+            <w:r>
+              <w:t>2026-05-05T20:31:31</w:t>
+            </w:r>
+          </w:p>
+        </w:tc>
+        <w:tc>
+          <w:tcPr>
+            <w:tcW w:type="dxa" w:w="617"/>
+          </w:tcPr>
+          <w:p>
+            <w:r>
+              <w:t>mpls</w:t>
+            </w:r>
+          </w:p>
+        </w:tc>
+        <w:tc>
+          <w:tcPr>
+            <w:tcW w:type="dxa" w:w="617"/>
+          </w:tcPr>
+          <w:p>
+            <w:r>
+              <w:t>udp_load_sweep</w:t>
+            </w:r>
+          </w:p>
+        </w:tc>
+        <w:tc>
+          <w:tcPr>
+            <w:tcW w:type="dxa" w:w="617"/>
+          </w:tcPr>
+          <w:p>
+            <w:r>
+              <w:t>80.0</w:t>
+            </w:r>
+          </w:p>
+        </w:tc>
+        <w:tc>
+          <w:tcPr>
+            <w:tcW w:type="dxa" w:w="617"/>
+          </w:tcPr>
+          <w:p>
+            <w:r>
+              <w:t>Branch1</w:t>
+            </w:r>
+          </w:p>
+        </w:tc>
+        <w:tc>
+          <w:tcPr>
+            <w:tcW w:type="dxa" w:w="617"/>
+          </w:tcPr>
+          <w:p>
+            <w:r>
+              <w:t>Branch2</w:t>
+            </w:r>
+          </w:p>
+        </w:tc>
+        <w:tc>
+          <w:tcPr>
+            <w:tcW w:type="dxa" w:w="617"/>
+          </w:tcPr>
+          <w:p>
+            <w:r>
+              <w:t>host1</w:t>
+            </w:r>
+          </w:p>
+        </w:tc>
+        <w:tc>
+          <w:tcPr>
+            <w:tcW w:type="dxa" w:w="617"/>
+          </w:tcPr>
+          <w:p>
+            <w:r>
+              <w:t>user1</w:t>
+            </w:r>
+          </w:p>
+        </w:tc>
+        <w:tc>
+          <w:tcPr>
+            <w:tcW w:type="dxa" w:w="617"/>
+          </w:tcPr>
+          <w:p>
+            <w:r/>
+          </w:p>
+        </w:tc>
+        <w:tc>
+          <w:tcPr>
+            <w:tcW w:type="dxa" w:w="617"/>
+          </w:tcPr>
+          <w:p>
+            <w:r/>
+          </w:p>
+        </w:tc>
+        <w:tc>
+          <w:tcPr>
+            <w:tcW w:type="dxa" w:w="617"/>
+          </w:tcPr>
+          <w:p>
+            <w:r/>
+          </w:p>
+        </w:tc>
+        <w:tc>
+          <w:tcPr>
+            <w:tcW w:type="dxa" w:w="617"/>
+          </w:tcPr>
+          <w:p>
+            <w:r>
+              <w:t>0.227</w:t>
+            </w:r>
+          </w:p>
+        </w:tc>
+        <w:tc>
+          <w:tcPr>
+            <w:tcW w:type="dxa" w:w="617"/>
+          </w:tcPr>
+          <w:p>
+            <w:r>
+              <w:t>20.674</w:t>
+            </w:r>
+          </w:p>
+        </w:tc>
+        <w:tc>
+          <w:tcPr>
+            <w:tcW w:type="dxa" w:w="617"/>
+          </w:tcPr>
+          <w:p>
+            <w:r>
+              <w:t>success</w:t>
+            </w:r>
+          </w:p>
+        </w:tc>
+      </w:tr>
+      <w:tr>
+        <w:tc>
+          <w:tcPr>
+            <w:tcW w:type="dxa" w:w="617"/>
+          </w:tcPr>
+          <w:p>
+            <w:r>
+              <w:t>2026-05-05T20:31:37</w:t>
+            </w:r>
+          </w:p>
+        </w:tc>
+        <w:tc>
+          <w:tcPr>
+            <w:tcW w:type="dxa" w:w="617"/>
+          </w:tcPr>
+          <w:p>
+            <w:r>
+              <w:t>mpls</w:t>
+            </w:r>
+          </w:p>
+        </w:tc>
+        <w:tc>
+          <w:tcPr>
+            <w:tcW w:type="dxa" w:w="617"/>
+          </w:tcPr>
+          <w:p>
+            <w:r>
+              <w:t>udp_load_sweep</w:t>
+            </w:r>
+          </w:p>
+        </w:tc>
+        <w:tc>
+          <w:tcPr>
+            <w:tcW w:type="dxa" w:w="617"/>
+          </w:tcPr>
+          <w:p>
+            <w:r>
+              <w:t>120.0</w:t>
+            </w:r>
+          </w:p>
+        </w:tc>
+        <w:tc>
+          <w:tcPr>
+            <w:tcW w:type="dxa" w:w="617"/>
+          </w:tcPr>
+          <w:p>
+            <w:r>
+              <w:t>Branch1</w:t>
+            </w:r>
+          </w:p>
+        </w:tc>
+        <w:tc>
+          <w:tcPr>
+            <w:tcW w:type="dxa" w:w="617"/>
+          </w:tcPr>
+          <w:p>
+            <w:r>
+              <w:t>Branch2</w:t>
+            </w:r>
+          </w:p>
+        </w:tc>
+        <w:tc>
+          <w:tcPr>
+            <w:tcW w:type="dxa" w:w="617"/>
+          </w:tcPr>
+          <w:p>
+            <w:r>
+              <w:t>host1</w:t>
+            </w:r>
+          </w:p>
+        </w:tc>
+        <w:tc>
+          <w:tcPr>
+            <w:tcW w:type="dxa" w:w="617"/>
+          </w:tcPr>
+          <w:p>
+            <w:r>
+              <w:t>user1</w:t>
+            </w:r>
+          </w:p>
+        </w:tc>
+        <w:tc>
+          <w:tcPr>
+            <w:tcW w:type="dxa" w:w="617"/>
+          </w:tcPr>
+          <w:p>
+            <w:r/>
+          </w:p>
+        </w:tc>
+        <w:tc>
+          <w:tcPr>
+            <w:tcW w:type="dxa" w:w="617"/>
+          </w:tcPr>
+          <w:p>
+            <w:r/>
+          </w:p>
+        </w:tc>
+        <w:tc>
+          <w:tcPr>
+            <w:tcW w:type="dxa" w:w="617"/>
+          </w:tcPr>
+          <w:p>
+            <w:r/>
+          </w:p>
+        </w:tc>
+        <w:tc>
+          <w:tcPr>
+            <w:tcW w:type="dxa" w:w="617"/>
+          </w:tcPr>
+          <w:p>
+            <w:r>
+              <w:t>258.863</w:t>
+            </w:r>
+          </w:p>
+        </w:tc>
+        <w:tc>
+          <w:tcPr>
+            <w:tcW w:type="dxa" w:w="617"/>
+          </w:tcPr>
+          <w:p>
+            <w:r>
+              <w:t>47.967</w:t>
+            </w:r>
+          </w:p>
+        </w:tc>
+        <w:tc>
+          <w:tcPr>
+            <w:tcW w:type="dxa" w:w="617"/>
+          </w:tcPr>
+          <w:p>
+            <w:r>
+              <w:t>success</w:t>
+            </w:r>
+          </w:p>
+        </w:tc>
+      </w:tr>
+      <w:tr>
+        <w:tc>
+          <w:tcPr>
+            <w:tcW w:type="dxa" w:w="617"/>
+          </w:tcPr>
+          <w:p>
+            <w:r>
+              <w:t>2026-05-05T20:31:42</w:t>
+            </w:r>
+          </w:p>
+        </w:tc>
+        <w:tc>
+          <w:tcPr>
+            <w:tcW w:type="dxa" w:w="617"/>
+          </w:tcPr>
+          <w:p>
+            <w:r>
+              <w:t>mpls</w:t>
+            </w:r>
+          </w:p>
+        </w:tc>
+        <w:tc>
+          <w:tcPr>
+            <w:tcW w:type="dxa" w:w="617"/>
+          </w:tcPr>
+          <w:p>
+            <w:r>
+              <w:t>udp_load_sweep</w:t>
+            </w:r>
+          </w:p>
+        </w:tc>
+        <w:tc>
+          <w:tcPr>
+            <w:tcW w:type="dxa" w:w="617"/>
+          </w:tcPr>
+          <w:p>
+            <w:r>
+              <w:t>5.0</w:t>
+            </w:r>
+          </w:p>
+        </w:tc>
+        <w:tc>
+          <w:tcPr>
+            <w:tcW w:type="dxa" w:w="617"/>
+          </w:tcPr>
+          <w:p>
+            <w:r>
+              <w:t>Branch1</w:t>
+            </w:r>
+          </w:p>
+        </w:tc>
+        <w:tc>
+          <w:tcPr>
+            <w:tcW w:type="dxa" w:w="617"/>
+          </w:tcPr>
+          <w:p>
+            <w:r>
+              <w:t>Branch3</w:t>
+            </w:r>
+          </w:p>
+        </w:tc>
+        <w:tc>
+          <w:tcPr>
+            <w:tcW w:type="dxa" w:w="617"/>
+          </w:tcPr>
+          <w:p>
+            <w:r>
+              <w:t>host2</w:t>
+            </w:r>
+          </w:p>
+        </w:tc>
+        <w:tc>
+          <w:tcPr>
+            <w:tcW w:type="dxa" w:w="617"/>
+          </w:tcPr>
+          <w:p>
+            <w:r>
+              <w:t>svr1</w:t>
+            </w:r>
+          </w:p>
+        </w:tc>
+        <w:tc>
+          <w:tcPr>
+            <w:tcW w:type="dxa" w:w="617"/>
+          </w:tcPr>
+          <w:p>
+            <w:r/>
+          </w:p>
+        </w:tc>
+        <w:tc>
+          <w:tcPr>
+            <w:tcW w:type="dxa" w:w="617"/>
+          </w:tcPr>
+          <w:p>
+            <w:r/>
+          </w:p>
+        </w:tc>
+        <w:tc>
+          <w:tcPr>
+            <w:tcW w:type="dxa" w:w="617"/>
+          </w:tcPr>
+          <w:p>
+            <w:r/>
+          </w:p>
+        </w:tc>
+        <w:tc>
+          <w:tcPr>
+            <w:tcW w:type="dxa" w:w="617"/>
+          </w:tcPr>
+          <w:p>
+            <w:r>
+              <w:t>0.127</w:t>
+            </w:r>
+          </w:p>
+        </w:tc>
+        <w:tc>
+          <w:tcPr>
+            <w:tcW w:type="dxa" w:w="617"/>
+          </w:tcPr>
+          <w:p>
+            <w:r>
+              <w:t>0.0</w:t>
+            </w:r>
+          </w:p>
+        </w:tc>
+        <w:tc>
+          <w:tcPr>
+            <w:tcW w:type="dxa" w:w="617"/>
+          </w:tcPr>
+          <w:p>
+            <w:r>
+              <w:t>success</w:t>
+            </w:r>
+          </w:p>
+        </w:tc>
+      </w:tr>
+      <w:tr>
+        <w:tc>
+          <w:tcPr>
+            <w:tcW w:type="dxa" w:w="617"/>
+          </w:tcPr>
+          <w:p>
+            <w:r>
+              <w:t>2026-05-05T20:31:47</w:t>
+            </w:r>
+          </w:p>
+        </w:tc>
+        <w:tc>
+          <w:tcPr>
+            <w:tcW w:type="dxa" w:w="617"/>
+          </w:tcPr>
+          <w:p>
+            <w:r>
+              <w:t>mpls</w:t>
+            </w:r>
+          </w:p>
+        </w:tc>
+        <w:tc>
+          <w:tcPr>
+            <w:tcW w:type="dxa" w:w="617"/>
+          </w:tcPr>
+          <w:p>
+            <w:r>
+              <w:t>udp_load_sweep</w:t>
+            </w:r>
+          </w:p>
+        </w:tc>
+        <w:tc>
+          <w:tcPr>
+            <w:tcW w:type="dxa" w:w="617"/>
+          </w:tcPr>
+          <w:p>
+            <w:r>
+              <w:t>20.0</w:t>
+            </w:r>
+          </w:p>
+        </w:tc>
+        <w:tc>
+          <w:tcPr>
+            <w:tcW w:type="dxa" w:w="617"/>
+          </w:tcPr>
+          <w:p>
+            <w:r>
+              <w:t>Branch1</w:t>
+            </w:r>
+          </w:p>
+        </w:tc>
+        <w:tc>
+          <w:tcPr>
+            <w:tcW w:type="dxa" w:w="617"/>
+          </w:tcPr>
+          <w:p>
+            <w:r>
+              <w:t>Branch3</w:t>
+            </w:r>
+          </w:p>
+        </w:tc>
+        <w:tc>
+          <w:tcPr>
+            <w:tcW w:type="dxa" w:w="617"/>
+          </w:tcPr>
+          <w:p>
+            <w:r>
+              <w:t>host2</w:t>
+            </w:r>
+          </w:p>
+        </w:tc>
+        <w:tc>
+          <w:tcPr>
+            <w:tcW w:type="dxa" w:w="617"/>
+          </w:tcPr>
+          <w:p>
+            <w:r>
+              <w:t>svr1</w:t>
+            </w:r>
+          </w:p>
+        </w:tc>
+        <w:tc>
+          <w:tcPr>
+            <w:tcW w:type="dxa" w:w="617"/>
+          </w:tcPr>
+          <w:p>
+            <w:r/>
+          </w:p>
+        </w:tc>
+        <w:tc>
+          <w:tcPr>
+            <w:tcW w:type="dxa" w:w="617"/>
+          </w:tcPr>
+          <w:p>
+            <w:r/>
+          </w:p>
+        </w:tc>
+        <w:tc>
+          <w:tcPr>
+            <w:tcW w:type="dxa" w:w="617"/>
+          </w:tcPr>
+          <w:p>
+            <w:r/>
+          </w:p>
+        </w:tc>
+        <w:tc>
+          <w:tcPr>
+            <w:tcW w:type="dxa" w:w="617"/>
+          </w:tcPr>
+          <w:p>
+            <w:r>
+              <w:t>0.113</w:t>
+            </w:r>
+          </w:p>
+        </w:tc>
+        <w:tc>
+          <w:tcPr>
+            <w:tcW w:type="dxa" w:w="617"/>
+          </w:tcPr>
+          <w:p>
+            <w:r>
+              <w:t>0.0</w:t>
+            </w:r>
+          </w:p>
+        </w:tc>
+        <w:tc>
+          <w:tcPr>
+            <w:tcW w:type="dxa" w:w="617"/>
+          </w:tcPr>
+          <w:p>
+            <w:r>
+              <w:t>success</w:t>
+            </w:r>
+          </w:p>
+        </w:tc>
+      </w:tr>
+      <w:tr>
+        <w:tc>
+          <w:tcPr>
+            <w:tcW w:type="dxa" w:w="617"/>
+          </w:tcPr>
+          <w:p>
+            <w:r>
+              <w:t>2026-05-05T20:31:53</w:t>
+            </w:r>
+          </w:p>
+        </w:tc>
+        <w:tc>
+          <w:tcPr>
+            <w:tcW w:type="dxa" w:w="617"/>
+          </w:tcPr>
+          <w:p>
+            <w:r>
+              <w:t>mpls</w:t>
+            </w:r>
+          </w:p>
+        </w:tc>
+        <w:tc>
+          <w:tcPr>
+            <w:tcW w:type="dxa" w:w="617"/>
+          </w:tcPr>
+          <w:p>
+            <w:r>
+              <w:t>udp_load_sweep</w:t>
+            </w:r>
+          </w:p>
+        </w:tc>
+        <w:tc>
+          <w:tcPr>
+            <w:tcW w:type="dxa" w:w="617"/>
+          </w:tcPr>
+          <w:p>
+            <w:r>
+              <w:t>50.0</w:t>
+            </w:r>
+          </w:p>
+        </w:tc>
+        <w:tc>
+          <w:tcPr>
+            <w:tcW w:type="dxa" w:w="617"/>
+          </w:tcPr>
+          <w:p>
+            <w:r>
+              <w:t>Branch1</w:t>
+            </w:r>
+          </w:p>
+        </w:tc>
+        <w:tc>
+          <w:tcPr>
+            <w:tcW w:type="dxa" w:w="617"/>
+          </w:tcPr>
+          <w:p>
+            <w:r>
+              <w:t>Branch3</w:t>
+            </w:r>
+          </w:p>
+        </w:tc>
+        <w:tc>
+          <w:tcPr>
+            <w:tcW w:type="dxa" w:w="617"/>
+          </w:tcPr>
+          <w:p>
+            <w:r>
+              <w:t>host2</w:t>
+            </w:r>
+          </w:p>
+        </w:tc>
+        <w:tc>
+          <w:tcPr>
+            <w:tcW w:type="dxa" w:w="617"/>
+          </w:tcPr>
+          <w:p>
+            <w:r>
+              <w:t>svr1</w:t>
+            </w:r>
+          </w:p>
+        </w:tc>
+        <w:tc>
+          <w:tcPr>
+            <w:tcW w:type="dxa" w:w="617"/>
+          </w:tcPr>
+          <w:p>
+            <w:r/>
+          </w:p>
+        </w:tc>
+        <w:tc>
+          <w:tcPr>
+            <w:tcW w:type="dxa" w:w="617"/>
+          </w:tcPr>
+          <w:p>
+            <w:r/>
+          </w:p>
+        </w:tc>
+        <w:tc>
+          <w:tcPr>
+            <w:tcW w:type="dxa" w:w="617"/>
+          </w:tcPr>
+          <w:p>
+            <w:r/>
+          </w:p>
+        </w:tc>
+        <w:tc>
+          <w:tcPr>
+            <w:tcW w:type="dxa" w:w="617"/>
+          </w:tcPr>
+          <w:p>
+            <w:r>
+              <w:t>0.323</w:t>
+            </w:r>
+          </w:p>
+        </w:tc>
+        <w:tc>
+          <w:tcPr>
+            <w:tcW w:type="dxa" w:w="617"/>
+          </w:tcPr>
+          <w:p>
+            <w:r>
+              <w:t>1.997</w:t>
+            </w:r>
+          </w:p>
+        </w:tc>
+        <w:tc>
+          <w:tcPr>
+            <w:tcW w:type="dxa" w:w="617"/>
+          </w:tcPr>
+          <w:p>
+            <w:r>
+              <w:t>success</w:t>
+            </w:r>
+          </w:p>
+        </w:tc>
+      </w:tr>
+      <w:tr>
+        <w:tc>
+          <w:tcPr>
+            <w:tcW w:type="dxa" w:w="617"/>
+          </w:tcPr>
+          <w:p>
+            <w:r>
+              <w:t>2026-05-05T20:31:58</w:t>
+            </w:r>
+          </w:p>
+        </w:tc>
+        <w:tc>
+          <w:tcPr>
+            <w:tcW w:type="dxa" w:w="617"/>
+          </w:tcPr>
+          <w:p>
+            <w:r>
+              <w:t>mpls</w:t>
+            </w:r>
+          </w:p>
+        </w:tc>
+        <w:tc>
+          <w:tcPr>
+            <w:tcW w:type="dxa" w:w="617"/>
+          </w:tcPr>
+          <w:p>
+            <w:r>
+              <w:t>udp_load_sweep</w:t>
+            </w:r>
+          </w:p>
+        </w:tc>
+        <w:tc>
+          <w:tcPr>
+            <w:tcW w:type="dxa" w:w="617"/>
+          </w:tcPr>
+          <w:p>
+            <w:r>
+              <w:t>80.0</w:t>
+            </w:r>
+          </w:p>
+        </w:tc>
+        <w:tc>
+          <w:tcPr>
+            <w:tcW w:type="dxa" w:w="617"/>
+          </w:tcPr>
+          <w:p>
+            <w:r>
+              <w:t>Branch1</w:t>
+            </w:r>
+          </w:p>
+        </w:tc>
+        <w:tc>
+          <w:tcPr>
+            <w:tcW w:type="dxa" w:w="617"/>
+          </w:tcPr>
+          <w:p>
+            <w:r>
+              <w:t>Branch3</w:t>
+            </w:r>
+          </w:p>
+        </w:tc>
+        <w:tc>
+          <w:tcPr>
+            <w:tcW w:type="dxa" w:w="617"/>
+          </w:tcPr>
+          <w:p>
+            <w:r>
+              <w:t>host2</w:t>
+            </w:r>
+          </w:p>
+        </w:tc>
+        <w:tc>
+          <w:tcPr>
+            <w:tcW w:type="dxa" w:w="617"/>
+          </w:tcPr>
+          <w:p>
+            <w:r>
+              <w:t>svr1</w:t>
+            </w:r>
+          </w:p>
+        </w:tc>
+        <w:tc>
+          <w:tcPr>
+            <w:tcW w:type="dxa" w:w="617"/>
+          </w:tcPr>
+          <w:p>
+            <w:r/>
+          </w:p>
+        </w:tc>
+        <w:tc>
+          <w:tcPr>
+            <w:tcW w:type="dxa" w:w="617"/>
+          </w:tcPr>
+          <w:p>
+            <w:r/>
+          </w:p>
+        </w:tc>
+        <w:tc>
+          <w:tcPr>
+            <w:tcW w:type="dxa" w:w="617"/>
+          </w:tcPr>
+          <w:p>
+            <w:r/>
+          </w:p>
+        </w:tc>
+        <w:tc>
+          <w:tcPr>
+            <w:tcW w:type="dxa" w:w="617"/>
+          </w:tcPr>
+          <w:p>
+            <w:r>
+              <w:t>0.338</w:t>
+            </w:r>
+          </w:p>
+        </w:tc>
+        <w:tc>
+          <w:tcPr>
+            <w:tcW w:type="dxa" w:w="617"/>
+          </w:tcPr>
+          <w:p>
+            <w:r>
+              <w:t>34.9</w:t>
+            </w:r>
+          </w:p>
+        </w:tc>
+        <w:tc>
+          <w:tcPr>
+            <w:tcW w:type="dxa" w:w="617"/>
+          </w:tcPr>
+          <w:p>
+            <w:r>
+              <w:t>success</w:t>
+            </w:r>
+          </w:p>
+        </w:tc>
+      </w:tr>
+      <w:tr>
+        <w:tc>
+          <w:tcPr>
+            <w:tcW w:type="dxa" w:w="617"/>
+          </w:tcPr>
+          <w:p>
+            <w:r>
+              <w:t>2026-05-05T20:32:04</w:t>
+            </w:r>
+          </w:p>
+        </w:tc>
+        <w:tc>
+          <w:tcPr>
+            <w:tcW w:type="dxa" w:w="617"/>
+          </w:tcPr>
+          <w:p>
+            <w:r>
+              <w:t>mpls</w:t>
+            </w:r>
+          </w:p>
+        </w:tc>
+        <w:tc>
+          <w:tcPr>
+            <w:tcW w:type="dxa" w:w="617"/>
+          </w:tcPr>
+          <w:p>
+            <w:r>
+              <w:t>udp_load_sweep</w:t>
+            </w:r>
+          </w:p>
+        </w:tc>
+        <w:tc>
+          <w:tcPr>
+            <w:tcW w:type="dxa" w:w="617"/>
+          </w:tcPr>
+          <w:p>
+            <w:r>
+              <w:t>120.0</w:t>
+            </w:r>
+          </w:p>
+        </w:tc>
+        <w:tc>
+          <w:tcPr>
+            <w:tcW w:type="dxa" w:w="617"/>
+          </w:tcPr>
+          <w:p>
+            <w:r>
+              <w:t>Branch1</w:t>
+            </w:r>
+          </w:p>
+        </w:tc>
+        <w:tc>
+          <w:tcPr>
+            <w:tcW w:type="dxa" w:w="617"/>
+          </w:tcPr>
+          <w:p>
+            <w:r>
+              <w:t>Branch3</w:t>
+            </w:r>
+          </w:p>
+        </w:tc>
+        <w:tc>
+          <w:tcPr>
+            <w:tcW w:type="dxa" w:w="617"/>
+          </w:tcPr>
+          <w:p>
+            <w:r>
+              <w:t>host2</w:t>
+            </w:r>
+          </w:p>
+        </w:tc>
+        <w:tc>
+          <w:tcPr>
+            <w:tcW w:type="dxa" w:w="617"/>
+          </w:tcPr>
+          <w:p>
+            <w:r>
+              <w:t>svr1</w:t>
+            </w:r>
+          </w:p>
+        </w:tc>
+        <w:tc>
+          <w:tcPr>
+            <w:tcW w:type="dxa" w:w="617"/>
+          </w:tcPr>
+          <w:p>
+            <w:r/>
+          </w:p>
+        </w:tc>
+        <w:tc>
+          <w:tcPr>
+            <w:tcW w:type="dxa" w:w="617"/>
+          </w:tcPr>
+          <w:p>
+            <w:r/>
+          </w:p>
+        </w:tc>
+        <w:tc>
+          <w:tcPr>
+            <w:tcW w:type="dxa" w:w="617"/>
+          </w:tcPr>
+          <w:p>
+            <w:r/>
+          </w:p>
+        </w:tc>
+        <w:tc>
+          <w:tcPr>
+            <w:tcW w:type="dxa" w:w="617"/>
+          </w:tcPr>
+          <w:p>
+            <w:r>
+              <w:t>0.216</w:t>
+            </w:r>
+          </w:p>
+        </w:tc>
+        <w:tc>
+          <w:tcPr>
+            <w:tcW w:type="dxa" w:w="617"/>
+          </w:tcPr>
+          <w:p>
+            <w:r>
+              <w:t>53.264</w:t>
+            </w:r>
+          </w:p>
+        </w:tc>
+        <w:tc>
+          <w:tcPr>
+            <w:tcW w:type="dxa" w:w="617"/>
+          </w:tcPr>
+          <w:p>
+            <w:r>
+              <w:t>success</w:t>
+            </w:r>
+          </w:p>
+        </w:tc>
+      </w:tr>
+      <w:tr>
+        <w:tc>
+          <w:tcPr>
+            <w:tcW w:type="dxa" w:w="617"/>
+          </w:tcPr>
+          <w:p>
+            <w:r>
+              <w:t>2026-05-05T20:32:10</w:t>
+            </w:r>
+          </w:p>
+        </w:tc>
+        <w:tc>
+          <w:tcPr>
+            <w:tcW w:type="dxa" w:w="617"/>
+          </w:tcPr>
+          <w:p>
+            <w:r>
+              <w:t>mpls</w:t>
+            </w:r>
+          </w:p>
+        </w:tc>
+        <w:tc>
+          <w:tcPr>
+            <w:tcW w:type="dxa" w:w="617"/>
+          </w:tcPr>
+          <w:p>
+            <w:r>
+              <w:t>udp_load_sweep</w:t>
+            </w:r>
+          </w:p>
+        </w:tc>
+        <w:tc>
+          <w:tcPr>
+            <w:tcW w:type="dxa" w:w="617"/>
+          </w:tcPr>
+          <w:p>
+            <w:r>
+              <w:t>5.0</w:t>
+            </w:r>
+          </w:p>
+        </w:tc>
+        <w:tc>
+          <w:tcPr>
+            <w:tcW w:type="dxa" w:w="617"/>
+          </w:tcPr>
+          <w:p>
+            <w:r>
+              <w:t>Branch2</w:t>
+            </w:r>
+          </w:p>
+        </w:tc>
+        <w:tc>
+          <w:tcPr>
+            <w:tcW w:type="dxa" w:w="617"/>
+          </w:tcPr>
+          <w:p>
+            <w:r>
+              <w:t>Branch3</w:t>
+            </w:r>
+          </w:p>
+        </w:tc>
+        <w:tc>
+          <w:tcPr>
+            <w:tcW w:type="dxa" w:w="617"/>
+          </w:tcPr>
+          <w:p>
+            <w:r>
+              <w:t>user1</w:t>
+            </w:r>
+          </w:p>
+        </w:tc>
+        <w:tc>
+          <w:tcPr>
+            <w:tcW w:type="dxa" w:w="617"/>
+          </w:tcPr>
+          <w:p>
+            <w:r>
+              <w:t>svr2</w:t>
+            </w:r>
+          </w:p>
+        </w:tc>
+        <w:tc>
+          <w:tcPr>
+            <w:tcW w:type="dxa" w:w="617"/>
+          </w:tcPr>
+          <w:p>
+            <w:r/>
+          </w:p>
+        </w:tc>
+        <w:tc>
+          <w:tcPr>
+            <w:tcW w:type="dxa" w:w="617"/>
+          </w:tcPr>
+          <w:p>
+            <w:r/>
+          </w:p>
+        </w:tc>
+        <w:tc>
+          <w:tcPr>
+            <w:tcW w:type="dxa" w:w="617"/>
+          </w:tcPr>
+          <w:p>
+            <w:r/>
+          </w:p>
+        </w:tc>
+        <w:tc>
+          <w:tcPr>
+            <w:tcW w:type="dxa" w:w="617"/>
+          </w:tcPr>
+          <w:p>
+            <w:r>
+              <w:t>0.094</w:t>
+            </w:r>
+          </w:p>
+        </w:tc>
+        <w:tc>
+          <w:tcPr>
+            <w:tcW w:type="dxa" w:w="617"/>
+          </w:tcPr>
+          <w:p>
+            <w:r>
+              <w:t>0.0</w:t>
+            </w:r>
+          </w:p>
+        </w:tc>
+        <w:tc>
+          <w:tcPr>
+            <w:tcW w:type="dxa" w:w="617"/>
+          </w:tcPr>
+          <w:p>
+            <w:r>
+              <w:t>success</w:t>
+            </w:r>
+          </w:p>
+        </w:tc>
+      </w:tr>
+      <w:tr>
+        <w:tc>
+          <w:tcPr>
+            <w:tcW w:type="dxa" w:w="617"/>
+          </w:tcPr>
+          <w:p>
+            <w:r>
+              <w:t>2026-05-05T20:32:15</w:t>
+            </w:r>
+          </w:p>
+        </w:tc>
+        <w:tc>
+          <w:tcPr>
+            <w:tcW w:type="dxa" w:w="617"/>
+          </w:tcPr>
+          <w:p>
+            <w:r>
+              <w:t>mpls</w:t>
+            </w:r>
+          </w:p>
+        </w:tc>
+        <w:tc>
+          <w:tcPr>
+            <w:tcW w:type="dxa" w:w="617"/>
+          </w:tcPr>
+          <w:p>
+            <w:r>
+              <w:t>udp_load_sweep</w:t>
+            </w:r>
+          </w:p>
+        </w:tc>
+        <w:tc>
+          <w:tcPr>
+            <w:tcW w:type="dxa" w:w="617"/>
+          </w:tcPr>
+          <w:p>
+            <w:r>
+              <w:t>20.0</w:t>
+            </w:r>
+          </w:p>
+        </w:tc>
+        <w:tc>
+          <w:tcPr>
+            <w:tcW w:type="dxa" w:w="617"/>
+          </w:tcPr>
+          <w:p>
+            <w:r>
+              <w:t>Branch2</w:t>
+            </w:r>
+          </w:p>
+        </w:tc>
+        <w:tc>
+          <w:tcPr>
+            <w:tcW w:type="dxa" w:w="617"/>
+          </w:tcPr>
+          <w:p>
+            <w:r>
+              <w:t>Branch3</w:t>
+            </w:r>
+          </w:p>
+        </w:tc>
+        <w:tc>
+          <w:tcPr>
+            <w:tcW w:type="dxa" w:w="617"/>
+          </w:tcPr>
+          <w:p>
+            <w:r>
+              <w:t>user1</w:t>
+            </w:r>
+          </w:p>
+        </w:tc>
+        <w:tc>
+          <w:tcPr>
+            <w:tcW w:type="dxa" w:w="617"/>
+          </w:tcPr>
+          <w:p>
+            <w:r>
+              <w:t>svr2</w:t>
+            </w:r>
+          </w:p>
+        </w:tc>
+        <w:tc>
+          <w:tcPr>
+            <w:tcW w:type="dxa" w:w="617"/>
+          </w:tcPr>
+          <w:p>
+            <w:r/>
+          </w:p>
+        </w:tc>
+        <w:tc>
+          <w:tcPr>
+            <w:tcW w:type="dxa" w:w="617"/>
+          </w:tcPr>
+          <w:p>
+            <w:r/>
+          </w:p>
+        </w:tc>
+        <w:tc>
+          <w:tcPr>
+            <w:tcW w:type="dxa" w:w="617"/>
+          </w:tcPr>
+          <w:p>
+            <w:r/>
+          </w:p>
+        </w:tc>
+        <w:tc>
+          <w:tcPr>
+            <w:tcW w:type="dxa" w:w="617"/>
+          </w:tcPr>
+          <w:p>
+            <w:r>
+              <w:t>0.134</w:t>
+            </w:r>
+          </w:p>
+        </w:tc>
+        <w:tc>
+          <w:tcPr>
+            <w:tcW w:type="dxa" w:w="617"/>
+          </w:tcPr>
+          <w:p>
+            <w:r>
+              <w:t>0.0</w:t>
+            </w:r>
+          </w:p>
+        </w:tc>
+        <w:tc>
+          <w:tcPr>
+            <w:tcW w:type="dxa" w:w="617"/>
+          </w:tcPr>
+          <w:p>
+            <w:r>
+              <w:t>success</w:t>
+            </w:r>
+          </w:p>
+        </w:tc>
+      </w:tr>
+      <w:tr>
+        <w:tc>
+          <w:tcPr>
+            <w:tcW w:type="dxa" w:w="617"/>
+          </w:tcPr>
+          <w:p>
+            <w:r>
+              <w:t>2026-05-05T20:32:20</w:t>
+            </w:r>
+          </w:p>
+        </w:tc>
+        <w:tc>
+          <w:tcPr>
+            <w:tcW w:type="dxa" w:w="617"/>
+          </w:tcPr>
+          <w:p>
+            <w:r>
+              <w:t>mpls</w:t>
+            </w:r>
+          </w:p>
+        </w:tc>
+        <w:tc>
+          <w:tcPr>
+            <w:tcW w:type="dxa" w:w="617"/>
+          </w:tcPr>
+          <w:p>
+            <w:r>
+              <w:t>udp_load_sweep</w:t>
+            </w:r>
+          </w:p>
+        </w:tc>
+        <w:tc>
+          <w:tcPr>
+            <w:tcW w:type="dxa" w:w="617"/>
+          </w:tcPr>
+          <w:p>
+            <w:r>
+              <w:t>50.0</w:t>
+            </w:r>
+          </w:p>
+        </w:tc>
+        <w:tc>
+          <w:tcPr>
+            <w:tcW w:type="dxa" w:w="617"/>
+          </w:tcPr>
+          <w:p>
+            <w:r>
+              <w:t>Branch2</w:t>
+            </w:r>
+          </w:p>
+        </w:tc>
+        <w:tc>
+          <w:tcPr>
+            <w:tcW w:type="dxa" w:w="617"/>
+          </w:tcPr>
+          <w:p>
+            <w:r>
+              <w:t>Branch3</w:t>
+            </w:r>
+          </w:p>
+        </w:tc>
+        <w:tc>
+          <w:tcPr>
+            <w:tcW w:type="dxa" w:w="617"/>
+          </w:tcPr>
+          <w:p>
+            <w:r>
+              <w:t>user1</w:t>
+            </w:r>
+          </w:p>
+        </w:tc>
+        <w:tc>
+          <w:tcPr>
+            <w:tcW w:type="dxa" w:w="617"/>
+          </w:tcPr>
+          <w:p>
+            <w:r>
+              <w:t>svr2</w:t>
+            </w:r>
+          </w:p>
+        </w:tc>
+        <w:tc>
+          <w:tcPr>
+            <w:tcW w:type="dxa" w:w="617"/>
+          </w:tcPr>
+          <w:p>
+            <w:r/>
+          </w:p>
+        </w:tc>
+        <w:tc>
+          <w:tcPr>
+            <w:tcW w:type="dxa" w:w="617"/>
+          </w:tcPr>
+          <w:p>
+            <w:r/>
+          </w:p>
+        </w:tc>
+        <w:tc>
+          <w:tcPr>
+            <w:tcW w:type="dxa" w:w="617"/>
+          </w:tcPr>
+          <w:p>
+            <w:r/>
+          </w:p>
+        </w:tc>
+        <w:tc>
+          <w:tcPr>
+            <w:tcW w:type="dxa" w:w="617"/>
+          </w:tcPr>
+          <w:p>
+            <w:r>
+              <w:t>0.256</w:t>
+            </w:r>
+          </w:p>
+        </w:tc>
+        <w:tc>
+          <w:tcPr>
+            <w:tcW w:type="dxa" w:w="617"/>
+          </w:tcPr>
+          <w:p>
+            <w:r>
+              <w:t>0.0</w:t>
+            </w:r>
+          </w:p>
+        </w:tc>
+        <w:tc>
+          <w:tcPr>
+            <w:tcW w:type="dxa" w:w="617"/>
+          </w:tcPr>
+          <w:p>
+            <w:r>
+              <w:t>success</w:t>
+            </w:r>
+          </w:p>
+        </w:tc>
+      </w:tr>
+      <w:tr>
+        <w:tc>
+          <w:tcPr>
+            <w:tcW w:type="dxa" w:w="617"/>
+          </w:tcPr>
+          <w:p>
+            <w:r>
+              <w:t>2026-05-05T20:32:26</w:t>
+            </w:r>
+          </w:p>
+        </w:tc>
+        <w:tc>
+          <w:tcPr>
+            <w:tcW w:type="dxa" w:w="617"/>
+          </w:tcPr>
+          <w:p>
+            <w:r>
+              <w:t>mpls</w:t>
+            </w:r>
+          </w:p>
+        </w:tc>
+        <w:tc>
+          <w:tcPr>
+            <w:tcW w:type="dxa" w:w="617"/>
+          </w:tcPr>
+          <w:p>
+            <w:r>
+              <w:t>udp_load_sweep</w:t>
+            </w:r>
+          </w:p>
+        </w:tc>
+        <w:tc>
+          <w:tcPr>
+            <w:tcW w:type="dxa" w:w="617"/>
+          </w:tcPr>
+          <w:p>
+            <w:r>
+              <w:t>80.0</w:t>
+            </w:r>
+          </w:p>
+        </w:tc>
+        <w:tc>
+          <w:tcPr>
+            <w:tcW w:type="dxa" w:w="617"/>
+          </w:tcPr>
+          <w:p>
+            <w:r>
+              <w:t>Branch2</w:t>
+            </w:r>
+          </w:p>
+        </w:tc>
+        <w:tc>
+          <w:tcPr>
+            <w:tcW w:type="dxa" w:w="617"/>
+          </w:tcPr>
+          <w:p>
+            <w:r>
+              <w:t>Branch3</w:t>
+            </w:r>
+          </w:p>
+        </w:tc>
+        <w:tc>
+          <w:tcPr>
+            <w:tcW w:type="dxa" w:w="617"/>
+          </w:tcPr>
+          <w:p>
+            <w:r>
+              <w:t>user1</w:t>
+            </w:r>
+          </w:p>
+        </w:tc>
+        <w:tc>
+          <w:tcPr>
+            <w:tcW w:type="dxa" w:w="617"/>
+          </w:tcPr>
+          <w:p>
+            <w:r>
+              <w:t>svr2</w:t>
+            </w:r>
+          </w:p>
+        </w:tc>
+        <w:tc>
+          <w:tcPr>
+            <w:tcW w:type="dxa" w:w="617"/>
+          </w:tcPr>
+          <w:p>
+            <w:r/>
+          </w:p>
+        </w:tc>
+        <w:tc>
+          <w:tcPr>
+            <w:tcW w:type="dxa" w:w="617"/>
+          </w:tcPr>
+          <w:p>
+            <w:r/>
+          </w:p>
+        </w:tc>
+        <w:tc>
+          <w:tcPr>
+            <w:tcW w:type="dxa" w:w="617"/>
+          </w:tcPr>
+          <w:p>
+            <w:r/>
+          </w:p>
+        </w:tc>
+        <w:tc>
+          <w:tcPr>
+            <w:tcW w:type="dxa" w:w="617"/>
+          </w:tcPr>
+          <w:p>
+            <w:r>
+              <w:t>297.368</w:t>
+            </w:r>
+          </w:p>
+        </w:tc>
+        <w:tc>
+          <w:tcPr>
+            <w:tcW w:type="dxa" w:w="617"/>
+          </w:tcPr>
+          <w:p>
+            <w:r>
+              <w:t>24.222</w:t>
+            </w:r>
+          </w:p>
+        </w:tc>
+        <w:tc>
+          <w:tcPr>
+            <w:tcW w:type="dxa" w:w="617"/>
+          </w:tcPr>
+          <w:p>
+            <w:r>
+              <w:t>success</w:t>
+            </w:r>
+          </w:p>
+        </w:tc>
+      </w:tr>
+      <w:tr>
+        <w:tc>
+          <w:tcPr>
+            <w:tcW w:type="dxa" w:w="617"/>
+          </w:tcPr>
+          <w:p>
+            <w:r>
+              <w:t>2026-05-05T20:32:31</w:t>
+            </w:r>
+          </w:p>
+        </w:tc>
+        <w:tc>
+          <w:tcPr>
+            <w:tcW w:type="dxa" w:w="617"/>
+          </w:tcPr>
+          <w:p>
+            <w:r>
+              <w:t>mpls</w:t>
+            </w:r>
+          </w:p>
+        </w:tc>
+        <w:tc>
+          <w:tcPr>
+            <w:tcW w:type="dxa" w:w="617"/>
+          </w:tcPr>
+          <w:p>
+            <w:r>
+              <w:t>udp_load_sweep</w:t>
+            </w:r>
+          </w:p>
+        </w:tc>
+        <w:tc>
+          <w:tcPr>
+            <w:tcW w:type="dxa" w:w="617"/>
+          </w:tcPr>
+          <w:p>
+            <w:r>
+              <w:t>120.0</w:t>
+            </w:r>
+          </w:p>
+        </w:tc>
+        <w:tc>
+          <w:tcPr>
+            <w:tcW w:type="dxa" w:w="617"/>
+          </w:tcPr>
+          <w:p>
+            <w:r>
+              <w:t>Branch2</w:t>
+            </w:r>
+          </w:p>
+        </w:tc>
+        <w:tc>
+          <w:tcPr>
+            <w:tcW w:type="dxa" w:w="617"/>
+          </w:tcPr>
+          <w:p>
+            <w:r>
+              <w:t>Branch3</w:t>
+            </w:r>
+          </w:p>
+        </w:tc>
+        <w:tc>
+          <w:tcPr>
+            <w:tcW w:type="dxa" w:w="617"/>
+          </w:tcPr>
+          <w:p>
+            <w:r>
+              <w:t>user1</w:t>
+            </w:r>
+          </w:p>
+        </w:tc>
+        <w:tc>
+          <w:tcPr>
+            <w:tcW w:type="dxa" w:w="617"/>
+          </w:tcPr>
+          <w:p>
+            <w:r>
+              <w:t>svr2</w:t>
+            </w:r>
+          </w:p>
+        </w:tc>
+        <w:tc>
+          <w:tcPr>
+            <w:tcW w:type="dxa" w:w="617"/>
+          </w:tcPr>
+          <w:p>
+            <w:r/>
+          </w:p>
+        </w:tc>
+        <w:tc>
+          <w:tcPr>
+            <w:tcW w:type="dxa" w:w="617"/>
+          </w:tcPr>
+          <w:p>
+            <w:r/>
+          </w:p>
+        </w:tc>
+        <w:tc>
+          <w:tcPr>
+            <w:tcW w:type="dxa" w:w="617"/>
+          </w:tcPr>
+          <w:p>
+            <w:r/>
+          </w:p>
+        </w:tc>
+        <w:tc>
+          <w:tcPr>
+            <w:tcW w:type="dxa" w:w="617"/>
+          </w:tcPr>
+          <w:p>
+            <w:r>
+              <w:t>0.267</w:t>
+            </w:r>
+          </w:p>
+        </w:tc>
+        <w:tc>
+          <w:tcPr>
+            <w:tcW w:type="dxa" w:w="617"/>
+          </w:tcPr>
+          <w:p>
+            <w:r>
+              <w:t>49.022</w:t>
+            </w:r>
+          </w:p>
+        </w:tc>
+        <w:tc>
+          <w:tcPr>
+            <w:tcW w:type="dxa" w:w="617"/>
           </w:tcPr>
           <w:p>
             <w:r>
@@ -1773,7 +4130,7 @@
         <w:jc w:val="center"/>
       </w:pPr>
       <w:r>
-        <w:t>Hinh 8. Packet loss.</w:t>
+        <w:t>Hinh 8. UDP packet loss khi tai mang tang.</w:t>
       </w:r>
     </w:p>
     <w:p>
@@ -1838,12 +4195,12 @@
         <w:pStyle w:val="Heading1"/>
       </w:pPr>
       <w:r>
-        <w:t>18. Danh gia hoat dong MPLS hoac forwarding tuong duong MPLS</w:t>
+        <w:t>18. Danh gia hoat dong MPLS native</w:t>
       </w:r>
     </w:p>
     <w:p>
       <w:r>
-        <w:t>Project da cau hinh Linux kernel MPLS native trong cac namespace PE/P. Ingress PE dung ip route encap mpls de push label, P router dung ip -f mpls route de swap label, egress PE pop label ve CE. Trong lab nay label duoc gan tinh bang Python de de kiem soat va demo; day la LSP tinh, khong phai LDP dong.</w:t>
+        <w:t>Project da cau hinh Linux kernel MPLS native trong cac namespace PE/P. FRRouting OSPF/LDP tao bang route co `proto ospf`, `proto ldp`, `encap mpls` va `show mpls table`. Backbone PE/P dong thoi chay FRRouting OSPF/LDP; frr_control_plane.txt co OSPF Full, LDP OPERATIONAL, label binding va show mpls table. Luong CE/branch di qua service VPLS/L2VPN; data-plane L2VPN trong Mininet duoc hien thuc bang full-mesh Linux GRETAP pseudowire co split-horizon/port-isolation tren underlay MPLS va co bridge/gretap state trong frr_control_plane.txt.</w:t>
       </w:r>
     </w:p>
     <w:p>

</xml_diff>

<commit_message>
Refresh report images and GUI screenshot
</commit_message>
<xml_diff>
--- a/Metro_Ethernet_MPLS_Project/report/Bao_cao_Metro_Ethernet_MPLS_Mininet.docx
+++ b/Metro_Ethernet_MPLS_Project/report/Bao_cao_Metro_Ethernet_MPLS_Mininet.docx
@@ -282,7 +282,7 @@
       <w:r>
         <w:drawing>
           <wp:inline xmlns:a="http://schemas.openxmlformats.org/drawingml/2006/main" xmlns:pic="http://schemas.openxmlformats.org/drawingml/2006/picture">
-            <wp:extent cx="5394960" cy="3236976"/>
+            <wp:extent cx="5394960" cy="4930476"/>
             <wp:docPr id="2" name="Picture 2"/>
             <wp:cNvGraphicFramePr>
               <a:graphicFrameLocks noChangeAspect="1"/>
@@ -303,7 +303,7 @@
                   <pic:spPr>
                     <a:xfrm>
                       <a:off x="0" y="0"/>
-                      <a:ext cx="5394960" cy="3236976"/>
+                      <a:ext cx="5394960" cy="4930476"/>
                     </a:xfrm>
                     <a:prstGeom prst="rect"/>
                   </pic:spPr>
@@ -339,7 +339,7 @@
       <w:r>
         <w:drawing>
           <wp:inline xmlns:a="http://schemas.openxmlformats.org/drawingml/2006/main" xmlns:pic="http://schemas.openxmlformats.org/drawingml/2006/picture">
-            <wp:extent cx="5394960" cy="3236976"/>
+            <wp:extent cx="5394960" cy="3620818"/>
             <wp:docPr id="3" name="Picture 3"/>
             <wp:cNvGraphicFramePr>
               <a:graphicFrameLocks noChangeAspect="1"/>
@@ -360,7 +360,7 @@
                   <pic:spPr>
                     <a:xfrm>
                       <a:off x="0" y="0"/>
-                      <a:ext cx="5394960" cy="3236976"/>
+                      <a:ext cx="5394960" cy="3620818"/>
                     </a:xfrm>
                     <a:prstGeom prst="rect"/>
                   </pic:spPr>
@@ -396,7 +396,7 @@
       <w:r>
         <w:drawing>
           <wp:inline xmlns:a="http://schemas.openxmlformats.org/drawingml/2006/main" xmlns:pic="http://schemas.openxmlformats.org/drawingml/2006/picture">
-            <wp:extent cx="5394960" cy="3236976"/>
+            <wp:extent cx="5394960" cy="4326744"/>
             <wp:docPr id="4" name="Picture 4"/>
             <wp:cNvGraphicFramePr>
               <a:graphicFrameLocks noChangeAspect="1"/>
@@ -417,7 +417,7 @@
                   <pic:spPr>
                     <a:xfrm>
                       <a:off x="0" y="0"/>
-                      <a:ext cx="5394960" cy="3236976"/>
+                      <a:ext cx="5394960" cy="4326744"/>
                     </a:xfrm>
                     <a:prstGeom prst="rect"/>
                   </pic:spPr>
@@ -453,7 +453,7 @@
       <w:r>
         <w:drawing>
           <wp:inline xmlns:a="http://schemas.openxmlformats.org/drawingml/2006/main" xmlns:pic="http://schemas.openxmlformats.org/drawingml/2006/picture">
-            <wp:extent cx="5394960" cy="3236976"/>
+            <wp:extent cx="5394960" cy="2309167"/>
             <wp:docPr id="5" name="Picture 5"/>
             <wp:cNvGraphicFramePr>
               <a:graphicFrameLocks noChangeAspect="1"/>
@@ -474,7 +474,7 @@
                   <pic:spPr>
                     <a:xfrm>
                       <a:off x="0" y="0"/>
-                      <a:ext cx="5394960" cy="3236976"/>
+                      <a:ext cx="5394960" cy="2309167"/>
                     </a:xfrm>
                     <a:prstGeom prst="rect"/>
                   </pic:spPr>
@@ -521,6 +521,63 @@
     </w:p>
     <w:p>
       <w:pPr>
+        <w:pStyle w:val="Heading2"/>
+      </w:pPr>
+      <w:r>
+        <w:t>11.1 Giao dien giam sat va demo truc quan</w:t>
+      </w:r>
+    </w:p>
+    <w:p>
+      <w:r>
+        <w:t>GUI Tkinter cho phep chon source/destination host va chay truc tiep cac phep do ping, traceroute, throughput, delay, packet loss va jitter. Cua so log rieng giup phong to/thu nho output lenh khi thuyet trinh.</w:t>
+      </w:r>
+    </w:p>
+    <w:p>
+      <w:r>
+        <w:drawing>
+          <wp:inline xmlns:a="http://schemas.openxmlformats.org/drawingml/2006/main" xmlns:pic="http://schemas.openxmlformats.org/drawingml/2006/picture">
+            <wp:extent cx="5394960" cy="3778304"/>
+            <wp:docPr id="6" name="Picture 6"/>
+            <wp:cNvGraphicFramePr>
+              <a:graphicFrameLocks noChangeAspect="1"/>
+            </wp:cNvGraphicFramePr>
+            <a:graphic>
+              <a:graphicData uri="http://schemas.openxmlformats.org/drawingml/2006/picture">
+                <pic:pic>
+                  <pic:nvPicPr>
+                    <pic:cNvPr id="0" name="giaodiengui.png"/>
+                    <pic:cNvPicPr/>
+                  </pic:nvPicPr>
+                  <pic:blipFill>
+                    <a:blip r:embed="rId14"/>
+                    <a:stretch>
+                      <a:fillRect/>
+                    </a:stretch>
+                  </pic:blipFill>
+                  <pic:spPr>
+                    <a:xfrm>
+                      <a:off x="0" y="0"/>
+                      <a:ext cx="5394960" cy="3778304"/>
+                    </a:xfrm>
+                    <a:prstGeom prst="rect"/>
+                  </pic:spPr>
+                </pic:pic>
+              </a:graphicData>
+            </a:graphic>
+          </wp:inline>
+        </w:drawing>
+      </w:r>
+    </w:p>
+    <w:p>
+      <w:pPr>
+        <w:jc w:val="center"/>
+      </w:pPr>
+      <w:r>
+        <w:t>Hinh 6. Giao dien GUI monitor dung de demo cac phep do.</w:t>
+      </w:r>
+    </w:p>
+    <w:p>
+      <w:pPr>
         <w:pStyle w:val="Heading1"/>
       </w:pPr>
       <w:r>
@@ -553,52 +610,52 @@
         </w:rPr>
         <w:t>===== pe1: ip route show =====</w:t>
         <w:br/>
-        <w:t xml:space="preserve">2.2.2.2 nhid 56  encap mpls  20 via 172.20.11.2 dev pe1-eth1 proto ospf metric 20 </w:t>
+        <w:t xml:space="preserve">2.2.2.2 nhid 34  encap mpls  22 via 172.20.13.2 dev pe1-eth2 proto ospf metric 20 </w:t>
         <w:br/>
-        <w:t xml:space="preserve">3.3.3.3 nhid 38  encap mpls  24 via 172.20.11.2 dev pe1-eth1 proto ospf metric 20 </w:t>
+        <w:t xml:space="preserve">3.3.3.3 nhid 28  encap mpls  26 via 172.20.11.2 dev pe1-eth1 proto ospf metric 20 </w:t>
         <w:br/>
-        <w:t xml:space="preserve">11.11.11.11 nhid 25 via 172.20.11.2 dev pe1-eth1 proto ospf metric 20 </w:t>
+        <w:t xml:space="preserve">11.11.11.11 nhid 29 via 172.20.11.2 dev pe1-eth1 proto ospf metric 20 </w:t>
         <w:br/>
-        <w:t xml:space="preserve">22.22.22.22 nhid 39  encap mpls  25 via 172.20.11.2 dev pe1-eth1 proto ospf metric 20 </w:t>
+        <w:t xml:space="preserve">22.22.22.22 nhid 30  encap mpls  16 via 172.20.11.2 dev pe1-eth1 proto ospf metric 20 </w:t>
         <w:br/>
-        <w:t xml:space="preserve">33.33.33.33 nhid 29 via 172.20.13.2 dev pe1-eth2 proto ospf metric 20 </w:t>
+        <w:t xml:space="preserve">33.33.33.33 nhid 35 via 172.20.13.2 dev pe1-eth2 proto ospf metric 20 </w:t>
         <w:br/>
-        <w:t xml:space="preserve">44.44.44.44 nhid 57  encap mpls  21 via 172.20.11.2 dev pe1-eth1 proto ospf metric 20 </w:t>
+        <w:t xml:space="preserve">44.44.44.44 nhid 36  encap mpls  23 via 172.20.13.2 dev pe1-eth2 proto ospf metric 20 </w:t>
         <w:br/>
         <w:t xml:space="preserve">172.20.11.0/30 dev pe1-eth1 proto kernel scope link src 172.20.11.1 </w:t>
         <w:br/>
-        <w:t xml:space="preserve">172.20.12.0/30 nhid 25 via 172.20.11.2 dev pe1-eth1 proto ospf metric 20 </w:t>
+        <w:t xml:space="preserve">172.20.12.0/30 nhid 29 via 172.20.11.2 dev pe1-eth1 proto ospf metric 20 </w:t>
         <w:br/>
         <w:t xml:space="preserve">172.20.13.0/30 dev pe1-eth2 proto kernel scope link src 172.20.13.1 </w:t>
         <w:br/>
-        <w:t xml:space="preserve">172.20.23.0/30 nhid 29 via 172.20.13.2 dev pe1-eth2 proto ospf metric 20 </w:t>
+        <w:t xml:space="preserve">172.20.23.0/30 nhid 35 via 172.20.13.2 dev pe1-eth2 proto ospf metric 20 </w:t>
         <w:br/>
-        <w:t xml:space="preserve">172.20.24.0/30 nhid 58  encap mpls  22 via 172.20.11.2 dev pe1-eth1 proto ospf metric 20 </w:t>
+        <w:t xml:space="preserve">172.20.24.0/30 nhid 37  encap mpls  24 via 172.20.13.2 dev pe1-eth2 proto ospf metric 20 </w:t>
         <w:br/>
-        <w:t xml:space="preserve">172.20.32.0/30 nhid 40  encap mpls  26 via 172.20.11.2 dev pe1-eth1 proto ospf metric 20 </w:t>
+        <w:t xml:space="preserve">172.20.32.0/30 nhid 31  encap mpls  17 via 172.20.11.2 dev pe1-eth1 proto ospf metric 20 </w:t>
         <w:br/>
-        <w:t xml:space="preserve">172.20.34.0/30 nhid 42  encap mpls  23 via 172.20.11.2 dev pe1-eth1 proto ospf metric 20 </w:t>
+        <w:t xml:space="preserve">172.20.34.0/30 nhid 33  encap mpls  25 via 172.20.11.2 dev pe1-eth1 proto ospf metric 20 </w:t>
         <w:br/>
         <w:br/>
         <w:t>===== pe1: ip -f mpls route show =====</w:t>
         <w:br/>
         <w:t xml:space="preserve">18 via inet 172.20.11.2 dev pe1-eth1 proto ldp </w:t>
         <w:br/>
-        <w:t xml:space="preserve">19 via inet 172.20.13.2 dev pe1-eth2 proto ldp </w:t>
+        <w:t xml:space="preserve">19 as to 16 via inet 172.20.11.2 dev pe1-eth1 proto ldp </w:t>
         <w:br/>
-        <w:t xml:space="preserve">20 via inet 172.20.11.2 dev pe1-eth1 proto ldp </w:t>
+        <w:t xml:space="preserve">20 via inet 172.20.13.2 dev pe1-eth2 proto ldp </w:t>
         <w:br/>
-        <w:t xml:space="preserve">21 via inet 172.20.13.2 dev pe1-eth2 proto ldp </w:t>
+        <w:t xml:space="preserve">21 via inet 172.20.11.2 dev pe1-eth1 proto ldp </w:t>
         <w:br/>
-        <w:t xml:space="preserve">22 as to 20 via inet 172.20.11.2 dev pe1-eth1 proto ldp </w:t>
+        <w:t xml:space="preserve">22 via inet 172.20.13.2 dev pe1-eth2 proto ldp </w:t>
         <w:br/>
-        <w:t xml:space="preserve">23 as to 21 via inet 172.20.11.2 dev pe1-eth1 proto ldp </w:t>
+        <w:t xml:space="preserve">23 as to 17 via inet 172.20.11.2 dev pe1-eth1 proto ldp </w:t>
         <w:br/>
-        <w:t xml:space="preserve">24 as to 22 via inet 172.20.11.2 dev pe1-eth1 proto ldp </w:t>
+        <w:t xml:space="preserve">24 as to 22 via inet 172.20.13.2 dev pe1-eth2 proto ldp </w:t>
         <w:br/>
-        <w:t xml:space="preserve">25 as to 23 via inet 172.20.11.2 dev pe1-eth1 proto ldp </w:t>
+        <w:t xml:space="preserve">25 as to 23 via inet 172.20.13.2 dev pe1-eth2 proto ldp </w:t>
         <w:br/>
-        <w:t xml:space="preserve">26 as to 24 via inet 172.20.11.2 dev pe1-eth1 proto ldp </w:t>
+        <w:t xml:space="preserve">26 as to 24 via inet 172.20.13.2 dev pe1-eth2 proto ldp </w:t>
         <w:br/>
         <w:t xml:space="preserve">27 as to 25 via inet 172.20.11.2 dev pe1-eth1 proto ldp </w:t>
         <w:br/>
@@ -612,9 +669,9 @@
         <w:br/>
         <w:t>===== pe2: ip route show =====</w:t>
         <w:br/>
-        <w:t xml:space="preserve">1.1.1.1 nhid 33  encap mpls  16 via 172.20.23.2 dev pe2-eth1 proto ospf metric 20 </w:t>
+        <w:t xml:space="preserve">1.1.1.1 nhid 27  encap mpls  16 via 172.20.23.2 dev pe2-eth1 proto ospf metric 20 </w:t>
         <w:br/>
-        <w:t xml:space="preserve">3.3.3.3 nhid 51  encap mpls  24 via 172.20.23.2 dev pe2-eth1 proto ospf metric 20 </w:t>
+        <w:t xml:space="preserve">3.3.3.3 nhid 33  encap mpls  24 via 172.20.24.2 dev pe2-eth2 proto ospf metric 20 </w:t>
       </w:r>
     </w:p>
     <w:p>
@@ -638,92 +695,92 @@
         </w:rPr>
         <w:t>tcpdump: listening on p3-eth0, link-type EN10MB (Ethernet), snapshot length 262144 bytes</w:t>
         <w:br/>
-        <w:t>20:29:19.119120 00:00:00:00:00:10 &gt; ba:6d:0d:55:ca:63, ethertype MPLS unicast (0x8847), length 116: MPLS (label 26, tc 0, [S], ttl 63)</w:t>
+        <w:t>17:37:52.518122 96:cb:20:c1:bc:14 &gt; 00:00:00:00:00:10, ethertype MPLS unicast (0x8847), length 116: MPLS (label 22, tc 0, [S], ttl 64)</w:t>
         <w:br/>
         <w:tab/>
-        <w:t>(tos 0x0, ttl 64, id 3000, offset 0, flags [DF], proto GRE (47), length 98)</w:t>
+        <w:t>(tos 0x0, ttl 64, id 41432, offset 0, flags [DF], proto GRE (47), length 98)</w:t>
         <w:br/>
-        <w:t xml:space="preserve">    2.2.2.2 &gt; 3.3.3.3: GREv0, Flags [key present], key=0x64, proto TEB (0x6558), length 78</w:t>
+        <w:t xml:space="preserve">    1.1.1.1 &gt; 2.2.2.2: GREv0, Flags [key present], key=0x64, proto TEB (0x6558), length 78</w:t>
         <w:br/>
         <w:tab/>
-        <w:t>56:00:c8:a7:ed:0a &gt; 33:33:00:00:00:02, ethertype IPv6 (0x86dd), length 70: (hlim 255, next-header ICMPv6 (58) payload length: 16) fe80::5400:c8ff:fea7:ed0a &gt; ff02::2: [icmp6 sum ok] ICMP6, router solicitation, length 16</w:t>
+        <w:t>5a:71:7c:9a:7a:b0 &gt; 33:33:00:00:00:02, ethertype IPv6 (0x86dd), length 70: (hlim 255, next-header ICMPv6 (58) payload length: 16) fe80::5871:7cff:fe9a:7ab0 &gt; ff02::2: [icmp6 sum ok] ICMP6, router solicitation, length 16</w:t>
         <w:br/>
         <w:tab/>
-        <w:t xml:space="preserve">  source link-address option (1), length 8 (1): 56:00:c8:a7:ed:0a</w:t>
+        <w:t xml:space="preserve">  source link-address option (1), length 8 (1): 5a:71:7c:9a:7a:b0</w:t>
         <w:br/>
         <w:tab/>
-        <w:t xml:space="preserve">    0x0000:  5600 c8a7 ed0a</w:t>
+        <w:t xml:space="preserve">    0x0000:  5a71 7c9a 7ab0</w:t>
         <w:br/>
         <w:tab/>
-        <w:t>0x0000:  ba6d 0d55 ca63 0000 0000 0010 8847 0001  .m.U.c.......G..</w:t>
+        <w:t>0x0000:  0000 0000 0010 96cb 20c1 bc14 8847 0001  .............G..</w:t>
         <w:br/>
         <w:tab/>
-        <w:t>0x0010:  a13f 4500 0062 0bb8 4000 402f 24ac 0202  .?E..b..@.@/$...</w:t>
+        <w:t>0x0010:  6140 4500 0062 a1d8 4000 402f 928f 0101  a@E..b..@.@/....</w:t>
         <w:br/>
         <w:tab/>
-        <w:t>0x0020:  0202 0303 0303 2000 6558 0000 0064 3333  ........eX...d33</w:t>
+        <w:t>0x0020:  0101 0202 0202 2000 6558 0000 0064 3333  ........eX...d33</w:t>
         <w:br/>
         <w:tab/>
-        <w:t>0x0030:  0000 0002 5600 c8a7 ed0a 86dd 6000 0000  ....V.......`...</w:t>
+        <w:t>0x0030:  0000 0002 5a71 7c9a 7ab0 86dd 6000 0000  ....Zq|.z...`...</w:t>
         <w:br/>
         <w:tab/>
-        <w:t>0x0040:  0010 3aff fe80 0000 0000 0000 5400 c8ff  ..:.........T...</w:t>
+        <w:t>0x0040:  0010 3aff fe80 0000 0000 0000 5871 7cff  ..:.........Xq|.</w:t>
         <w:br/>
         <w:tab/>
-        <w:t>0x0050:  fea7 ed0a ff02 0000 0000 0000 0000 0000  ................</w:t>
+        <w:t>0x0050:  fe9a 7ab0 ff02 0000 0000 0000 0000 0000  ..z.............</w:t>
         <w:br/>
         <w:tab/>
-        <w:t>0x0060:  0000 0002 8500 67c8 0000 0000 0101 5600  ......g.......V.</w:t>
+        <w:t>0x0060:  0000 0002 8500 dbb5 0000 0000 0101 5a71  ..............Zq</w:t>
         <w:br/>
         <w:tab/>
-        <w:t>0x0070:  c8a7 ed0a                                ....</w:t>
+        <w:t>0x0070:  7c9a 7ab0                                |.z.</w:t>
         <w:br/>
-        <w:t>20:29:19.120084 00:00:00:00:00:10 &gt; ba:6d:0d:55:ca:63, ethertype MPLS unicast (0x8847), length 116: MPLS (label 26, tc 0, [S], ttl 63)</w:t>
+        <w:t>17:37:52.518198 96:cb:20:c1:bc:14 &gt; 00:00:00:00:00:10, ethertype MPLS unicast (0x8847), length 116: MPLS (label 22, tc 0, [S], ttl 64)</w:t>
         <w:br/>
         <w:tab/>
-        <w:t>(tos 0x0, ttl 64, id 3001, offset 0, flags [DF], proto GRE (47), length 98)</w:t>
+        <w:t>(tos 0x0, ttl 64, id 41433, offset 0, flags [DF], proto GRE (47), length 98)</w:t>
         <w:br/>
-        <w:t xml:space="preserve">    2.2.2.2 &gt; 3.3.3.3: GREv0, Flags [key present], key=0x64, proto TEB (0x6558), length 78</w:t>
+        <w:t xml:space="preserve">    1.1.1.1 &gt; 2.2.2.2: GREv0, Flags [key present], key=0x64, proto TEB (0x6558), length 78</w:t>
         <w:br/>
         <w:tab/>
-        <w:t>00:00:00:00:00:13 &gt; 33:33:00:00:00:02, ethertype IPv6 (0x86dd), length 70: (hlim 255, next-header ICMPv6 (58) payload length: 16) fe80::200:ff:fe00:13 &gt; ff02::2: [icmp6 sum ok] ICMP6, router solicitation, length 16</w:t>
+        <w:t>00:00:00:00:00:12 &gt; 33:33:00:00:00:02, ethertype IPv6 (0x86dd), length 70: (hlim 255, next-header ICMPv6 (58) payload length: 16) fe80::200:ff:fe00:12 &gt; ff02::2: [icmp6 sum ok] ICMP6, router solicitation, length 16</w:t>
         <w:br/>
         <w:tab/>
-        <w:t xml:space="preserve">  source link-address option (1), length 8 (1): 00:00:00:00:00:13</w:t>
+        <w:t xml:space="preserve">  source link-address option (1), length 8 (1): 00:00:00:00:00:12</w:t>
         <w:br/>
         <w:tab/>
-        <w:t xml:space="preserve">    0x0000:  0000 0000 0013</w:t>
+        <w:t xml:space="preserve">    0x0000:  0000 0000 0012</w:t>
         <w:br/>
         <w:tab/>
-        <w:t>0x0000:  ba6d 0d55 ca63 0000 0000 0010 8847 0001  .m.U.c.......G..</w:t>
+        <w:t>0x0000:  0000 0000 0010 96cb 20c1 bc14 8847 0001  .............G..</w:t>
         <w:br/>
         <w:tab/>
-        <w:t>0x0010:  a13f 4500 0062 0bb9 4000 402f 24ab 0202  .?E..b..@.@/$...</w:t>
+        <w:t>0x0010:  6140 4500 0062 a1d9 4000 402f 928e 0101  a@E..b..@.@/....</w:t>
         <w:br/>
         <w:tab/>
-        <w:t>0x0020:  0202 0303 0303 2000 6558 0000 0064 3333  ........eX...d33</w:t>
+        <w:t>0x0020:  0101 0202 0202 2000 6558 0000 0064 3333  ........eX...d33</w:t>
         <w:br/>
         <w:tab/>
-        <w:t>0x0030:  0000 0002 0000 0000 0013 86dd 6000 0000  ............`...</w:t>
+        <w:t>0x0030:  0000 0002 0000 0000 0012 86dd 6000 0000  ............`...</w:t>
         <w:br/>
         <w:tab/>
         <w:t>0x0040:  0010 3aff fe80 0000 0000 0000 0200 00ff  ..:.............</w:t>
         <w:br/>
         <w:tab/>
-        <w:t>0x0050:  fe00 0013 ff02 0000 0000 0000 0000 0000  ................</w:t>
+        <w:t>0x0050:  fe00 0012 ff02 0000 0000 0000 0000 0000  ................</w:t>
         <w:br/>
         <w:tab/>
-        <w:t>0x0060:  0000 0002 8500 7b08 0000 0000 0101 0000  ......{.........</w:t>
+        <w:t>0x0060:  0000 0002 8500 7b0a 0000 0000 0101 0000  ......{.........</w:t>
         <w:br/>
         <w:tab/>
-        <w:t>0x0070:  0000 0013                                ....</w:t>
+        <w:t>0x0070:  0000 0012                                ....</w:t>
         <w:br/>
-        <w:t>20:29:19.638420 00:00:00:00:00:10 &gt; ba:6d:0d:55:ca:63, ethertype MPLS unicast (0x8847), length 88: MPLS (label 26, tc 0, [S], ttl 63)</w:t>
+        <w:t>17:37:52.800865 96:cb:20:c1:bc:14 &gt; 00:00:00:00:00:10, ethertype MPLS unicast (0x8847), length 144: MPLS (label 22, tc 0, [S], ttl 64)</w:t>
         <w:br/>
         <w:tab/>
-        <w:t>(tos 0xc0, ttl 64, id 27627, offset 0, flags [DF], proto UDP (17), length 70)</w:t>
+        <w:t>(tos 0x0, ttl 64, id 41552, offset 0, flags [DF], proto GRE (47), length 126)</w:t>
         <w:br/>
-        <w:t xml:space="preserve">    2.2.2.2.646 &gt; 3.3.3.3.646: [bad udp cksum 0x0a4d -&gt; 0x1987!] </w:t>
+        <w:t xml:space="preserve">    1.1.1.1 &gt; 2.2.2.2: GREv0, Flags [key present], key=0x64, proto TEB (0x6558), length 106</w:t>
       </w:r>
     </w:p>
     <w:p>
@@ -762,7 +819,7 @@
     </w:p>
     <w:p>
       <w:r>
-        <w:t>Thoi gian kiem thu tu results.csv: 2026-05-05T20:29:23 den 2026-05-05T20:32:31.</w:t>
+        <w:t>Thoi gian kiem thu tu results.csv: 2026-05-06T17:37:58 den 2026-05-06T17:41:10.</w:t>
       </w:r>
     </w:p>
     <w:p>
@@ -941,7 +998,7 @@
           </w:tcPr>
           <w:p>
             <w:r>
-              <w:t>2026-05-05T20:29:23</w:t>
+              <w:t>2026-05-06T17:37:58</w:t>
             </w:r>
           </w:p>
         </w:tc>
@@ -1029,7 +1086,7 @@
           </w:tcPr>
           <w:p>
             <w:r>
-              <w:t>33.325</w:t>
+              <w:t>33.447</w:t>
             </w:r>
           </w:p>
         </w:tc>
@@ -1049,7 +1106,7 @@
           </w:tcPr>
           <w:p>
             <w:r>
-              <w:t>0.127</w:t>
+              <w:t>0.11</w:t>
             </w:r>
           </w:p>
         </w:tc>
@@ -1081,7 +1138,7 @@
           </w:tcPr>
           <w:p>
             <w:r>
-              <w:t>2026-05-05T20:29:41</w:t>
+              <w:t>2026-05-06T17:38:15</w:t>
             </w:r>
           </w:p>
         </w:tc>
@@ -1169,7 +1226,7 @@
           </w:tcPr>
           <w:p>
             <w:r>
-              <w:t>39.618</w:t>
+              <w:t>40.148</w:t>
             </w:r>
           </w:p>
         </w:tc>
@@ -1189,7 +1246,7 @@
           </w:tcPr>
           <w:p>
             <w:r>
-              <w:t>0.138</w:t>
+              <w:t>0.106</w:t>
             </w:r>
           </w:p>
         </w:tc>
@@ -1221,7 +1278,7 @@
           </w:tcPr>
           <w:p>
             <w:r>
-              <w:t>2026-05-05T20:29:59</w:t>
+              <w:t>2026-05-06T17:38:33</w:t>
             </w:r>
           </w:p>
         </w:tc>
@@ -1309,7 +1366,7 @@
           </w:tcPr>
           <w:p>
             <w:r>
-              <w:t>35.591</w:t>
+              <w:t>35.491</w:t>
             </w:r>
           </w:p>
         </w:tc>
@@ -1329,7 +1386,7 @@
           </w:tcPr>
           <w:p>
             <w:r>
-              <w:t>0.231</w:t>
+              <w:t>0.126</w:t>
             </w:r>
           </w:p>
         </w:tc>
@@ -1361,7 +1418,7 @@
           </w:tcPr>
           <w:p>
             <w:r>
-              <w:t>2026-05-05T20:30:16</w:t>
+              <w:t>2026-05-06T17:38:50</w:t>
             </w:r>
           </w:p>
         </w:tc>
@@ -1439,7 +1496,7 @@
           </w:tcPr>
           <w:p>
             <w:r>
-              <w:t>94.465</w:t>
+              <w:t>94.713</w:t>
             </w:r>
           </w:p>
         </w:tc>
@@ -1449,7 +1506,7 @@
           </w:tcPr>
           <w:p>
             <w:r>
-              <w:t>6.754</w:t>
+              <w:t>6.559</w:t>
             </w:r>
           </w:p>
         </w:tc>
@@ -1469,7 +1526,7 @@
           </w:tcPr>
           <w:p>
             <w:r>
-              <w:t>0.069</w:t>
+              <w:t>0.081</w:t>
             </w:r>
           </w:p>
         </w:tc>
@@ -1501,7 +1558,7 @@
           </w:tcPr>
           <w:p>
             <w:r>
-              <w:t>2026-05-05T20:30:34</w:t>
+              <w:t>2026-05-06T17:39:08</w:t>
             </w:r>
           </w:p>
         </w:tc>
@@ -1579,7 +1636,7 @@
           </w:tcPr>
           <w:p>
             <w:r>
-              <w:t>93.875</w:t>
+              <w:t>93.964</w:t>
             </w:r>
           </w:p>
         </w:tc>
@@ -1589,7 +1646,7 @@
           </w:tcPr>
           <w:p>
             <w:r>
-              <w:t>13.074</w:t>
+              <w:t>13.019</w:t>
             </w:r>
           </w:p>
         </w:tc>
@@ -1609,7 +1666,7 @@
           </w:tcPr>
           <w:p>
             <w:r>
-              <w:t>0.245</w:t>
+              <w:t>0.124</w:t>
             </w:r>
           </w:p>
         </w:tc>
@@ -1641,7 +1698,7 @@
           </w:tcPr>
           <w:p>
             <w:r>
-              <w:t>2026-05-05T20:30:51</w:t>
+              <w:t>2026-05-06T17:39:26</w:t>
             </w:r>
           </w:p>
         </w:tc>
@@ -1719,7 +1776,7 @@
           </w:tcPr>
           <w:p>
             <w:r>
-              <w:t>94.068</w:t>
+              <w:t>94.302</w:t>
             </w:r>
           </w:p>
         </w:tc>
@@ -1729,7 +1786,7 @@
           </w:tcPr>
           <w:p>
             <w:r>
-              <w:t>10.784</w:t>
+              <w:t>10.83</w:t>
             </w:r>
           </w:p>
         </w:tc>
@@ -1749,7 +1806,7 @@
           </w:tcPr>
           <w:p>
             <w:r>
-              <w:t>0.12</w:t>
+              <w:t>0.069</w:t>
             </w:r>
           </w:p>
         </w:tc>
@@ -1959,7 +2016,7 @@
           </w:tcPr>
           <w:p>
             <w:r>
-              <w:t>2026-05-05T20:31:15</w:t>
+              <w:t>2026-05-06T17:39:49</w:t>
             </w:r>
           </w:p>
         </w:tc>
@@ -2063,7 +2120,7 @@
           </w:tcPr>
           <w:p>
             <w:r>
-              <w:t>0.122</w:t>
+              <w:t>0.14</w:t>
             </w:r>
           </w:p>
         </w:tc>
@@ -2095,7 +2152,7 @@
           </w:tcPr>
           <w:p>
             <w:r>
-              <w:t>2026-05-05T20:31:20</w:t>
+              <w:t>2026-05-06T17:39:54</w:t>
             </w:r>
           </w:p>
         </w:tc>
@@ -2199,7 +2256,7 @@
           </w:tcPr>
           <w:p>
             <w:r>
-              <w:t>0.062</w:t>
+              <w:t>0.149</w:t>
             </w:r>
           </w:p>
         </w:tc>
@@ -2231,7 +2288,7 @@
           </w:tcPr>
           <w:p>
             <w:r>
-              <w:t>2026-05-05T20:31:25</w:t>
+              <w:t>2026-05-06T17:39:59</w:t>
             </w:r>
           </w:p>
         </w:tc>
@@ -2335,7 +2392,7 @@
           </w:tcPr>
           <w:p>
             <w:r>
-              <w:t>0.258</w:t>
+              <w:t>0.261</w:t>
             </w:r>
           </w:p>
         </w:tc>
@@ -2367,7 +2424,7 @@
           </w:tcPr>
           <w:p>
             <w:r>
-              <w:t>2026-05-05T20:31:31</w:t>
+              <w:t>2026-05-06T17:40:05</w:t>
             </w:r>
           </w:p>
         </w:tc>
@@ -2471,7 +2528,7 @@
           </w:tcPr>
           <w:p>
             <w:r>
-              <w:t>0.227</w:t>
+              <w:t>0.366</w:t>
             </w:r>
           </w:p>
         </w:tc>
@@ -2481,7 +2538,7 @@
           </w:tcPr>
           <w:p>
             <w:r>
-              <w:t>20.674</w:t>
+              <w:t>22.933</w:t>
             </w:r>
           </w:p>
         </w:tc>
@@ -2503,7 +2560,7 @@
           </w:tcPr>
           <w:p>
             <w:r>
-              <w:t>2026-05-05T20:31:37</w:t>
+              <w:t>2026-05-06T17:40:11</w:t>
             </w:r>
           </w:p>
         </w:tc>
@@ -2607,7 +2664,7 @@
           </w:tcPr>
           <w:p>
             <w:r>
-              <w:t>258.863</w:t>
+              <w:t>0.284</w:t>
             </w:r>
           </w:p>
         </w:tc>
@@ -2617,7 +2674,7 @@
           </w:tcPr>
           <w:p>
             <w:r>
-              <w:t>47.967</w:t>
+              <w:t>52.429</w:t>
             </w:r>
           </w:p>
         </w:tc>
@@ -2639,7 +2696,7 @@
           </w:tcPr>
           <w:p>
             <w:r>
-              <w:t>2026-05-05T20:31:42</w:t>
+              <w:t>2026-05-06T17:40:16</w:t>
             </w:r>
           </w:p>
         </w:tc>
@@ -2743,7 +2800,7 @@
           </w:tcPr>
           <w:p>
             <w:r>
-              <w:t>0.127</w:t>
+              <w:t>0.093</w:t>
             </w:r>
           </w:p>
         </w:tc>
@@ -2775,7 +2832,7 @@
           </w:tcPr>
           <w:p>
             <w:r>
-              <w:t>2026-05-05T20:31:47</w:t>
+              <w:t>2026-05-06T17:40:22</w:t>
             </w:r>
           </w:p>
         </w:tc>
@@ -2879,7 +2936,7 @@
           </w:tcPr>
           <w:p>
             <w:r>
-              <w:t>0.113</w:t>
+              <w:t>0.077</w:t>
             </w:r>
           </w:p>
         </w:tc>
@@ -2911,7 +2968,7 @@
           </w:tcPr>
           <w:p>
             <w:r>
-              <w:t>2026-05-05T20:31:53</w:t>
+              <w:t>2026-05-06T17:40:27</w:t>
             </w:r>
           </w:p>
         </w:tc>
@@ -3015,7 +3072,7 @@
           </w:tcPr>
           <w:p>
             <w:r>
-              <w:t>0.323</w:t>
+              <w:t>0.3</w:t>
             </w:r>
           </w:p>
         </w:tc>
@@ -3025,7 +3082,7 @@
           </w:tcPr>
           <w:p>
             <w:r>
-              <w:t>1.997</w:t>
+              <w:t>1.894</w:t>
             </w:r>
           </w:p>
         </w:tc>
@@ -3047,7 +3104,7 @@
           </w:tcPr>
           <w:p>
             <w:r>
-              <w:t>2026-05-05T20:31:58</w:t>
+              <w:t>2026-05-06T17:40:33</w:t>
             </w:r>
           </w:p>
         </w:tc>
@@ -3151,7 +3208,7 @@
           </w:tcPr>
           <w:p>
             <w:r>
-              <w:t>0.338</w:t>
+              <w:t>0.254</w:t>
             </w:r>
           </w:p>
         </w:tc>
@@ -3161,7 +3218,7 @@
           </w:tcPr>
           <w:p>
             <w:r>
-              <w:t>34.9</w:t>
+              <w:t>30.834</w:t>
             </w:r>
           </w:p>
         </w:tc>
@@ -3183,7 +3240,7 @@
           </w:tcPr>
           <w:p>
             <w:r>
-              <w:t>2026-05-05T20:32:04</w:t>
+              <w:t>2026-05-06T17:40:38</w:t>
             </w:r>
           </w:p>
         </w:tc>
@@ -3287,7 +3344,7 @@
           </w:tcPr>
           <w:p>
             <w:r>
-              <w:t>0.216</w:t>
+              <w:t>0.263</w:t>
             </w:r>
           </w:p>
         </w:tc>
@@ -3297,7 +3354,7 @@
           </w:tcPr>
           <w:p>
             <w:r>
-              <w:t>53.264</w:t>
+              <w:t>48.983</w:t>
             </w:r>
           </w:p>
         </w:tc>
@@ -3319,7 +3376,7 @@
           </w:tcPr>
           <w:p>
             <w:r>
-              <w:t>2026-05-05T20:32:10</w:t>
+              <w:t>2026-05-06T17:40:44</w:t>
             </w:r>
           </w:p>
         </w:tc>
@@ -3423,7 +3480,7 @@
           </w:tcPr>
           <w:p>
             <w:r>
-              <w:t>0.094</w:t>
+              <w:t>0.134</w:t>
             </w:r>
           </w:p>
         </w:tc>
@@ -3455,7 +3512,7 @@
           </w:tcPr>
           <w:p>
             <w:r>
-              <w:t>2026-05-05T20:32:15</w:t>
+              <w:t>2026-05-06T17:40:49</w:t>
             </w:r>
           </w:p>
         </w:tc>
@@ -3559,7 +3616,7 @@
           </w:tcPr>
           <w:p>
             <w:r>
-              <w:t>0.134</w:t>
+              <w:t>0.086</w:t>
             </w:r>
           </w:p>
         </w:tc>
@@ -3591,7 +3648,7 @@
           </w:tcPr>
           <w:p>
             <w:r>
-              <w:t>2026-05-05T20:32:20</w:t>
+              <w:t>2026-05-06T17:40:54</w:t>
             </w:r>
           </w:p>
         </w:tc>
@@ -3695,7 +3752,7 @@
           </w:tcPr>
           <w:p>
             <w:r>
-              <w:t>0.256</w:t>
+              <w:t>0.241</w:t>
             </w:r>
           </w:p>
         </w:tc>
@@ -3727,7 +3784,7 @@
           </w:tcPr>
           <w:p>
             <w:r>
-              <w:t>2026-05-05T20:32:26</w:t>
+              <w:t>2026-05-06T17:41:00</w:t>
             </w:r>
           </w:p>
         </w:tc>
@@ -3831,7 +3888,7 @@
           </w:tcPr>
           <w:p>
             <w:r>
-              <w:t>297.368</w:t>
+              <w:t>0.283</w:t>
             </w:r>
           </w:p>
         </w:tc>
@@ -3841,7 +3898,7 @@
           </w:tcPr>
           <w:p>
             <w:r>
-              <w:t>24.222</w:t>
+              <w:t>22.372</w:t>
             </w:r>
           </w:p>
         </w:tc>
@@ -3863,7 +3920,7 @@
           </w:tcPr>
           <w:p>
             <w:r>
-              <w:t>2026-05-05T20:32:31</w:t>
+              <w:t>2026-05-06T17:41:10</w:t>
             </w:r>
           </w:p>
         </w:tc>
@@ -3967,7 +4024,7 @@
           </w:tcPr>
           <w:p>
             <w:r>
-              <w:t>0.267</w:t>
+              <w:t>0.247</w:t>
             </w:r>
           </w:p>
         </w:tc>
@@ -3977,7 +4034,7 @@
           </w:tcPr>
           <w:p>
             <w:r>
-              <w:t>49.022</w:t>
+              <w:t>52.892</w:t>
             </w:r>
           </w:p>
         </w:tc>
@@ -4006,7 +4063,7 @@
         <w:drawing>
           <wp:inline xmlns:a="http://schemas.openxmlformats.org/drawingml/2006/main" xmlns:pic="http://schemas.openxmlformats.org/drawingml/2006/picture">
             <wp:extent cx="5394960" cy="2997200"/>
-            <wp:docPr id="6" name="Picture 6"/>
+            <wp:docPr id="7" name="Picture 7"/>
             <wp:cNvGraphicFramePr>
               <a:graphicFrameLocks noChangeAspect="1"/>
             </wp:cNvGraphicFramePr>
@@ -4015,50 +4072,6 @@
                 <pic:pic>
                   <pic:nvPicPr>
                     <pic:cNvPr id="0" name="throughput_chart.png"/>
-                    <pic:cNvPicPr/>
-                  </pic:nvPicPr>
-                  <pic:blipFill>
-                    <a:blip r:embed="rId14"/>
-                    <a:stretch>
-                      <a:fillRect/>
-                    </a:stretch>
-                  </pic:blipFill>
-                  <pic:spPr>
-                    <a:xfrm>
-                      <a:off x="0" y="0"/>
-                      <a:ext cx="5394960" cy="2997200"/>
-                    </a:xfrm>
-                    <a:prstGeom prst="rect"/>
-                  </pic:spPr>
-                </pic:pic>
-              </a:graphicData>
-            </a:graphic>
-          </wp:inline>
-        </w:drawing>
-      </w:r>
-    </w:p>
-    <w:p>
-      <w:pPr>
-        <w:jc w:val="center"/>
-      </w:pPr>
-      <w:r>
-        <w:t>Hinh 6. Throughput.</w:t>
-      </w:r>
-    </w:p>
-    <w:p>
-      <w:r>
-        <w:drawing>
-          <wp:inline xmlns:a="http://schemas.openxmlformats.org/drawingml/2006/main" xmlns:pic="http://schemas.openxmlformats.org/drawingml/2006/picture">
-            <wp:extent cx="5394960" cy="2997200"/>
-            <wp:docPr id="7" name="Picture 7"/>
-            <wp:cNvGraphicFramePr>
-              <a:graphicFrameLocks noChangeAspect="1"/>
-            </wp:cNvGraphicFramePr>
-            <a:graphic>
-              <a:graphicData uri="http://schemas.openxmlformats.org/drawingml/2006/picture">
-                <pic:pic>
-                  <pic:nvPicPr>
-                    <pic:cNvPr id="0" name="delay_chart.png"/>
                     <pic:cNvPicPr/>
                   </pic:nvPicPr>
                   <pic:blipFill>
@@ -4086,7 +4099,7 @@
         <w:jc w:val="center"/>
       </w:pPr>
       <w:r>
-        <w:t>Hinh 7. Delay trung binh.</w:t>
+        <w:t>Hinh 7. Throughput.</w:t>
       </w:r>
     </w:p>
     <w:p>
@@ -4102,7 +4115,7 @@
               <a:graphicData uri="http://schemas.openxmlformats.org/drawingml/2006/picture">
                 <pic:pic>
                   <pic:nvPicPr>
-                    <pic:cNvPr id="0" name="packet_loss_chart.png"/>
+                    <pic:cNvPr id="0" name="delay_chart.png"/>
                     <pic:cNvPicPr/>
                   </pic:nvPicPr>
                   <pic:blipFill>
@@ -4130,7 +4143,7 @@
         <w:jc w:val="center"/>
       </w:pPr>
       <w:r>
-        <w:t>Hinh 8. UDP packet loss khi tai mang tang.</w:t>
+        <w:t>Hinh 8. Delay trung binh.</w:t>
       </w:r>
     </w:p>
     <w:p>
@@ -4146,7 +4159,7 @@
               <a:graphicData uri="http://schemas.openxmlformats.org/drawingml/2006/picture">
                 <pic:pic>
                   <pic:nvPicPr>
-                    <pic:cNvPr id="0" name="jitter_chart.png"/>
+                    <pic:cNvPr id="0" name="packet_loss_chart.png"/>
                     <pic:cNvPicPr/>
                   </pic:nvPicPr>
                   <pic:blipFill>
@@ -4174,7 +4187,51 @@
         <w:jc w:val="center"/>
       </w:pPr>
       <w:r>
-        <w:t>Hinh 9. Jitter.</w:t>
+        <w:t>Hinh 9. UDP packet loss khi tai mang tang.</w:t>
+      </w:r>
+    </w:p>
+    <w:p>
+      <w:r>
+        <w:drawing>
+          <wp:inline xmlns:a="http://schemas.openxmlformats.org/drawingml/2006/main" xmlns:pic="http://schemas.openxmlformats.org/drawingml/2006/picture">
+            <wp:extent cx="5394960" cy="2997200"/>
+            <wp:docPr id="10" name="Picture 10"/>
+            <wp:cNvGraphicFramePr>
+              <a:graphicFrameLocks noChangeAspect="1"/>
+            </wp:cNvGraphicFramePr>
+            <a:graphic>
+              <a:graphicData uri="http://schemas.openxmlformats.org/drawingml/2006/picture">
+                <pic:pic>
+                  <pic:nvPicPr>
+                    <pic:cNvPr id="0" name="jitter_chart.png"/>
+                    <pic:cNvPicPr/>
+                  </pic:nvPicPr>
+                  <pic:blipFill>
+                    <a:blip r:embed="rId18"/>
+                    <a:stretch>
+                      <a:fillRect/>
+                    </a:stretch>
+                  </pic:blipFill>
+                  <pic:spPr>
+                    <a:xfrm>
+                      <a:off x="0" y="0"/>
+                      <a:ext cx="5394960" cy="2997200"/>
+                    </a:xfrm>
+                    <a:prstGeom prst="rect"/>
+                  </pic:spPr>
+                </pic:pic>
+              </a:graphicData>
+            </a:graphic>
+          </wp:inline>
+        </w:drawing>
+      </w:r>
+    </w:p>
+    <w:p>
+      <w:pPr>
+        <w:jc w:val="center"/>
+      </w:pPr>
+      <w:r>
+        <w:t>Hinh 10. Jitter.</w:t>
       </w:r>
     </w:p>
     <w:p>

</xml_diff>